<commit_message>
added: more dissertation crap
</commit_message>
<xml_diff>
--- a/Documents/Dissertation w feedback 16th april.docx
+++ b/Documents/Dissertation w feedback 16th april.docx
@@ -1387,8 +1387,9 @@
         <w:t>Context: Procedural Content Generation has been incorporated into many game genres; however, 3D platforms have not taken advantage of this practice. Procedural generation techniques in other game genres have been handled effectively and shortened development times for level designers</w:t>
       </w:r>
       <w:commentRangeStart w:id="6"/>
-      <w:r>
-        <w:t xml:space="preserve">. This dissertation will address the issue of this genre having a lack of research into, and usage of, procedural </w:t>
+      <w:commentRangeStart w:id="7"/>
+      <w:r>
+        <w:t xml:space="preserve">. This dissertation will address the issue of this genre having a lack of research and usage of procedural </w:t>
       </w:r>
       <w:commentRangeEnd w:id="6"/>
       <w:r>
@@ -1399,6 +1400,15 @@
         </w:rPr>
         <w:commentReference w:id="6"/>
       </w:r>
+      <w:commentRangeEnd w:id="7"/>
+      <w:r>
+        <w:rPr>
+          <w:rStyle w:val="CommentReference"/>
+          <w:sz w:val="24"/>
+          <w:szCs w:val="24"/>
+        </w:rPr>
+        <w:commentReference w:id="7"/>
+      </w:r>
       <w:r>
         <w:t>generation.</w:t>
       </w:r>
@@ -1449,12 +1459,12 @@
       <w:r>
         <w:br w:type="page"/>
       </w:r>
-      <w:bookmarkStart w:id="7" w:name="_Toc92987351"/>
+      <w:bookmarkStart w:id="8" w:name="_Toc92987351"/>
       <w:r>
         <w:lastRenderedPageBreak/>
         <w:t>Abbreviations, Symbols and Notation</w:t>
       </w:r>
-      <w:bookmarkEnd w:id="7"/>
+      <w:bookmarkEnd w:id="8"/>
     </w:p>
     <w:p>
       <w:r>
@@ -1520,47 +1530,53 @@
         <w:pStyle w:val="Heading1"/>
         <w:jc w:val="center"/>
       </w:pPr>
-      <w:bookmarkStart w:id="8" w:name="_Toc92987352"/>
+      <w:bookmarkStart w:id="9" w:name="_Toc92987352"/>
       <w:r>
         <w:t xml:space="preserve">Chapter 1 </w:t>
       </w:r>
       <w:r>
         <w:t>Introduction</w:t>
       </w:r>
-      <w:bookmarkEnd w:id="8"/>
+      <w:bookmarkEnd w:id="9"/>
     </w:p>
     <w:p>
       <w:pPr>
         <w:spacing w:line="240" w:lineRule="auto"/>
       </w:pPr>
-      <w:commentRangeStart w:id="9"/>
+      <w:commentRangeStart w:id="10"/>
       <w:r>
         <w:t xml:space="preserve">Procedural generation is a </w:t>
       </w:r>
-      <w:commentRangeStart w:id="10"/>
-      <w:r>
-        <w:t xml:space="preserve">game mechanic </w:t>
-      </w:r>
-      <w:commentRangeEnd w:id="10"/>
+      <w:commentRangeStart w:id="11"/>
+      <w:r>
+        <w:t xml:space="preserve">game </w:t>
+      </w:r>
+      <w:r>
+        <w:t>development method</w:t>
+      </w:r>
+      <w:r>
+        <w:t xml:space="preserve"> </w:t>
+      </w:r>
+      <w:commentRangeEnd w:id="11"/>
       <w:r>
         <w:rPr>
           <w:rStyle w:val="CommentReference"/>
           <w:sz w:val="24"/>
           <w:szCs w:val="24"/>
         </w:rPr>
-        <w:commentReference w:id="10"/>
+        <w:commentReference w:id="11"/>
       </w:r>
       <w:r>
         <w:t>that has been used in various genres, such as terrain generation in open world adventure games, and to place game objects in a space. These ways have been successful and have reduced development times for designers once the procedural generation has been implemented. Designing a level can be time consuming in 3D platformers so there is arguably a need for this for some developers. This is where procedural generation is introduced by having the computer create the levels using a set of procedures instead.</w:t>
       </w:r>
-      <w:commentRangeEnd w:id="9"/>
+      <w:commentRangeEnd w:id="10"/>
       <w:r>
         <w:rPr>
           <w:rStyle w:val="CommentReference"/>
           <w:sz w:val="24"/>
           <w:szCs w:val="24"/>
         </w:rPr>
-        <w:commentReference w:id="9"/>
+        <w:commentReference w:id="10"/>
       </w:r>
     </w:p>
     <w:p>
@@ -1614,14 +1630,27 @@
         <w:pStyle w:val="Heading1"/>
         <w:jc w:val="center"/>
       </w:pPr>
-      <w:bookmarkStart w:id="11" w:name="_Toc92987353"/>
-      <w:r>
-        <w:t>Chapter 2</w:t>
+      <w:bookmarkStart w:id="12" w:name="_Toc92987353"/>
+      <w:r>
+        <w:t xml:space="preserve">Chapter </w:t>
+      </w:r>
+      <w:commentRangeStart w:id="13"/>
+      <w:r>
+        <w:t>2</w:t>
       </w:r>
       <w:r>
         <w:t xml:space="preserve"> Literature Review</w:t>
       </w:r>
-      <w:bookmarkEnd w:id="11"/>
+      <w:bookmarkEnd w:id="12"/>
+      <w:commentRangeEnd w:id="13"/>
+      <w:r>
+        <w:rPr>
+          <w:rStyle w:val="CommentReference"/>
+          <w:sz w:val="28"/>
+          <w:szCs w:val="32"/>
+        </w:rPr>
+        <w:commentReference w:id="13"/>
+      </w:r>
     </w:p>
     <w:p>
       <w:pPr>
@@ -1657,7 +1686,7 @@
         </w:rPr>
         <w:t xml:space="preserve"> regarding various procedural generation </w:t>
       </w:r>
-      <w:commentRangeStart w:id="12"/>
+      <w:commentRangeStart w:id="14"/>
       <w:r>
         <w:rPr>
           <w:b w:val="0"/>
@@ -1690,7 +1719,7 @@
         </w:rPr>
         <w:t>. This section involves the existing relevant work that research project, which will be reviewed.</w:t>
       </w:r>
-      <w:commentRangeEnd w:id="12"/>
+      <w:commentRangeEnd w:id="14"/>
       <w:r>
         <w:rPr>
           <w:rStyle w:val="CommentReference"/>
@@ -1699,7 +1728,7 @@
           <w:sz w:val="24"/>
           <w:szCs w:val="32"/>
         </w:rPr>
-        <w:commentReference w:id="12"/>
+        <w:commentReference w:id="14"/>
       </w:r>
     </w:p>
     <w:p/>
@@ -1719,11 +1748,8 @@
         <w:t xml:space="preserve">In Procedural Level Design for Platform Games (Ref here), it uses a four-layer hierarchy to represent platform games, with a concentration of repetition, rhythm and connectivity. The idea of rhythm is effective here since this allows a level to be created via a set of steps, where for example, the level can start off with “walk 2 seconds”, which means generate a platform that spawns for 2 seconds. Then it might say jump 1 second in, which means make a jump one second into playing the level. </w:t>
       </w:r>
       <w:r>
-        <w:t xml:space="preserve">The project uses this example to generate the base level before deciding </w:t>
-      </w:r>
-      <w:r>
         <w:lastRenderedPageBreak/>
-        <w:t>which platforms will be spawned. It will at least have a set order of which will be a platform, and which parts will be a gap between two platforms to jump, or when the direction changes.</w:t>
+        <w:t>The project uses this example to generate the base level before deciding which platforms will be spawned. It will at least have a set order of which will be a platform, and which parts will be a gap between two platforms to jump, or when the direction changes.</w:t>
       </w:r>
     </w:p>
     <w:p/>
@@ -1743,42 +1769,34 @@
       <w:r>
         <w:t xml:space="preserve"> this does not make the level feel unique </w:t>
       </w:r>
-      <w:commentRangeStart w:id="13"/>
+      <w:commentRangeStart w:id="15"/>
       <w:r>
         <w:t>since you are just limiting it to difficulty</w:t>
       </w:r>
-      <w:commentRangeEnd w:id="13"/>
+      <w:commentRangeEnd w:id="15"/>
       <w:r>
         <w:rPr>
           <w:rStyle w:val="CommentReference"/>
           <w:sz w:val="24"/>
           <w:szCs w:val="24"/>
         </w:rPr>
-        <w:commentReference w:id="13"/>
+        <w:commentReference w:id="15"/>
       </w:r>
       <w:r>
         <w:t xml:space="preserve">. Instead, the application </w:t>
       </w:r>
-      <w:commentRangeStart w:id="14"/>
-      <w:r>
-        <w:t xml:space="preserve">has a way to change the likelihood of what will spawn in the level </w:t>
-      </w:r>
-      <w:proofErr w:type="gramStart"/>
-      <w:r>
-        <w:t>in order to</w:t>
-      </w:r>
-      <w:proofErr w:type="gramEnd"/>
-      <w:r>
-        <w:t xml:space="preserve"> allow an adjustment for difficulty, but also to allow for one level with the same difficulty to be completely unique from another level with the same difficulty.</w:t>
-      </w:r>
-      <w:commentRangeEnd w:id="14"/>
+      <w:commentRangeStart w:id="16"/>
+      <w:r>
+        <w:t>has a way to change the likelihood of what will spawn in the level in order to allow an adjustment for difficulty, but also to allow for one level with the same difficulty to be completely unique from another level with the same difficulty.</w:t>
+      </w:r>
+      <w:commentRangeEnd w:id="16"/>
       <w:r>
         <w:rPr>
           <w:rStyle w:val="CommentReference"/>
           <w:sz w:val="24"/>
           <w:szCs w:val="24"/>
         </w:rPr>
-        <w:commentReference w:id="14"/>
+        <w:commentReference w:id="16"/>
       </w:r>
     </w:p>
     <w:p/>
@@ -1786,18 +1804,18 @@
       <w:r>
         <w:t xml:space="preserve">The paper mentions a system about monitoring the player’s progress through the level, and the success and failure </w:t>
       </w:r>
-      <w:commentRangeStart w:id="15"/>
+      <w:commentRangeStart w:id="17"/>
       <w:r>
         <w:t>rates. The application takes some of these ideas and uses a unique method, which is measuring what the player does in the level and then outputting this onto a JSON file.</w:t>
       </w:r>
-      <w:commentRangeEnd w:id="15"/>
+      <w:commentRangeEnd w:id="17"/>
       <w:r>
         <w:rPr>
           <w:rStyle w:val="CommentReference"/>
           <w:sz w:val="24"/>
           <w:szCs w:val="24"/>
         </w:rPr>
-        <w:commentReference w:id="15"/>
+        <w:commentReference w:id="17"/>
       </w:r>
     </w:p>
     <w:p/>
@@ -1813,23 +1831,23 @@
       <w:r>
         <w:t xml:space="preserve"> (ref here), the generation is unfortunately flawed since it uses 9 different algorithms, which</w:t>
       </w:r>
-      <w:commentRangeStart w:id="16"/>
+      <w:commentRangeStart w:id="18"/>
       <w:r>
         <w:t xml:space="preserve"> </w:t>
       </w:r>
-      <w:commentRangeEnd w:id="16"/>
+      <w:commentRangeEnd w:id="18"/>
       <w:r>
         <w:rPr>
           <w:rStyle w:val="CommentReference"/>
           <w:sz w:val="24"/>
           <w:szCs w:val="24"/>
         </w:rPr>
-        <w:commentReference w:id="16"/>
+        <w:commentReference w:id="18"/>
       </w:r>
       <w:r>
         <w:t xml:space="preserve">makes the scope too big for the timeframe of this project. The article does </w:t>
       </w:r>
-      <w:commentRangeStart w:id="17"/>
+      <w:commentRangeStart w:id="19"/>
       <w:r>
         <w:t xml:space="preserve">have restrictions of furnishing however, which the project has made use of by </w:t>
       </w:r>
@@ -1849,15 +1867,7 @@
     <w:p/>
     <w:p>
       <w:r>
-        <w:t xml:space="preserve">The idea of the two-step generation is also in the application, where the platforms will be generated. After each platform generation, the collectable positions of that platform will be determined if there </w:t>
-      </w:r>
-      <w:proofErr w:type="gramStart"/>
-      <w:r>
-        <w:t>is</w:t>
-      </w:r>
-      <w:proofErr w:type="gramEnd"/>
-      <w:r>
-        <w:t xml:space="preserve"> any collectables. </w:t>
+        <w:t xml:space="preserve">The idea of the two-step generation is also in the application, where the platforms will be generated. After each platform generation, the collectable positions of that platform will be determined if there is any collectables. </w:t>
       </w:r>
       <w:r>
         <w:t xml:space="preserve"> </w:t>
@@ -1865,14 +1875,14 @@
       <w:r>
         <w:t>Once every platform has been generated</w:t>
       </w:r>
-      <w:commentRangeEnd w:id="17"/>
+      <w:commentRangeEnd w:id="19"/>
       <w:r>
         <w:rPr>
           <w:rStyle w:val="CommentReference"/>
           <w:sz w:val="24"/>
           <w:szCs w:val="24"/>
         </w:rPr>
-        <w:commentReference w:id="17"/>
+        <w:commentReference w:id="19"/>
       </w:r>
       <w:r>
         <w:t xml:space="preserve">, all the collectables in that section will be generated onto the level. </w:t>
@@ -1896,283 +1906,239 @@
     <w:p/>
     <w:p/>
     <w:p>
-      <w:commentRangeStart w:id="18"/>
-      <w:commentRangeStart w:id="19"/>
+      <w:commentRangeStart w:id="20"/>
+      <w:commentRangeStart w:id="21"/>
       <w:r>
         <w:t xml:space="preserve">The article has the same </w:t>
       </w:r>
-      <w:commentRangeEnd w:id="18"/>
+      <w:commentRangeEnd w:id="20"/>
       <w:r>
         <w:rPr>
           <w:rStyle w:val="CommentReference"/>
           <w:sz w:val="24"/>
           <w:szCs w:val="24"/>
         </w:rPr>
-        <w:commentReference w:id="18"/>
-      </w:r>
-      <w:commentRangeEnd w:id="19"/>
-      <w:r>
-        <w:rPr>
-          <w:rStyle w:val="CommentReference"/>
-          <w:rFonts w:asciiTheme="minorHAnsi" w:eastAsiaTheme="minorEastAsia" w:hAnsiTheme="minorHAnsi" w:cstheme="minorBidi"/>
-          <w:kern w:val="2"/>
-          <w:lang w:eastAsia="ko-KR"/>
-          <w14:ligatures w14:val="standardContextual"/>
-        </w:rPr>
-        <w:commentReference w:id="19"/>
-      </w:r>
-      <w:r>
-        <w:t xml:space="preserve">goal as this project, which is to save development times while still making the level feel engaging for players. </w:t>
-      </w:r>
-    </w:p>
-    <w:p>
-      <w:r>
-        <w:t xml:space="preserve">The abstract mentions that the algorithm has the potential to streamline game development processes, while it is still maintaining high quality content generation. However, to begin with stating the algorithm is still maintaining high quality content generation without stating there is evidence for this in the abstract might result in the reader believing that this is not backed up effectively if they were to look at the abstract as a summary of this paper. </w:t>
-      </w:r>
-    </w:p>
-    <w:p/>
-    <w:p>
-      <w:r>
-        <w:t xml:space="preserve">The paper describes that high quality games usually require manual generation and significant effort by a large team which includes designers and </w:t>
-      </w:r>
-      <w:commentRangeStart w:id="20"/>
-      <w:r>
-        <w:t>developers, which is expensive budget wise and can be time consuming. This links to the objective of this project, which is to procedurally generate 3D platformer levels to reduce the demand for designers and to reduce development time in terms of level design, and this in turn saves money for the company.</w:t>
-      </w:r>
-      <w:commentRangeEnd w:id="20"/>
+        <w:commentReference w:id="20"/>
+      </w:r>
+      <w:commentRangeEnd w:id="21"/>
       <w:r>
         <w:rPr>
           <w:rStyle w:val="CommentReference"/>
           <w:sz w:val="24"/>
           <w:szCs w:val="24"/>
         </w:rPr>
-        <w:commentReference w:id="20"/>
-      </w:r>
-    </w:p>
-    <w:p/>
-    <w:p>
-      <w:r>
-        <w:t xml:space="preserve">It states an advantage of procedural generation, which is that it can reduce the disk capacity of the final game dramatically since the content that is generated throughout the game is created on the fly. For example, in the application, when the player reaches a checkpoint, the content generated is determined just when the player touches the checkpoint, rather than generating it all at the start or before run time. This is effective for reducing compile times at the start since there isn’t as many </w:t>
-      </w:r>
-      <w:proofErr w:type="gramStart"/>
-      <w:r>
-        <w:t>assets</w:t>
-      </w:r>
-      <w:proofErr w:type="gramEnd"/>
-      <w:r>
-        <w:t xml:space="preserve"> to load at the beginning, and there is</w:t>
-      </w:r>
-      <w:r>
-        <w:t xml:space="preserve"> not</w:t>
-      </w:r>
-      <w:r>
-        <w:t xml:space="preserve"> any need to store the level itself in the game’s files, thus saving storage space. </w:t>
-      </w:r>
-    </w:p>
-    <w:p/>
-    <w:p/>
-    <w:p>
-      <w:r>
-        <w:t xml:space="preserve">The paper also states the disadvantage of procedural generation taken more processing power before the game loads but also mentions that this is better than having a larger file size for the game. However, the application does combat this by only generating one section of the level </w:t>
-      </w:r>
-      <w:r>
-        <w:lastRenderedPageBreak/>
-        <w:t xml:space="preserve">at the start. Each section gets generated when the player hits a checkpoint, which dramatically decreases the computational power needed for each generation. </w:t>
-      </w:r>
-    </w:p>
-    <w:p/>
-    <w:p>
-      <w:r>
-        <w:t xml:space="preserve">The article mentions that some methods generate the content during the loading phase, while others will be generated dynamically during gameplay. The application has taken both ideas, where the first section will be generated during the loading phase, and the overall generation attributes </w:t>
-      </w:r>
-      <w:commentRangeStart w:id="21"/>
-      <w:r>
-        <w:t>and parameters will be determined at the start. The rest of the sections will be generated dynamically based on these attributes and parameters.</w:t>
-      </w:r>
-    </w:p>
-    <w:p/>
-    <w:p>
-      <w:r>
-        <w:t xml:space="preserve">The paper states methods that procedural generation uses, it states Markov is a procedural generation method that is fast. This is used when determining which platform can be spawned in the level, and if there should be a direction change for example. This is also used for other attributes such as when generating a bounce pad in the level. </w:t>
-      </w:r>
-    </w:p>
-    <w:p>
-      <w:r>
-        <w:t xml:space="preserve">The paper does state that some machine learning methods, such as generative </w:t>
-      </w:r>
-      <w:proofErr w:type="spellStart"/>
-      <w:r>
-        <w:t>adversial</w:t>
-      </w:r>
-      <w:proofErr w:type="spellEnd"/>
-      <w:r>
-        <w:t xml:space="preserve"> networks is not a suitable method since it takes up too much computational power, which is not suited for real time content generation. I believe this effective since the paper is not afraid to mention flaws about procedural generation methods, which allows researchers to ensure they are making the right decisions when utilising procedural generation in their application.</w:t>
-      </w:r>
-    </w:p>
-    <w:p/>
-    <w:p>
-      <w:r>
-        <w:t xml:space="preserve">It has mentioned a procedural generation technique regarding difficulty in a level. If there were not time constraints with the development times of the project, this idea by determining the difficulty to use when reaching a checkpoint would be used. If the player successfully got a high score (e.g. lots of coins, fast time, no deaths), the difficulty would </w:t>
-      </w:r>
-      <w:commentRangeEnd w:id="21"/>
+        <w:commentReference w:id="21"/>
+      </w:r>
+      <w:r>
+        <w:t xml:space="preserve">goal as this project, which is to save development times while still making the level feel engaging for players. </w:t>
+      </w:r>
+    </w:p>
+    <w:p>
+      <w:r>
+        <w:t xml:space="preserve">The abstract mentions that the algorithm has the potential to streamline game development processes, while it is still maintaining high quality content generation. However, to begin with stating the algorithm is still maintaining high quality content generation without stating there is evidence for this in the abstract might result in the reader believing that this is not backed up effectively if they were to look at the abstract as a summary of this paper. </w:t>
+      </w:r>
+    </w:p>
+    <w:p/>
+    <w:p>
+      <w:r>
+        <w:t xml:space="preserve">The paper describes that high quality games usually require manual generation and significant effort by a large team which includes designers and </w:t>
+      </w:r>
+      <w:commentRangeStart w:id="22"/>
+      <w:r>
+        <w:t>developers, which is expensive budget wise and can be time consuming. This links to the objective of this project, which is to procedurally generate 3D platformer levels to reduce the demand for designers and to reduce development time in terms of level design, and this in turn saves money for the company.</w:t>
+      </w:r>
+      <w:commentRangeEnd w:id="22"/>
       <w:r>
         <w:rPr>
           <w:rStyle w:val="CommentReference"/>
           <w:sz w:val="24"/>
           <w:szCs w:val="24"/>
         </w:rPr>
-        <w:commentReference w:id="21"/>
-      </w:r>
-      <w:r>
-        <w:t>be harder.</w:t>
-      </w:r>
-    </w:p>
-    <w:p/>
-    <w:p>
-      <w:r>
-        <w:t xml:space="preserve">The article mentions that many games lack variety in terms of levels, which means the player can recognise patterns. It’s effective the article mentions this since for example, once you complete a video game, there </w:t>
+        <w:commentReference w:id="22"/>
+      </w:r>
+    </w:p>
+    <w:p/>
+    <w:p>
+      <w:r>
+        <w:t>It states an advantage of procedural generation, which is that it can reduce the disk capacity of the final game dramatically since the content that is generated throughout the game is created on the fly. For example, in the application, when the player reaches a checkpoint, the content generated is determined just when the player touches the checkpoint, rather than generating it all at the start or before run time. This is effective for reducing compile times at the start since there isn’t as many assets to load at the beginning, and there is</w:t>
+      </w:r>
+      <w:r>
+        <w:t xml:space="preserve"> not</w:t>
+      </w:r>
+      <w:r>
+        <w:t xml:space="preserve"> any need to store the level itself in the game’s files, thus saving storage space. </w:t>
+      </w:r>
+    </w:p>
+    <w:p/>
+    <w:p/>
+    <w:p>
+      <w:r>
+        <w:t xml:space="preserve">The paper also states the disadvantage of procedural generation taken more processing power before the game loads but also mentions that this is better than having a larger file size for the game. However, the </w:t>
       </w:r>
       <w:r>
         <w:lastRenderedPageBreak/>
-        <w:t xml:space="preserve">isn’t much in terms of </w:t>
-      </w:r>
-      <w:proofErr w:type="spellStart"/>
-      <w:r>
-        <w:t>replayability</w:t>
-      </w:r>
-      <w:proofErr w:type="spellEnd"/>
-      <w:r>
-        <w:t xml:space="preserve"> for the level layouts changing for example. </w:t>
-      </w:r>
-    </w:p>
-    <w:p>
-      <w:r>
-        <w:t xml:space="preserve">The article ensures to mention that rules are required to prevent </w:t>
-      </w:r>
-      <w:proofErr w:type="spellStart"/>
-      <w:r>
-        <w:t>softlocks</w:t>
-      </w:r>
-      <w:proofErr w:type="spellEnd"/>
-      <w:r>
-        <w:t>, such as with the improved spawn algorithm where special attention is given to the fact that all entrances cannot face any wall side, as a minimum distance from it is estimated. This is effective since the application also has some rules to prevent soft locks to name specific jump gaps and predefined platform sizes.</w:t>
-      </w:r>
-    </w:p>
-    <w:p/>
-    <w:p/>
-    <w:p/>
-    <w:p>
-      <w:r>
-        <w:t>2.2 Platformer Level Techniques</w:t>
-      </w:r>
-    </w:p>
-    <w:p>
-      <w:r>
-        <w:t>2.2.1 Patterns</w:t>
-      </w:r>
-    </w:p>
-    <w:p>
-      <w:r>
-        <w:t xml:space="preserve">In Level Design Patterns in 2D </w:t>
-      </w:r>
-      <w:r>
-        <w:t>Games (</w:t>
-      </w:r>
-      <w:r>
-        <w:t>ref here)</w:t>
-      </w:r>
-      <w:r>
-        <w:t xml:space="preserve">, it discusses in the introduction that level design </w:t>
-      </w:r>
-      <w:r>
-        <w:t xml:space="preserve">has become a major task in game design which links to how in this project that the point of procedurally generating content is to reduce the demands for game design. This is especially true for games becoming increasingly demanding, which also means the cost of creating a game is even higher, therefore using procedural generation in a game reduces the need of hiring more designers due to the demand of level design. </w:t>
-      </w:r>
-    </w:p>
-    <w:p/>
-    <w:p>
-      <w:r>
-        <w:t xml:space="preserve">The article has been effective for level design patterns, especially with the guidance segment, </w:t>
-      </w:r>
-      <w:r>
-        <w:t xml:space="preserve">which can help the player to figure where they might go next. This is important in level design since the player might feel </w:t>
-      </w:r>
-      <w:proofErr w:type="spellStart"/>
-      <w:r>
-        <w:t>lost</w:t>
-      </w:r>
-      <w:proofErr w:type="spellEnd"/>
-      <w:r>
-        <w:t xml:space="preserve"> of where to go without this mechanic, such as not having a trail of coins go towards where the player needs to go </w:t>
-      </w:r>
-      <w:r>
-        <w:t>next or</w:t>
-      </w:r>
-      <w:r>
-        <w:t xml:space="preserve"> having an arrow at the checkpoint for where the player needs to go. Pace breaking is also a powerful method for level design since it can dramatically change the parts of a level. For instance, having a lot of smaller jumps/smaller platforms in one part of the level, and then having lots of paths/coins in another segment. Checkpoints and save zones are another form of this, where for example in the application, a checkpoint will </w:t>
-      </w:r>
-      <w:r>
-        <w:t>be in</w:t>
-      </w:r>
-      <w:r>
-        <w:t xml:space="preserve"> a platform that is safe for the player so once they reach the checkpoint, they can </w:t>
-      </w:r>
-      <w:r>
-        <w:lastRenderedPageBreak/>
-        <w:t xml:space="preserve">strategically decide how they will navigate through the next section of the level. </w:t>
-      </w:r>
-    </w:p>
-    <w:p/>
-    <w:p>
-      <w:r>
-        <w:t>2.2.2 Playability</w:t>
-      </w:r>
-    </w:p>
-    <w:p>
-      <w:r>
-        <w:t xml:space="preserve">Procedural Generation of Game Levels and Maps (Ref here) is an article </w:t>
-      </w:r>
-      <w:commentRangeStart w:id="22"/>
+        <w:t xml:space="preserve">application does combat this by only generating one section of the level at the start. Each section gets generated when the player hits a checkpoint, which dramatically decreases the computational power needed for each generation. </w:t>
+      </w:r>
+    </w:p>
+    <w:p/>
+    <w:p>
+      <w:r>
+        <w:t xml:space="preserve">The article mentions that some methods generate the content during the loading phase, while others will be generated dynamically during gameplay. The application has taken both ideas, where the first section will be generated during the loading phase, and the overall generation attributes </w:t>
+      </w:r>
       <w:commentRangeStart w:id="23"/>
       <w:r>
-        <w:t xml:space="preserve">that is too difficult to understand when reading </w:t>
-      </w:r>
-      <w:r>
-        <w:t>without prior research</w:t>
-      </w:r>
-      <w:r>
-        <w:t xml:space="preserve"> as it m</w:t>
-      </w:r>
-      <w:r>
-        <w:t>ay</w:t>
-      </w:r>
-      <w:r>
-        <w:t xml:space="preserve"> require knowledge of various articles that have been referenced due to its vagueness, which is </w:t>
-      </w:r>
-      <w:r>
-        <w:t>not suitable</w:t>
-      </w:r>
-      <w:r>
-        <w:t xml:space="preserve"> for developers that might be on a tight deadline. </w:t>
-      </w:r>
-      <w:commentRangeEnd w:id="22"/>
+        <w:t>and parameters will be determined at the start. The rest of the sections will be generated dynamically based on these attributes and parameters.</w:t>
+      </w:r>
+    </w:p>
+    <w:p/>
+    <w:p>
+      <w:r>
+        <w:t xml:space="preserve">The paper states methods that procedural generation uses, it states Markov is a procedural generation method that is fast. This is used when determining which platform can be spawned in the level, and if there should be a direction change for example. This is also used for other attributes such as when generating a bounce pad in the level. </w:t>
+      </w:r>
+    </w:p>
+    <w:p>
+      <w:r>
+        <w:t>The paper does state that some machine learning methods, such as generative adversial networks is not a suitable method since it takes up too much computational power, which is not suited for real time content generation. I believe this effective since the paper is not afraid to mention flaws about procedural generation methods, which allows researchers to ensure they are making the right decisions when utilising procedural generation in their application.</w:t>
+      </w:r>
+    </w:p>
+    <w:p/>
+    <w:p>
+      <w:r>
+        <w:t xml:space="preserve">It has mentioned a procedural generation technique regarding difficulty in a level. If there were not time constraints with the development times of the project, this idea by determining the difficulty to use when reaching a checkpoint would be used. If the player successfully got a high score (e.g. lots of coins, fast time, no deaths), the difficulty would </w:t>
+      </w:r>
+      <w:commentRangeEnd w:id="23"/>
       <w:r>
         <w:rPr>
           <w:rStyle w:val="CommentReference"/>
           <w:sz w:val="24"/>
           <w:szCs w:val="24"/>
         </w:rPr>
-        <w:commentReference w:id="22"/>
-      </w:r>
-      <w:commentRangeEnd w:id="23"/>
+        <w:commentReference w:id="23"/>
+      </w:r>
+      <w:r>
+        <w:t>be harder.</w:t>
+      </w:r>
+    </w:p>
+    <w:p/>
+    <w:p>
+      <w:r>
+        <w:t xml:space="preserve">The article mentions that many games lack variety in terms of levels, which means the player can recognise patterns. It’s effective the article </w:t>
+      </w:r>
+      <w:r>
+        <w:lastRenderedPageBreak/>
+        <w:t xml:space="preserve">mentions this since for example, once you complete a video game, there isn’t much in terms of replayability for the level layouts changing for example. </w:t>
+      </w:r>
+    </w:p>
+    <w:p>
+      <w:r>
+        <w:t>The article ensures to mention that rules are required to prevent softlocks, such as with the improved spawn algorithm where special attention is given to the fact that all entrances cannot face any wall side, as a minimum distance from it is estimated. This is effective since the application also has some rules to prevent soft locks to name specific jump gaps and predefined platform sizes.</w:t>
+      </w:r>
+    </w:p>
+    <w:p/>
+    <w:p/>
+    <w:p/>
+    <w:p>
+      <w:r>
+        <w:t>2.2 Platformer Level Techniques</w:t>
+      </w:r>
+    </w:p>
+    <w:p>
+      <w:r>
+        <w:t>2.2.1 Patterns</w:t>
+      </w:r>
+    </w:p>
+    <w:p>
+      <w:r>
+        <w:t xml:space="preserve">In Level Design Patterns in 2D </w:t>
+      </w:r>
+      <w:r>
+        <w:t>Games (</w:t>
+      </w:r>
+      <w:r>
+        <w:t>ref here)</w:t>
+      </w:r>
+      <w:r>
+        <w:t xml:space="preserve">, it discusses in the introduction that level design </w:t>
+      </w:r>
+      <w:r>
+        <w:t xml:space="preserve">has become a major task in game design which links to how in this project that the point of procedurally generating content is to reduce the demands for game design. This is especially true for games becoming increasingly demanding, which also means the cost of creating a game is even higher, therefore using procedural generation in a game reduces the need of hiring more designers due to the demand of level design. </w:t>
+      </w:r>
+    </w:p>
+    <w:p/>
+    <w:p>
+      <w:r>
+        <w:t xml:space="preserve">The article has been effective for level design patterns, especially with the guidance segment, </w:t>
+      </w:r>
+      <w:r>
+        <w:t xml:space="preserve">which can help the player to figure where they might go next. This is important in level design since the player might feel lost of where to go without this mechanic, such as not having a trail of coins go towards where the player needs to go </w:t>
+      </w:r>
+      <w:r>
+        <w:t>next or</w:t>
+      </w:r>
+      <w:r>
+        <w:t xml:space="preserve"> having an arrow at the checkpoint for where the player needs to go. Pace breaking is also a powerful method for level design since it can dramatically change the parts of a level. For instance, having a lot of smaller jumps/smaller platforms in one part of the level, and then having lots of paths/coins in another segment. Checkpoints and save zones are another form of this, where for example in the application, a checkpoint will </w:t>
+      </w:r>
+      <w:r>
+        <w:t>be in</w:t>
+      </w:r>
+      <w:r>
+        <w:t xml:space="preserve"> a platform </w:t>
+      </w:r>
+      <w:r>
+        <w:lastRenderedPageBreak/>
+        <w:t xml:space="preserve">that is safe for the player so once they reach the checkpoint, they can strategically decide how they will navigate through the next section of the level. </w:t>
+      </w:r>
+    </w:p>
+    <w:p/>
+    <w:p>
+      <w:r>
+        <w:t>2.2.2 Playability</w:t>
+      </w:r>
+    </w:p>
+    <w:p>
+      <w:r>
+        <w:t xml:space="preserve">Procedural Generation of Game Levels and Maps (Ref here) is an article </w:t>
+      </w:r>
+      <w:commentRangeStart w:id="24"/>
+      <w:commentRangeStart w:id="25"/>
+      <w:r>
+        <w:t xml:space="preserve">that is too difficult to understand when reading </w:t>
+      </w:r>
+      <w:r>
+        <w:t>without prior research</w:t>
+      </w:r>
+      <w:r>
+        <w:t xml:space="preserve"> as it m</w:t>
+      </w:r>
+      <w:r>
+        <w:t>ay</w:t>
+      </w:r>
+      <w:r>
+        <w:t xml:space="preserve"> require knowledge of various articles that have been referenced due to its vagueness, which is </w:t>
+      </w:r>
+      <w:r>
+        <w:t>not suitable</w:t>
+      </w:r>
+      <w:r>
+        <w:t xml:space="preserve"> for developers that might be on a tight deadline. </w:t>
+      </w:r>
+      <w:commentRangeEnd w:id="24"/>
       <w:r>
         <w:rPr>
           <w:rStyle w:val="CommentReference"/>
-          <w:rFonts w:asciiTheme="minorHAnsi" w:eastAsiaTheme="minorEastAsia" w:hAnsiTheme="minorHAnsi" w:cstheme="minorBidi"/>
-          <w:kern w:val="2"/>
-          <w:lang w:eastAsia="ko-KR"/>
-          <w14:ligatures w14:val="standardContextual"/>
-        </w:rPr>
-        <w:commentReference w:id="23"/>
+          <w:sz w:val="24"/>
+          <w:szCs w:val="24"/>
+        </w:rPr>
+        <w:commentReference w:id="24"/>
+      </w:r>
+      <w:commentRangeEnd w:id="25"/>
+      <w:r>
+        <w:rPr>
+          <w:rStyle w:val="CommentReference"/>
+          <w:sz w:val="24"/>
+          <w:szCs w:val="24"/>
+        </w:rPr>
+        <w:commentReference w:id="25"/>
       </w:r>
     </w:p>
     <w:p/>
@@ -2188,7 +2154,6 @@
         <w:pStyle w:val="Heading1"/>
       </w:pPr>
       <w:r>
-        <w:lastRenderedPageBreak/>
         <w:br w:type="page"/>
       </w:r>
     </w:p>
@@ -2198,25 +2163,196 @@
         <w:pStyle w:val="Heading1"/>
         <w:jc w:val="center"/>
       </w:pPr>
-      <w:bookmarkStart w:id="24" w:name="_Toc92987354"/>
-      <w:r>
-        <w:lastRenderedPageBreak/>
+      <w:bookmarkStart w:id="26" w:name="_Toc92987354"/>
+      <w:r>
         <w:t>Chapter 3</w:t>
       </w:r>
       <w:r>
         <w:t xml:space="preserve"> Methodology</w:t>
       </w:r>
-      <w:bookmarkEnd w:id="24"/>
-      <w:r>
-        <w:br w:type="page"/>
-      </w:r>
+      <w:bookmarkEnd w:id="26"/>
     </w:p>
     <w:p>
       <w:pPr>
         <w:pStyle w:val="Heading1"/>
         <w:jc w:val="center"/>
-      </w:pPr>
-      <w:bookmarkStart w:id="25" w:name="_Toc92987355"/>
+        <w:rPr>
+          <w:b w:val="0"/>
+          <w:bCs w:val="0"/>
+        </w:rPr>
+      </w:pPr>
+      <w:r>
+        <w:rPr>
+          <w:b w:val="0"/>
+          <w:bCs w:val="0"/>
+        </w:rPr>
+        <w:t>To achieve the goals of the project, elements from rhythm-based platforming techniques were chosen. To demonstrate how the level will play out, a playable character was developed. This chapter will provide a detailed description of how the development process was delivered and the reasoning behind the decisions made during the making of the application.</w:t>
+      </w:r>
+    </w:p>
+    <w:p>
+      <w:pPr>
+        <w:pStyle w:val="Heading1"/>
+        <w:jc w:val="center"/>
+        <w:rPr>
+          <w:b w:val="0"/>
+          <w:bCs w:val="0"/>
+        </w:rPr>
+      </w:pPr>
+    </w:p>
+    <w:p>
+      <w:pPr>
+        <w:pStyle w:val="Heading1"/>
+        <w:jc w:val="center"/>
+      </w:pPr>
+      <w:r>
+        <w:t>3.1 Project Development</w:t>
+      </w:r>
+    </w:p>
+    <w:p>
+      <w:pPr>
+        <w:pStyle w:val="Heading1"/>
+        <w:jc w:val="center"/>
+      </w:pPr>
+      <w:r>
+        <w:t>3.1.1 Development Environment</w:t>
+      </w:r>
+    </w:p>
+    <w:p>
+      <w:pPr>
+        <w:pStyle w:val="Heading1"/>
+        <w:jc w:val="center"/>
+        <w:rPr>
+          <w:b w:val="0"/>
+          <w:bCs w:val="0"/>
+        </w:rPr>
+      </w:pPr>
+      <w:r>
+        <w:rPr>
+          <w:b w:val="0"/>
+          <w:bCs w:val="0"/>
+        </w:rPr>
+        <w:t>Godot(ref here) was chosen as the development environment in this project due to the engine being lightweight</w:t>
+      </w:r>
+      <w:r>
+        <w:rPr>
+          <w:b w:val="0"/>
+          <w:bCs w:val="0"/>
+        </w:rPr>
+        <w:t xml:space="preserve"> in terms of processing power, therefore allowing more machines to run it. Using Godot has also ensured that generating the level will not require an intensive setup. Additionally, the researcher is highly experienced with Godot’s workflow and scripting system. The application was developed using the .NET version of Godot, which means the scripting language was implemented in C#, therefore allowing the scripting part of the application to be easily transferred over to Unity. </w:t>
+      </w:r>
+    </w:p>
+    <w:p>
+      <w:pPr>
+        <w:pStyle w:val="Heading1"/>
+        <w:jc w:val="center"/>
+      </w:pPr>
+      <w:r>
+        <w:t>3.3.1 Data Collection</w:t>
+      </w:r>
+    </w:p>
+    <w:p>
+      <w:pPr>
+        <w:pStyle w:val="Heading1"/>
+        <w:jc w:val="center"/>
+        <w:rPr>
+          <w:b w:val="0"/>
+          <w:bCs w:val="0"/>
+        </w:rPr>
+      </w:pPr>
+      <w:r>
+        <w:rPr>
+          <w:b w:val="0"/>
+          <w:bCs w:val="0"/>
+        </w:rPr>
+        <w:t xml:space="preserve">User testing was selected for this project to determine if the generated level the user played was enjoyable and if the user </w:t>
+      </w:r>
+      <w:r>
+        <w:rPr>
+          <w:b w:val="0"/>
+          <w:bCs w:val="0"/>
+        </w:rPr>
+        <w:lastRenderedPageBreak/>
+        <w:t>managed the user interface just fine</w:t>
+      </w:r>
+      <w:r>
+        <w:rPr>
+          <w:b w:val="0"/>
+          <w:bCs w:val="0"/>
+        </w:rPr>
+        <w:t xml:space="preserve"> and how they thought about the accuracy of difficulty using it</w:t>
+      </w:r>
+      <w:r>
+        <w:rPr>
+          <w:b w:val="0"/>
+          <w:bCs w:val="0"/>
+        </w:rPr>
+        <w:t>.</w:t>
+      </w:r>
+      <w:r>
+        <w:rPr>
+          <w:b w:val="0"/>
+          <w:bCs w:val="0"/>
+        </w:rPr>
+        <w:t xml:space="preserve"> The users also had their desired settings, the level generated which they played, and the results of their gameplay all documented. This was used with a JSON file due to Godot’s ease of use of outputting data through its own built-in functions. </w:t>
+      </w:r>
+      <w:r>
+        <w:rPr>
+          <w:b w:val="0"/>
+          <w:bCs w:val="0"/>
+        </w:rPr>
+        <w:t xml:space="preserve"> </w:t>
+      </w:r>
+    </w:p>
+    <w:p>
+      <w:pPr>
+        <w:pStyle w:val="Heading1"/>
+        <w:jc w:val="center"/>
+        <w:rPr>
+          <w:b w:val="0"/>
+          <w:bCs w:val="0"/>
+        </w:rPr>
+      </w:pPr>
+      <w:r>
+        <w:rPr>
+          <w:b w:val="0"/>
+          <w:bCs w:val="0"/>
+        </w:rPr>
+        <w:t>The participants selected w</w:t>
+      </w:r>
+      <w:r>
+        <w:rPr>
+          <w:b w:val="0"/>
+          <w:bCs w:val="0"/>
+        </w:rPr>
+        <w:t>ere</w:t>
+      </w:r>
+      <w:r>
+        <w:rPr>
+          <w:b w:val="0"/>
+          <w:bCs w:val="0"/>
+        </w:rPr>
+        <w:t xml:space="preserve"> those who are familiar with the procedural generation technique, and those who are familiar with the 3D platformer genre.</w:t>
+      </w:r>
+    </w:p>
+    <w:p>
+      <w:pPr>
+        <w:pStyle w:val="Heading1"/>
+        <w:jc w:val="center"/>
+        <w:rPr>
+          <w:b w:val="0"/>
+          <w:bCs w:val="0"/>
+        </w:rPr>
+      </w:pPr>
+      <w:r>
+        <w:br w:type="page"/>
+      </w:r>
+    </w:p>
+    <w:p>
+      <w:pPr>
+        <w:pStyle w:val="Heading1"/>
+        <w:jc w:val="center"/>
+      </w:pPr>
+      <w:bookmarkStart w:id="27" w:name="_Toc92987355"/>
       <w:r>
         <w:lastRenderedPageBreak/>
         <w:t>Chapter 4</w:t>
@@ -2224,7 +2360,7 @@
       <w:r>
         <w:t xml:space="preserve"> Results</w:t>
       </w:r>
-      <w:bookmarkEnd w:id="25"/>
+      <w:bookmarkEnd w:id="27"/>
     </w:p>
     <w:p>
       <w:pPr>
@@ -2246,7 +2382,7 @@
         <w:pStyle w:val="Heading1"/>
         <w:jc w:val="center"/>
       </w:pPr>
-      <w:bookmarkStart w:id="26" w:name="_Toc92987356"/>
+      <w:bookmarkStart w:id="28" w:name="_Toc92987356"/>
       <w:r>
         <w:lastRenderedPageBreak/>
         <w:t>Chapter 5</w:t>
@@ -2254,7 +2390,7 @@
       <w:r>
         <w:t xml:space="preserve"> Discussion</w:t>
       </w:r>
-      <w:bookmarkEnd w:id="26"/>
+      <w:bookmarkEnd w:id="28"/>
       <w:r>
         <w:br w:type="page"/>
       </w:r>
@@ -2264,7 +2400,7 @@
         <w:pStyle w:val="Heading1"/>
         <w:jc w:val="center"/>
       </w:pPr>
-      <w:bookmarkStart w:id="27" w:name="_Toc92987357"/>
+      <w:bookmarkStart w:id="29" w:name="_Toc92987357"/>
       <w:r>
         <w:lastRenderedPageBreak/>
         <w:t>Chapter 6</w:t>
@@ -2278,7 +2414,7 @@
       <w:r>
         <w:t>uture Work</w:t>
       </w:r>
-      <w:bookmarkEnd w:id="27"/>
+      <w:bookmarkEnd w:id="29"/>
       <w:r>
         <w:br w:type="page"/>
       </w:r>
@@ -2287,12 +2423,12 @@
       <w:pPr>
         <w:pStyle w:val="Heading1"/>
       </w:pPr>
-      <w:bookmarkStart w:id="28" w:name="_Toc92987358"/>
+      <w:bookmarkStart w:id="30" w:name="_Toc92987358"/>
       <w:r>
         <w:lastRenderedPageBreak/>
         <w:t>List of References</w:t>
       </w:r>
-      <w:bookmarkEnd w:id="28"/>
+      <w:bookmarkEnd w:id="30"/>
     </w:p>
     <w:p>
       <w:pPr>
@@ -2301,27 +2437,26 @@
       <w:r>
         <w:br w:type="page"/>
       </w:r>
-      <w:bookmarkStart w:id="29" w:name="_Toc92987359"/>
-      <w:bookmarkStart w:id="30" w:name="_Toc447628191"/>
+      <w:bookmarkStart w:id="31" w:name="_Toc92987359"/>
+      <w:bookmarkStart w:id="32" w:name="_Toc447628191"/>
       <w:r>
         <w:lastRenderedPageBreak/>
         <w:t>Bibliography</w:t>
       </w:r>
-      <w:bookmarkEnd w:id="29"/>
+      <w:bookmarkEnd w:id="31"/>
     </w:p>
     <w:p>
       <w:r>
         <w:t>If required</w:t>
       </w:r>
     </w:p>
-    <w:bookmarkEnd w:id="30"/>
+    <w:bookmarkEnd w:id="32"/>
     <w:p/>
     <w:p>
       <w:pPr>
         <w:pStyle w:val="Heading1"/>
       </w:pPr>
       <w:r>
-        <w:lastRenderedPageBreak/>
         <w:br w:type="page"/>
       </w:r>
     </w:p>
@@ -2329,12 +2464,12 @@
       <w:pPr>
         <w:pStyle w:val="Heading1"/>
       </w:pPr>
-      <w:bookmarkStart w:id="31" w:name="_Toc92987360"/>
+      <w:bookmarkStart w:id="33" w:name="_Toc92987360"/>
       <w:r>
         <w:lastRenderedPageBreak/>
         <w:t>Appendices</w:t>
       </w:r>
-      <w:bookmarkEnd w:id="31"/>
+      <w:bookmarkEnd w:id="33"/>
       <w:r>
         <w:t xml:space="preserve"> </w:t>
       </w:r>
@@ -2403,7 +2538,7 @@
       </w:r>
     </w:p>
   </w:comment>
-  <w:comment w:id="10" w:author="Hadi Mehrpouya" w:date="2026-04-08T06:52:00Z" w:initials="HM">
+  <w:comment w:id="7" w:author="Jerry" w:date="2026-04-17T14:00:00Z" w:initials="J">
     <w:p>
       <w:pPr>
         <w:pStyle w:val="CommentText"/>
@@ -2415,11 +2550,30 @@
         <w:annotationRef/>
       </w:r>
       <w:r>
+        <w:rPr>
+          <w:lang w:val="en-US"/>
+        </w:rPr>
+        <w:t>Changed slightly but take another look in case</w:t>
+      </w:r>
+    </w:p>
+  </w:comment>
+  <w:comment w:id="11" w:author="Hadi Mehrpouya" w:date="2026-04-08T06:52:00Z" w:initials="HM">
+    <w:p>
+      <w:pPr>
+        <w:pStyle w:val="CommentText"/>
+      </w:pPr>
+      <w:r>
+        <w:rPr>
+          <w:rStyle w:val="CommentReference"/>
+        </w:rPr>
+        <w:annotationRef/>
+      </w:r>
+      <w:r>
         <w:t>Is it a mechanic?</w:t>
       </w:r>
     </w:p>
   </w:comment>
-  <w:comment w:id="9" w:author="Hadi Mehrpouya" w:date="2026-04-08T06:54:00Z" w:initials="HM">
+  <w:comment w:id="10" w:author="Hadi Mehrpouya" w:date="2026-04-08T06:54:00Z" w:initials="HM">
     <w:p>
       <w:pPr>
         <w:pStyle w:val="CommentText"/>
@@ -2435,7 +2589,7 @@
       </w:r>
     </w:p>
   </w:comment>
-  <w:comment w:id="12" w:author="Hadi Mehrpouya" w:date="2026-04-08T06:55:00Z" w:initials="HM">
+  <w:comment w:id="13" w:author="Jerry" w:date="2026-04-17T22:11:00Z" w:initials="J">
     <w:p>
       <w:pPr>
         <w:pStyle w:val="CommentText"/>
@@ -2447,11 +2601,30 @@
         <w:annotationRef/>
       </w:r>
       <w:r>
+        <w:rPr>
+          <w:lang w:val="en-US"/>
+        </w:rPr>
+        <w:t>Mention how in the 2006ish paper about pcg in 2d platformers you took elements for this to create platforms prior to generating them</w:t>
+      </w:r>
+    </w:p>
+  </w:comment>
+  <w:comment w:id="14" w:author="Hadi Mehrpouya" w:date="2026-04-08T06:55:00Z" w:initials="HM">
+    <w:p>
+      <w:pPr>
+        <w:pStyle w:val="CommentText"/>
+      </w:pPr>
+      <w:r>
+        <w:rPr>
+          <w:rStyle w:val="CommentReference"/>
+        </w:rPr>
+        <w:annotationRef/>
+      </w:r>
+      <w:r>
         <w:t>Good, double check formating. You can expand this a bit more too, e.g. 2.1 offers a brief summary of …..following this, 2.Y provides….</w:t>
       </w:r>
     </w:p>
   </w:comment>
-  <w:comment w:id="13" w:author="Hadi Mehrpouya" w:date="2026-04-08T07:16:00Z" w:initials="HM">
+  <w:comment w:id="15" w:author="Hadi Mehrpouya" w:date="2026-04-08T07:16:00Z" w:initials="HM">
     <w:p>
       <w:pPr>
         <w:pStyle w:val="CommentText"/>
@@ -2467,7 +2640,7 @@
       </w:r>
     </w:p>
   </w:comment>
-  <w:comment w:id="14" w:author="Hadi Mehrpouya" w:date="2026-04-08T07:16:00Z" w:initials="HM">
+  <w:comment w:id="16" w:author="Hadi Mehrpouya" w:date="2026-04-08T07:16:00Z" w:initials="HM">
     <w:p>
       <w:pPr>
         <w:pStyle w:val="CommentText"/>
@@ -2483,7 +2656,7 @@
       </w:r>
     </w:p>
   </w:comment>
-  <w:comment w:id="15" w:author="Hadi Mehrpouya" w:date="2026-04-08T07:17:00Z" w:initials="HM">
+  <w:comment w:id="17" w:author="Hadi Mehrpouya" w:date="2026-04-08T07:17:00Z" w:initials="HM">
     <w:p>
       <w:pPr>
         <w:pStyle w:val="CommentText"/>
@@ -2499,7 +2672,7 @@
       </w:r>
     </w:p>
   </w:comment>
-  <w:comment w:id="16" w:author="Hadi Mehrpouya" w:date="2026-04-08T07:18:00Z" w:initials="HM">
+  <w:comment w:id="18" w:author="Hadi Mehrpouya" w:date="2026-04-08T07:18:00Z" w:initials="HM">
     <w:p>
       <w:pPr>
         <w:pStyle w:val="CommentText"/>
@@ -2515,7 +2688,7 @@
       </w:r>
     </w:p>
   </w:comment>
-  <w:comment w:id="17" w:author="Hadi Mehrpouya" w:date="2026-04-08T07:18:00Z" w:initials="HM">
+  <w:comment w:id="19" w:author="Hadi Mehrpouya" w:date="2026-04-08T07:18:00Z" w:initials="HM">
     <w:p>
       <w:pPr>
         <w:pStyle w:val="CommentText"/>
@@ -2531,7 +2704,7 @@
       </w:r>
     </w:p>
   </w:comment>
-  <w:comment w:id="18" w:author="Hadi Mehrpouya" w:date="2026-04-08T07:19:00Z" w:initials="HM">
+  <w:comment w:id="20" w:author="Hadi Mehrpouya" w:date="2026-04-08T07:19:00Z" w:initials="HM">
     <w:p>
       <w:pPr>
         <w:pStyle w:val="CommentText"/>
@@ -2547,7 +2720,7 @@
       </w:r>
     </w:p>
   </w:comment>
-  <w:comment w:id="19" w:author="JERRY FRASER" w:date="2026-04-16T16:54:00Z" w:initials="JF">
+  <w:comment w:id="21" w:author="JERRY FRASER" w:date="2026-04-16T16:54:00Z" w:initials="JF">
     <w:p>
       <w:pPr>
         <w:pStyle w:val="CommentText"/>
@@ -2563,7 +2736,7 @@
       </w:r>
     </w:p>
   </w:comment>
-  <w:comment w:id="20" w:author="Hadi Mehrpouya" w:date="2026-04-08T07:21:00Z" w:initials="HM">
+  <w:comment w:id="22" w:author="Hadi Mehrpouya" w:date="2026-04-08T07:21:00Z" w:initials="HM">
     <w:p>
       <w:pPr>
         <w:pStyle w:val="CommentText"/>
@@ -2579,7 +2752,7 @@
       </w:r>
     </w:p>
   </w:comment>
-  <w:comment w:id="21" w:author="Hadi Mehrpouya" w:date="2026-04-08T07:22:00Z" w:initials="HM">
+  <w:comment w:id="23" w:author="Hadi Mehrpouya" w:date="2026-04-08T07:22:00Z" w:initials="HM">
     <w:p>
       <w:pPr>
         <w:pStyle w:val="CommentText"/>
@@ -2595,7 +2768,7 @@
       </w:r>
     </w:p>
   </w:comment>
-  <w:comment w:id="22" w:author="Hadi Mehrpouya" w:date="2026-04-08T07:22:00Z" w:initials="HM">
+  <w:comment w:id="24" w:author="Hadi Mehrpouya" w:date="2026-04-08T07:22:00Z" w:initials="HM">
     <w:p>
       <w:pPr>
         <w:pStyle w:val="CommentText"/>
@@ -2611,7 +2784,7 @@
       </w:r>
     </w:p>
   </w:comment>
-  <w:comment w:id="23" w:author="JERRY FRASER" w:date="2026-04-16T16:52:00Z" w:initials="JF">
+  <w:comment w:id="25" w:author="JERRY FRASER" w:date="2026-04-16T16:52:00Z" w:initials="JF">
     <w:p>
       <w:pPr>
         <w:pStyle w:val="CommentText"/>
@@ -2633,10 +2806,12 @@
 <file path=word/commentsExtended.xml><?xml version="1.0" encoding="utf-8"?>
 <w15:commentsEx xmlns:wpc="http://schemas.microsoft.com/office/word/2010/wordprocessingCanvas" xmlns:cx="http://schemas.microsoft.com/office/drawing/2014/chartex" xmlns:cx1="http://schemas.microsoft.com/office/drawing/2015/9/8/chartex" xmlns:cx2="http://schemas.microsoft.com/office/drawing/2015/10/21/chartex" xmlns:cx3="http://schemas.microsoft.com/office/drawing/2016/5/9/chartex" xmlns:cx4="http://schemas.microsoft.com/office/drawing/2016/5/10/chartex" xmlns:cx5="http://schemas.microsoft.com/office/drawing/2016/5/11/chartex" xmlns:cx6="http://schemas.microsoft.com/office/drawing/2016/5/12/chartex" xmlns:cx7="http://schemas.microsoft.com/office/drawing/2016/5/13/chartex" xmlns:cx8="http://schemas.microsoft.com/office/drawing/2016/5/14/chartex" xmlns:mc="http://schemas.openxmlformats.org/markup-compatibility/2006" xmlns:aink="http://schemas.microsoft.com/office/drawing/2016/ink" xmlns:am3d="http://schemas.microsoft.com/office/drawing/2017/model3d" xmlns:o="urn:schemas-microsoft-com:office:office" xmlns:oel="http://schemas.microsoft.com/office/2019/extlst" xmlns:r="http://schemas.openxmlformats.org/officeDocument/2006/relationships" xmlns:m="http://schemas.openxmlformats.org/officeDocument/2006/math" xmlns:v="urn:schemas-microsoft-com:vml" xmlns:wp14="http://schemas.microsoft.com/office/word/2010/wordprocessingDrawing" xmlns:wp="http://schemas.openxmlformats.org/drawingml/2006/wordprocessingDrawing" xmlns:w10="urn:schemas-microsoft-com:office:word" xmlns:w="http://schemas.openxmlformats.org/wordprocessingml/2006/main" xmlns:w14="http://schemas.microsoft.com/office/word/2010/wordml" xmlns:w15="http://schemas.microsoft.com/office/word/2012/wordml" xmlns:w16cex="http://schemas.microsoft.com/office/word/2018/wordml/cex" xmlns:w16cid="http://schemas.microsoft.com/office/word/2016/wordml/cid" xmlns:w16="http://schemas.microsoft.com/office/word/2018/wordml" xmlns:w16du="http://schemas.microsoft.com/office/word/2023/wordml/word16du" xmlns:w16sdtdh="http://schemas.microsoft.com/office/word/2020/wordml/sdtdatahash" xmlns:w16sdtfl="http://schemas.microsoft.com/office/word/2024/wordml/sdtformatlock" xmlns:w16se="http://schemas.microsoft.com/office/word/2015/wordml/symex" xmlns:wpg="http://schemas.microsoft.com/office/word/2010/wordprocessingGroup" xmlns:wpi="http://schemas.microsoft.com/office/word/2010/wordprocessingInk" xmlns:wne="http://schemas.microsoft.com/office/word/2006/wordml" xmlns:wps="http://schemas.microsoft.com/office/word/2010/wordprocessingShape" mc:Ignorable="w14 w15 w16se w16cid w16 w16cex w16sdtdh w16sdtfl w16du wp14">
   <w15:commentEx w15:paraId="592DA7D3" w15:done="0"/>
-  <w15:commentEx w15:paraId="62F7EB78" w15:done="0"/>
+  <w15:commentEx w15:paraId="62F7EB78" w15:done="1"/>
   <w15:commentEx w15:paraId="6B1846D4" w15:done="0"/>
-  <w15:commentEx w15:paraId="60E96988" w15:done="0"/>
+  <w15:commentEx w15:paraId="5B71DF62" w15:paraIdParent="6B1846D4" w15:done="0"/>
+  <w15:commentEx w15:paraId="60E96988" w15:done="1"/>
   <w15:commentEx w15:paraId="2AA3A3DE" w15:done="0"/>
+  <w15:commentEx w15:paraId="63261128" w15:done="0"/>
   <w15:commentEx w15:paraId="10332D5F" w15:done="0"/>
   <w15:commentEx w15:paraId="4212E9AB" w15:done="0"/>
   <w15:commentEx w15:paraId="23D949FF" w15:done="0"/>
@@ -2655,7 +2830,19 @@
 <file path=word/commentsExtensible.xml><?xml version="1.0" encoding="utf-8"?>
 <w16cex:commentsExtensible xmlns:wpc="http://schemas.microsoft.com/office/word/2010/wordprocessingCanvas" xmlns:cx="http://schemas.microsoft.com/office/drawing/2014/chartex" xmlns:cx1="http://schemas.microsoft.com/office/drawing/2015/9/8/chartex" xmlns:cx2="http://schemas.microsoft.com/office/drawing/2015/10/21/chartex" xmlns:cx3="http://schemas.microsoft.com/office/drawing/2016/5/9/chartex" xmlns:cx4="http://schemas.microsoft.com/office/drawing/2016/5/10/chartex" xmlns:cx5="http://schemas.microsoft.com/office/drawing/2016/5/11/chartex" xmlns:cx6="http://schemas.microsoft.com/office/drawing/2016/5/12/chartex" xmlns:cx7="http://schemas.microsoft.com/office/drawing/2016/5/13/chartex" xmlns:cx8="http://schemas.microsoft.com/office/drawing/2016/5/14/chartex" xmlns:cr="http://schemas.microsoft.com/office/comments/2020/reactions" xmlns:mc="http://schemas.openxmlformats.org/markup-compatibility/2006" xmlns:aink="http://schemas.microsoft.com/office/drawing/2016/ink" xmlns:am3d="http://schemas.microsoft.com/office/drawing/2017/model3d" xmlns:o="urn:schemas-microsoft-com:office:office" xmlns:oel="http://schemas.microsoft.com/office/2019/extlst" xmlns:r="http://schemas.openxmlformats.org/officeDocument/2006/relationships" xmlns:m="http://schemas.openxmlformats.org/officeDocument/2006/math" xmlns:v="urn:schemas-microsoft-com:vml" xmlns:wp14="http://schemas.microsoft.com/office/word/2010/wordprocessingDrawing" xmlns:wp="http://schemas.openxmlformats.org/drawingml/2006/wordprocessingDrawing" xmlns:w10="urn:schemas-microsoft-com:office:word" xmlns:w="http://schemas.openxmlformats.org/wordprocessingml/2006/main" xmlns:w14="http://schemas.microsoft.com/office/word/2010/wordml" xmlns:w15="http://schemas.microsoft.com/office/word/2012/wordml" xmlns:w16cex="http://schemas.microsoft.com/office/word/2018/wordml/cex" xmlns:w16cid="http://schemas.microsoft.com/office/word/2016/wordml/cid" xmlns:w16="http://schemas.microsoft.com/office/word/2018/wordml" xmlns:w16du="http://schemas.microsoft.com/office/word/2023/wordml/word16du" xmlns:w16sdtdh="http://schemas.microsoft.com/office/word/2020/wordml/sdtdatahash" xmlns:w16sdtfl="http://schemas.microsoft.com/office/word/2024/wordml/sdtformatlock" xmlns:w16se="http://schemas.microsoft.com/office/word/2015/wordml/symex" xmlns:wpg="http://schemas.microsoft.com/office/word/2010/wordprocessingGroup" xmlns:wpi="http://schemas.microsoft.com/office/word/2010/wordprocessingInk" xmlns:wne="http://schemas.microsoft.com/office/word/2006/wordml" xmlns:wps="http://schemas.microsoft.com/office/word/2010/wordprocessingShape" mc:Ignorable="w14 w15 w16se w16cid w16 w16cex w16sdtdh w16sdtfl cr w16du wp14">
   <w16cex:commentExtensible w16cex:durableId="053A91DC" w16cex:dateUtc="2026-04-08T05:49:00Z"/>
-  <w16cex:commentExtensible w16cex:durableId="0FAB520E" w16cex:dateUtc="2026-04-08T05:51:00Z"/>
+  <w16cex:commentExtensible w16cex:durableId="0FAB520E" w16cex:dateUtc="2026-04-08T05:51:00Z">
+    <w16cex:extLst>
+      <w16:ext w16:uri="{CE6994B0-6A32-4C9F-8C6B-6E91EDA988CE}">
+        <cr:reactions xmlns:cr="http://schemas.microsoft.com/office/comments/2020/reactions">
+          <cr:reaction reactionType="1">
+            <cr:reactionInfo dateUtc="2026-04-17T10:22:24Z">
+              <cr:user userId="Jerry" userProvider="None" userName="Jerry"/>
+            </cr:reactionInfo>
+          </cr:reaction>
+        </cr:reactions>
+      </w16:ext>
+    </w16cex:extLst>
+  </w16cex:commentExtensible>
   <w16cex:commentExtensible w16cex:durableId="0277350D" w16cex:dateUtc="2026-04-08T05:51:00Z">
     <w16cex:extLst>
       <w16:ext w16:uri="{CE6994B0-6A32-4C9F-8C6B-6E91EDA988CE}">
@@ -2669,8 +2856,10 @@
       </w16:ext>
     </w16cex:extLst>
   </w16cex:commentExtensible>
+  <w16cex:commentExtensible w16cex:durableId="4E7E8613" w16cex:dateUtc="2026-04-17T13:00:00Z"/>
   <w16cex:commentExtensible w16cex:durableId="622D5A29" w16cex:dateUtc="2026-04-08T05:52:00Z"/>
   <w16cex:commentExtensible w16cex:durableId="18F39C27" w16cex:dateUtc="2026-04-08T05:54:00Z"/>
+  <w16cex:commentExtensible w16cex:durableId="0A397B29" w16cex:dateUtc="2026-04-17T21:11:00Z"/>
   <w16cex:commentExtensible w16cex:durableId="01053579" w16cex:dateUtc="2026-04-08T05:55:00Z">
     <w16cex:extLst>
       <w16:ext w16:uri="{CE6994B0-6A32-4C9F-8C6B-6E91EDA988CE}">
@@ -2703,8 +2892,10 @@
   <w16cid:commentId w16cid:paraId="592DA7D3" w16cid:durableId="053A91DC"/>
   <w16cid:commentId w16cid:paraId="62F7EB78" w16cid:durableId="0FAB520E"/>
   <w16cid:commentId w16cid:paraId="6B1846D4" w16cid:durableId="0277350D"/>
+  <w16cid:commentId w16cid:paraId="5B71DF62" w16cid:durableId="4E7E8613"/>
   <w16cid:commentId w16cid:paraId="60E96988" w16cid:durableId="622D5A29"/>
   <w16cid:commentId w16cid:paraId="2AA3A3DE" w16cid:durableId="18F39C27"/>
+  <w16cid:commentId w16cid:paraId="63261128" w16cid:durableId="0A397B29"/>
   <w16cid:commentId w16cid:paraId="10332D5F" w16cid:durableId="01053579"/>
   <w16cid:commentId w16cid:paraId="4212E9AB" w16cid:durableId="56E3320E"/>
   <w16cid:commentId w16cid:paraId="23D949FF" w16cid:durableId="5E125D0C"/>
@@ -3151,6 +3342,9 @@
 <w15:people xmlns:wpc="http://schemas.microsoft.com/office/word/2010/wordprocessingCanvas" xmlns:cx="http://schemas.microsoft.com/office/drawing/2014/chartex" xmlns:cx1="http://schemas.microsoft.com/office/drawing/2015/9/8/chartex" xmlns:cx2="http://schemas.microsoft.com/office/drawing/2015/10/21/chartex" xmlns:cx3="http://schemas.microsoft.com/office/drawing/2016/5/9/chartex" xmlns:cx4="http://schemas.microsoft.com/office/drawing/2016/5/10/chartex" xmlns:cx5="http://schemas.microsoft.com/office/drawing/2016/5/11/chartex" xmlns:cx6="http://schemas.microsoft.com/office/drawing/2016/5/12/chartex" xmlns:cx7="http://schemas.microsoft.com/office/drawing/2016/5/13/chartex" xmlns:cx8="http://schemas.microsoft.com/office/drawing/2016/5/14/chartex" xmlns:mc="http://schemas.openxmlformats.org/markup-compatibility/2006" xmlns:aink="http://schemas.microsoft.com/office/drawing/2016/ink" xmlns:am3d="http://schemas.microsoft.com/office/drawing/2017/model3d" xmlns:o="urn:schemas-microsoft-com:office:office" xmlns:oel="http://schemas.microsoft.com/office/2019/extlst" xmlns:r="http://schemas.openxmlformats.org/officeDocument/2006/relationships" xmlns:m="http://schemas.openxmlformats.org/officeDocument/2006/math" xmlns:v="urn:schemas-microsoft-com:vml" xmlns:wp14="http://schemas.microsoft.com/office/word/2010/wordprocessingDrawing" xmlns:wp="http://schemas.openxmlformats.org/drawingml/2006/wordprocessingDrawing" xmlns:w10="urn:schemas-microsoft-com:office:word" xmlns:w="http://schemas.openxmlformats.org/wordprocessingml/2006/main" xmlns:w14="http://schemas.microsoft.com/office/word/2010/wordml" xmlns:w15="http://schemas.microsoft.com/office/word/2012/wordml" xmlns:w16cex="http://schemas.microsoft.com/office/word/2018/wordml/cex" xmlns:w16cid="http://schemas.microsoft.com/office/word/2016/wordml/cid" xmlns:w16="http://schemas.microsoft.com/office/word/2018/wordml" xmlns:w16du="http://schemas.microsoft.com/office/word/2023/wordml/word16du" xmlns:w16sdtdh="http://schemas.microsoft.com/office/word/2020/wordml/sdtdatahash" xmlns:w16sdtfl="http://schemas.microsoft.com/office/word/2024/wordml/sdtformatlock" xmlns:w16se="http://schemas.microsoft.com/office/word/2015/wordml/symex" xmlns:wpg="http://schemas.microsoft.com/office/word/2010/wordprocessingGroup" xmlns:wpi="http://schemas.microsoft.com/office/word/2010/wordprocessingInk" xmlns:wne="http://schemas.microsoft.com/office/word/2006/wordml" xmlns:wps="http://schemas.microsoft.com/office/word/2010/wordprocessingShape" mc:Ignorable="w14 w15 w16se w16cid w16 w16cex w16sdtdh w16sdtfl w16du wp14">
   <w15:person w15:author="Hadi Mehrpouya">
     <w15:presenceInfo w15:providerId="AD" w15:userId="S::h517352@uad.ac.uk::294a077a-621c-4666-a3a9-532f8af7a40d"/>
+  </w15:person>
+  <w15:person w15:author="Jerry">
+    <w15:presenceInfo w15:providerId="None" w15:userId="Jerry"/>
   </w15:person>
   <w15:person w15:author="JERRY FRASER">
     <w15:presenceInfo w15:providerId="AD" w15:userId="S::2200611@uad.ac.uk::ccba7b0a-8b6a-4ff1-84cc-db4c01ca33ef"/>
@@ -4145,15 +4339,6 @@
 </file>
 
 <file path=customXml/item1.xml><?xml version="1.0" encoding="utf-8"?>
-<?mso-contentType ?>
-<FormTemplates xmlns="http://schemas.microsoft.com/sharepoint/v3/contenttype/forms">
-  <Display>DocumentLibraryForm</Display>
-  <Edit>DocumentLibraryForm</Edit>
-  <New>DocumentLibraryForm</New>
-</FormTemplates>
-</file>
-
-<file path=customXml/item2.xml><?xml version="1.0" encoding="utf-8"?>
 <ct:contentTypeSchema xmlns:ct="http://schemas.microsoft.com/office/2006/metadata/contentType" xmlns:ma="http://schemas.microsoft.com/office/2006/metadata/properties/metaAttributes" ct:_="" ma:_="" ma:contentTypeName="Document" ma:contentTypeID="0x01010033553FA8616F3A45AD369E275EA42271" ma:contentTypeVersion="11" ma:contentTypeDescription="Create a new document." ma:contentTypeScope="" ma:versionID="8eb4e0804d077bcc139b361cda3a640c">
   <xsd:schema xmlns:xsd="http://www.w3.org/2001/XMLSchema" xmlns:xs="http://www.w3.org/2001/XMLSchema" xmlns:p="http://schemas.microsoft.com/office/2006/metadata/properties" xmlns:ns3="371a10d4-9e19-41a9-948b-d1cca29b4cb6" xmlns:ns4="18dffc30-a361-43f0-bb4a-1f62e819a6f2" targetNamespace="http://schemas.microsoft.com/office/2006/metadata/properties" ma:root="true" ma:fieldsID="ac8e08ff64368403dfb4d2274f8d7465" ns3:_="" ns4:_="">
     <xsd:import namespace="371a10d4-9e19-41a9-948b-d1cca29b4cb6"/>
@@ -4362,25 +4547,26 @@
 </ct:contentTypeSchema>
 </file>
 
-<file path=customXml/item3.xml><?xml version="1.0" encoding="utf-8"?>
-<b:Sources xmlns:b="http://schemas.openxmlformats.org/officeDocument/2006/bibliography" xmlns="http://schemas.openxmlformats.org/officeDocument/2006/bibliography" SelectedStyle="\APA.XSL" StyleName="APA"/>
+<file path=customXml/item2.xml><?xml version="1.0" encoding="utf-8"?>
+<?mso-contentType ?>
+<FormTemplates xmlns="http://schemas.microsoft.com/sharepoint/v3/contenttype/forms">
+  <Display>DocumentLibraryForm</Display>
+  <Edit>DocumentLibraryForm</Edit>
+  <New>DocumentLibraryForm</New>
+</FormTemplates>
 </file>
 
-<file path=customXml/item4.xml><?xml version="1.0" encoding="utf-8"?>
+<file path=customXml/item3.xml><?xml version="1.0" encoding="utf-8"?>
 <p:properties xmlns:p="http://schemas.microsoft.com/office/2006/metadata/properties" xmlns:xsi="http://www.w3.org/2001/XMLSchema-instance" xmlns:pc="http://schemas.microsoft.com/office/infopath/2007/PartnerControls">
   <documentManagement/>
 </p:properties>
 </file>
 
-<file path=customXml/itemProps1.xml><?xml version="1.0" encoding="utf-8"?>
-<ds:datastoreItem xmlns:ds="http://schemas.openxmlformats.org/officeDocument/2006/customXml" ds:itemID="{05D9BF79-26A9-4E9A-9793-4E28B04A02DC}">
-  <ds:schemaRefs>
-    <ds:schemaRef ds:uri="http://schemas.microsoft.com/sharepoint/v3/contenttype/forms"/>
-  </ds:schemaRefs>
-</ds:datastoreItem>
+<file path=customXml/item4.xml><?xml version="1.0" encoding="utf-8"?>
+<b:Sources xmlns:b="http://schemas.openxmlformats.org/officeDocument/2006/bibliography" xmlns="http://schemas.openxmlformats.org/officeDocument/2006/bibliography" SelectedStyle="\APA.XSL" StyleName="APA"/>
 </file>
 
-<file path=customXml/itemProps2.xml><?xml version="1.0" encoding="utf-8"?>
+<file path=customXml/itemProps1.xml><?xml version="1.0" encoding="utf-8"?>
 <ds:datastoreItem xmlns:ds="http://schemas.openxmlformats.org/officeDocument/2006/customXml" ds:itemID="{307A6BE8-0D48-4A7D-A535-369CCDFBF2CB}">
   <ds:schemaRefs>
     <ds:schemaRef ds:uri="http://schemas.microsoft.com/office/2006/metadata/contentType"/>
@@ -4399,19 +4585,27 @@
 </ds:datastoreItem>
 </file>
 
-<file path=customXml/itemProps3.xml><?xml version="1.0" encoding="utf-8"?>
-<ds:datastoreItem xmlns:ds="http://schemas.openxmlformats.org/officeDocument/2006/customXml" ds:itemID="{79CEDF70-F74C-4284-98FC-38644A27E791}">
+<file path=customXml/itemProps2.xml><?xml version="1.0" encoding="utf-8"?>
+<ds:datastoreItem xmlns:ds="http://schemas.openxmlformats.org/officeDocument/2006/customXml" ds:itemID="{05D9BF79-26A9-4E9A-9793-4E28B04A02DC}">
   <ds:schemaRefs>
-    <ds:schemaRef ds:uri="http://schemas.openxmlformats.org/officeDocument/2006/bibliography"/>
+    <ds:schemaRef ds:uri="http://schemas.microsoft.com/sharepoint/v3/contenttype/forms"/>
   </ds:schemaRefs>
 </ds:datastoreItem>
 </file>
 
-<file path=customXml/itemProps4.xml><?xml version="1.0" encoding="utf-8"?>
+<file path=customXml/itemProps3.xml><?xml version="1.0" encoding="utf-8"?>
 <ds:datastoreItem xmlns:ds="http://schemas.openxmlformats.org/officeDocument/2006/customXml" ds:itemID="{10A8F88B-6E38-47A8-8074-155E10D59BDF}">
   <ds:schemaRefs>
     <ds:schemaRef ds:uri="http://schemas.microsoft.com/office/2006/metadata/properties"/>
     <ds:schemaRef ds:uri="http://schemas.microsoft.com/office/infopath/2007/PartnerControls"/>
   </ds:schemaRefs>
 </ds:datastoreItem>
+</file>
+
+<file path=customXml/itemProps4.xml><?xml version="1.0" encoding="utf-8"?>
+<ds:datastoreItem xmlns:ds="http://schemas.openxmlformats.org/officeDocument/2006/customXml" ds:itemID="{79CEDF70-F74C-4284-98FC-38644A27E791}">
+  <ds:schemaRefs>
+    <ds:schemaRef ds:uri="http://schemas.openxmlformats.org/officeDocument/2006/bibliography"/>
+  </ds:schemaRefs>
+</ds:datastoreItem>
 </file>
</xml_diff>

<commit_message>
added: more dissertation stuff and comments
</commit_message>
<xml_diff>
--- a/Documents/Dissertation w feedback 16th april.docx
+++ b/Documents/Dissertation w feedback 16th april.docx
@@ -2179,12 +2179,16 @@
         <w:rPr>
           <w:b w:val="0"/>
           <w:bCs w:val="0"/>
+          <w:sz w:val="24"/>
+          <w:szCs w:val="28"/>
         </w:rPr>
       </w:pPr>
       <w:r>
         <w:rPr>
           <w:b w:val="0"/>
           <w:bCs w:val="0"/>
+          <w:sz w:val="24"/>
+          <w:szCs w:val="28"/>
         </w:rPr>
         <w:t>To achieve the goals of the project, elements from rhythm-based platforming techniques were chosen. To demonstrate how the level will play out, a playable character was developed. This chapter will provide a detailed description of how the development process was delivered and the reasoning behind the decisions made during the making of the application.</w:t>
       </w:r>
@@ -2224,12 +2228,16 @@
         <w:rPr>
           <w:b w:val="0"/>
           <w:bCs w:val="0"/>
+          <w:sz w:val="24"/>
+          <w:szCs w:val="28"/>
         </w:rPr>
       </w:pPr>
       <w:r>
         <w:rPr>
           <w:b w:val="0"/>
           <w:bCs w:val="0"/>
+          <w:sz w:val="24"/>
+          <w:szCs w:val="28"/>
         </w:rPr>
         <w:t>Godot(ref here) was chosen as the development environment in this project due to the engine being lightweight</w:t>
       </w:r>
@@ -2237,8 +2245,10 @@
         <w:rPr>
           <w:b w:val="0"/>
           <w:bCs w:val="0"/>
-        </w:rPr>
-        <w:t xml:space="preserve"> in terms of processing power, therefore allowing more machines to run it. Using Godot has also ensured that generating the level will not require an intensive setup. Additionally, the researcher is highly experienced with Godot’s workflow and scripting system. The application was developed using the .NET version of Godot, which means the scripting language was implemented in C#, therefore allowing the scripting part of the application to be easily transferred over to Unity. </w:t>
+          <w:sz w:val="24"/>
+          <w:szCs w:val="28"/>
+        </w:rPr>
+        <w:t xml:space="preserve"> in terms of processing power, therefore allowing more machines to run it. Using Godot has also ensured that generating the level will not require an intensive setup. Additionally, the researcher is highly experienced with Godot’s workflow and scripting system. The application was developed using the .NET version of Godot, which means the scripting language was implemented in C#, therefore allowing the scripting part of the application to be easily transferred over to Unity.</w:t>
       </w:r>
     </w:p>
     <w:p>
@@ -2247,7 +2257,7 @@
         <w:jc w:val="center"/>
       </w:pPr>
       <w:r>
-        <w:t>3.3.1 Data Collection</w:t>
+        <w:t>3.2.1 Platform Placement</w:t>
       </w:r>
     </w:p>
     <w:p>
@@ -2257,49 +2267,272 @@
         <w:rPr>
           <w:b w:val="0"/>
           <w:bCs w:val="0"/>
+          <w:sz w:val="24"/>
+          <w:szCs w:val="28"/>
         </w:rPr>
       </w:pPr>
       <w:r>
         <w:rPr>
           <w:b w:val="0"/>
           <w:bCs w:val="0"/>
-        </w:rPr>
-        <w:t xml:space="preserve">User testing was selected for this project to determine if the generated level the user played was enjoyable and if the user </w:t>
+          <w:sz w:val="24"/>
+          <w:szCs w:val="28"/>
+        </w:rPr>
+        <w:t xml:space="preserve">To ensure the level was playable and that each part of the level was grouped correctly, some elements from the rhythm-based technique were </w:t>
       </w:r>
       <w:r>
         <w:rPr>
           <w:b w:val="0"/>
           <w:bCs w:val="0"/>
+          <w:sz w:val="24"/>
+          <w:szCs w:val="28"/>
         </w:rPr>
         <w:lastRenderedPageBreak/>
-        <w:t>managed the user interface just fine</w:t>
+        <w:t>used. Specifically for the platforms, jumps, and directions in the level.</w:t>
       </w:r>
       <w:r>
         <w:rPr>
           <w:b w:val="0"/>
           <w:bCs w:val="0"/>
-        </w:rPr>
-        <w:t xml:space="preserve"> and how they thought about the accuracy of difficulty using it</w:t>
-      </w:r>
+          <w:sz w:val="24"/>
+          <w:szCs w:val="28"/>
+        </w:rPr>
+        <w:t xml:space="preserve"> </w:t>
+      </w:r>
+      <w:commentRangeStart w:id="27"/>
       <w:r>
         <w:rPr>
           <w:b w:val="0"/>
           <w:bCs w:val="0"/>
-        </w:rPr>
-        <w:t>.</w:t>
-      </w:r>
-      <w:r>
-        <w:rPr>
+          <w:sz w:val="24"/>
+          <w:szCs w:val="28"/>
+        </w:rPr>
+        <w:t xml:space="preserve">This was selected to </w:t>
+      </w:r>
+      <w:commentRangeEnd w:id="27"/>
+      <w:r>
+        <w:rPr>
+          <w:rStyle w:val="CommentReference"/>
           <w:b w:val="0"/>
           <w:bCs w:val="0"/>
-        </w:rPr>
-        <w:t xml:space="preserve"> The users also had their desired settings, the level generated which they played, and the results of their gameplay all documented. This was used with a JSON file due to Godot’s ease of use of outputting data through its own built-in functions. </w:t>
-      </w:r>
-      <w:r>
+          <w:sz w:val="24"/>
+          <w:szCs w:val="28"/>
+        </w:rPr>
+        <w:commentReference w:id="27"/>
+      </w:r>
+    </w:p>
+    <w:p>
+      <w:r>
+        <w:drawing>
+          <wp:inline distT="0" distB="0" distL="0" distR="0" wp14:anchorId="3402FD7A" wp14:editId="119A876E">
+            <wp:extent cx="4979035" cy="1666875"/>
+            <wp:effectExtent l="0" t="0" r="0" b="9525"/>
+            <wp:docPr id="1845967081" name="Picture 1"/>
+            <wp:cNvGraphicFramePr>
+              <a:graphicFrameLocks xmlns:a="http://schemas.openxmlformats.org/drawingml/2006/main" noChangeAspect="1"/>
+            </wp:cNvGraphicFramePr>
+            <a:graphic xmlns:a="http://schemas.openxmlformats.org/drawingml/2006/main">
+              <a:graphicData uri="http://schemas.openxmlformats.org/drawingml/2006/picture">
+                <pic:pic xmlns:pic="http://schemas.openxmlformats.org/drawingml/2006/picture">
+                  <pic:nvPicPr>
+                    <pic:cNvPr id="1845967081" name=""/>
+                    <pic:cNvPicPr/>
+                  </pic:nvPicPr>
+                  <pic:blipFill>
+                    <a:blip r:embed="rId18"/>
+                    <a:stretch>
+                      <a:fillRect/>
+                    </a:stretch>
+                  </pic:blipFill>
+                  <pic:spPr>
+                    <a:xfrm>
+                      <a:off x="0" y="0"/>
+                      <a:ext cx="4979035" cy="1666875"/>
+                    </a:xfrm>
+                    <a:prstGeom prst="rect">
+                      <a:avLst/>
+                    </a:prstGeom>
+                  </pic:spPr>
+                </pic:pic>
+              </a:graphicData>
+            </a:graphic>
+          </wp:inline>
+        </w:drawing>
+      </w:r>
+    </w:p>
+    <w:p>
+      <w:r>
+        <w:t>Figure 1: Rhythm-Based Technique elements used in the application</w:t>
+      </w:r>
+    </w:p>
+    <w:p/>
+    <w:p/>
+    <w:p>
+      <w:pPr>
+        <w:rPr>
+          <w:b/>
+          <w:bCs/>
+          <w:sz w:val="28"/>
+          <w:szCs w:val="28"/>
+        </w:rPr>
+      </w:pPr>
+      <w:r>
+        <w:rPr>
+          <w:b/>
+          <w:bCs/>
+          <w:sz w:val="28"/>
+          <w:szCs w:val="28"/>
+        </w:rPr>
+        <w:t>3.3.2 User Interface</w:t>
+      </w:r>
+    </w:p>
+    <w:p>
+      <w:r>
+        <w:t xml:space="preserve">The application involved a user interface where the user has the ability to adjust parameters of the level. This involved changing the odds of how each part of the level was spawned, and adjusting the size of the level. </w:t>
+      </w:r>
+    </w:p>
+    <w:p/>
+    <w:p>
+      <w:r>
+        <w:drawing>
+          <wp:inline distT="0" distB="0" distL="0" distR="0" wp14:anchorId="26695CB5" wp14:editId="71C85FA4">
+            <wp:extent cx="4979035" cy="2787650"/>
+            <wp:effectExtent l="0" t="0" r="0" b="0"/>
+            <wp:docPr id="840056755" name="Picture 1"/>
+            <wp:cNvGraphicFramePr>
+              <a:graphicFrameLocks xmlns:a="http://schemas.openxmlformats.org/drawingml/2006/main" noChangeAspect="1"/>
+            </wp:cNvGraphicFramePr>
+            <a:graphic xmlns:a="http://schemas.openxmlformats.org/drawingml/2006/main">
+              <a:graphicData uri="http://schemas.openxmlformats.org/drawingml/2006/picture">
+                <pic:pic xmlns:pic="http://schemas.openxmlformats.org/drawingml/2006/picture">
+                  <pic:nvPicPr>
+                    <pic:cNvPr id="840056755" name=""/>
+                    <pic:cNvPicPr/>
+                  </pic:nvPicPr>
+                  <pic:blipFill>
+                    <a:blip r:embed="rId19"/>
+                    <a:stretch>
+                      <a:fillRect/>
+                    </a:stretch>
+                  </pic:blipFill>
+                  <pic:spPr>
+                    <a:xfrm>
+                      <a:off x="0" y="0"/>
+                      <a:ext cx="4979035" cy="2787650"/>
+                    </a:xfrm>
+                    <a:prstGeom prst="rect">
+                      <a:avLst/>
+                    </a:prstGeom>
+                  </pic:spPr>
+                </pic:pic>
+              </a:graphicData>
+            </a:graphic>
+          </wp:inline>
+        </w:drawing>
+      </w:r>
+    </w:p>
+    <w:p>
+      <w:r>
+        <w:lastRenderedPageBreak/>
+        <w:drawing>
+          <wp:inline distT="0" distB="0" distL="0" distR="0" wp14:anchorId="0DA53875" wp14:editId="30054D3E">
+            <wp:extent cx="4979035" cy="2789555"/>
+            <wp:effectExtent l="0" t="0" r="0" b="0"/>
+            <wp:docPr id="1687447222" name="Picture 1"/>
+            <wp:cNvGraphicFramePr>
+              <a:graphicFrameLocks xmlns:a="http://schemas.openxmlformats.org/drawingml/2006/main" noChangeAspect="1"/>
+            </wp:cNvGraphicFramePr>
+            <a:graphic xmlns:a="http://schemas.openxmlformats.org/drawingml/2006/main">
+              <a:graphicData uri="http://schemas.openxmlformats.org/drawingml/2006/picture">
+                <pic:pic xmlns:pic="http://schemas.openxmlformats.org/drawingml/2006/picture">
+                  <pic:nvPicPr>
+                    <pic:cNvPr id="1687447222" name=""/>
+                    <pic:cNvPicPr/>
+                  </pic:nvPicPr>
+                  <pic:blipFill>
+                    <a:blip r:embed="rId20"/>
+                    <a:stretch>
+                      <a:fillRect/>
+                    </a:stretch>
+                  </pic:blipFill>
+                  <pic:spPr>
+                    <a:xfrm>
+                      <a:off x="0" y="0"/>
+                      <a:ext cx="4979035" cy="2789555"/>
+                    </a:xfrm>
+                    <a:prstGeom prst="rect">
+                      <a:avLst/>
+                    </a:prstGeom>
+                  </pic:spPr>
+                </pic:pic>
+              </a:graphicData>
+            </a:graphic>
+          </wp:inline>
+        </w:drawing>
+      </w:r>
+    </w:p>
+    <w:p>
+      <w:r>
+        <w:t>Figures 2 and 3: Adjusting parameters of the level</w:t>
+      </w:r>
+    </w:p>
+    <w:p>
+      <w:pPr>
+        <w:pStyle w:val="Heading1"/>
+        <w:jc w:val="center"/>
+      </w:pPr>
+      <w:r>
+        <w:t>3.</w:t>
+      </w:r>
+      <w:r>
+        <w:t>4</w:t>
+      </w:r>
+      <w:r>
+        <w:t>.1 Data Collection</w:t>
+      </w:r>
+    </w:p>
+    <w:p>
+      <w:pPr>
+        <w:pStyle w:val="Heading1"/>
+        <w:jc w:val="center"/>
         <w:rPr>
           <w:b w:val="0"/>
           <w:bCs w:val="0"/>
         </w:rPr>
+      </w:pPr>
+      <w:r>
+        <w:rPr>
+          <w:b w:val="0"/>
+          <w:bCs w:val="0"/>
+        </w:rPr>
+        <w:t>User testing was selected for this project to determine if the generated level the user played was enjoyable and if the user managed the user interface just fine</w:t>
+      </w:r>
+      <w:r>
+        <w:rPr>
+          <w:b w:val="0"/>
+          <w:bCs w:val="0"/>
+        </w:rPr>
+        <w:t xml:space="preserve"> and how they thought about the accuracy of difficulty using it</w:t>
+      </w:r>
+      <w:r>
+        <w:rPr>
+          <w:b w:val="0"/>
+          <w:bCs w:val="0"/>
+        </w:rPr>
+        <w:t>.</w:t>
+      </w:r>
+      <w:r>
+        <w:rPr>
+          <w:b w:val="0"/>
+          <w:bCs w:val="0"/>
+        </w:rPr>
+        <w:t xml:space="preserve"> The users also had their desired settings, the level generated which they played, and the results of their gameplay all documented. This was used with a JSON file due to Godot’s ease of use of outputting data through its own built-in functions. </w:t>
+      </w:r>
+      <w:r>
+        <w:rPr>
+          <w:b w:val="0"/>
+          <w:bCs w:val="0"/>
+        </w:rPr>
         <w:t xml:space="preserve"> </w:t>
       </w:r>
     </w:p>
@@ -2352,7 +2585,7 @@
         <w:pStyle w:val="Heading1"/>
         <w:jc w:val="center"/>
       </w:pPr>
-      <w:bookmarkStart w:id="27" w:name="_Toc92987355"/>
+      <w:bookmarkStart w:id="28" w:name="_Toc92987355"/>
       <w:r>
         <w:lastRenderedPageBreak/>
         <w:t>Chapter 4</w:t>
@@ -2360,7 +2593,7 @@
       <w:r>
         <w:t xml:space="preserve"> Results</w:t>
       </w:r>
-      <w:bookmarkEnd w:id="27"/>
+      <w:bookmarkEnd w:id="28"/>
     </w:p>
     <w:p>
       <w:pPr>
@@ -2382,7 +2615,7 @@
         <w:pStyle w:val="Heading1"/>
         <w:jc w:val="center"/>
       </w:pPr>
-      <w:bookmarkStart w:id="28" w:name="_Toc92987356"/>
+      <w:bookmarkStart w:id="29" w:name="_Toc92987356"/>
       <w:r>
         <w:lastRenderedPageBreak/>
         <w:t>Chapter 5</w:t>
@@ -2390,7 +2623,7 @@
       <w:r>
         <w:t xml:space="preserve"> Discussion</w:t>
       </w:r>
-      <w:bookmarkEnd w:id="28"/>
+      <w:bookmarkEnd w:id="29"/>
       <w:r>
         <w:br w:type="page"/>
       </w:r>
@@ -2400,7 +2633,7 @@
         <w:pStyle w:val="Heading1"/>
         <w:jc w:val="center"/>
       </w:pPr>
-      <w:bookmarkStart w:id="29" w:name="_Toc92987357"/>
+      <w:bookmarkStart w:id="30" w:name="_Toc92987357"/>
       <w:r>
         <w:lastRenderedPageBreak/>
         <w:t>Chapter 6</w:t>
@@ -2414,7 +2647,7 @@
       <w:r>
         <w:t>uture Work</w:t>
       </w:r>
-      <w:bookmarkEnd w:id="29"/>
+      <w:bookmarkEnd w:id="30"/>
       <w:r>
         <w:br w:type="page"/>
       </w:r>
@@ -2423,12 +2656,12 @@
       <w:pPr>
         <w:pStyle w:val="Heading1"/>
       </w:pPr>
-      <w:bookmarkStart w:id="30" w:name="_Toc92987358"/>
+      <w:bookmarkStart w:id="31" w:name="_Toc92987358"/>
       <w:r>
         <w:lastRenderedPageBreak/>
         <w:t>List of References</w:t>
       </w:r>
-      <w:bookmarkEnd w:id="30"/>
+      <w:bookmarkEnd w:id="31"/>
     </w:p>
     <w:p>
       <w:pPr>
@@ -2437,20 +2670,20 @@
       <w:r>
         <w:br w:type="page"/>
       </w:r>
-      <w:bookmarkStart w:id="31" w:name="_Toc92987359"/>
-      <w:bookmarkStart w:id="32" w:name="_Toc447628191"/>
+      <w:bookmarkStart w:id="32" w:name="_Toc92987359"/>
+      <w:bookmarkStart w:id="33" w:name="_Toc447628191"/>
       <w:r>
         <w:lastRenderedPageBreak/>
         <w:t>Bibliography</w:t>
       </w:r>
-      <w:bookmarkEnd w:id="31"/>
+      <w:bookmarkEnd w:id="32"/>
     </w:p>
     <w:p>
       <w:r>
         <w:t>If required</w:t>
       </w:r>
     </w:p>
-    <w:bookmarkEnd w:id="32"/>
+    <w:bookmarkEnd w:id="33"/>
     <w:p/>
     <w:p>
       <w:pPr>
@@ -2464,20 +2697,20 @@
       <w:pPr>
         <w:pStyle w:val="Heading1"/>
       </w:pPr>
-      <w:bookmarkStart w:id="33" w:name="_Toc92987360"/>
+      <w:bookmarkStart w:id="34" w:name="_Toc92987360"/>
       <w:r>
         <w:lastRenderedPageBreak/>
         <w:t>Appendices</w:t>
       </w:r>
-      <w:bookmarkEnd w:id="33"/>
+      <w:bookmarkEnd w:id="34"/>
       <w:r>
         <w:t xml:space="preserve"> </w:t>
       </w:r>
     </w:p>
     <w:p/>
     <w:sectPr>
-      <w:headerReference w:type="default" r:id="rId18"/>
-      <w:footerReference w:type="default" r:id="rId19"/>
+      <w:headerReference w:type="default" r:id="rId21"/>
+      <w:footerReference w:type="default" r:id="rId22"/>
       <w:pgSz w:w="11906" w:h="16838"/>
       <w:pgMar w:top="1440" w:right="1797" w:bottom="1440" w:left="2268" w:header="720" w:footer="720" w:gutter="0"/>
       <w:pgNumType w:start="1"/>
@@ -2797,6 +3030,25 @@
       </w:r>
       <w:r>
         <w:t>Fixed a little but try to improve a little more</w:t>
+      </w:r>
+    </w:p>
+  </w:comment>
+  <w:comment w:id="27" w:author="Jerry" w:date="2026-04-17T23:33:00Z" w:initials="J">
+    <w:p>
+      <w:pPr>
+        <w:pStyle w:val="CommentText"/>
+      </w:pPr>
+      <w:r>
+        <w:rPr>
+          <w:rStyle w:val="CommentReference"/>
+        </w:rPr>
+        <w:annotationRef/>
+      </w:r>
+      <w:r>
+        <w:rPr>
+          <w:lang w:val="en-US"/>
+        </w:rPr>
+        <w:t>Look back on rhythm based papers</w:t>
       </w:r>
     </w:p>
   </w:comment>
@@ -2824,6 +3076,7 @@
   <w15:commentEx w15:paraId="725638F4" w15:done="0"/>
   <w15:commentEx w15:paraId="411FCE12" w15:done="0"/>
   <w15:commentEx w15:paraId="4D230C25" w15:paraIdParent="411FCE12" w15:done="0"/>
+  <w15:commentEx w15:paraId="0BB2FE0B" w15:done="0"/>
 </w15:commentsEx>
 </file>
 
@@ -2884,6 +3137,7 @@
   <w16cex:commentExtensible w16cex:durableId="279996B3" w16cex:dateUtc="2026-04-08T06:22:00Z"/>
   <w16cex:commentExtensible w16cex:durableId="0D92B2A9" w16cex:dateUtc="2026-04-08T06:22:00Z"/>
   <w16cex:commentExtensible w16cex:durableId="586455FE" w16cex:dateUtc="2026-04-16T15:52:00Z"/>
+  <w16cex:commentExtensible w16cex:durableId="196A3CED" w16cex:dateUtc="2026-04-17T22:33:00Z"/>
 </w16cex:commentsExtensible>
 </file>
 
@@ -2908,6 +3162,7 @@
   <w16cid:commentId w16cid:paraId="725638F4" w16cid:durableId="279996B3"/>
   <w16cid:commentId w16cid:paraId="411FCE12" w16cid:durableId="0D92B2A9"/>
   <w16cid:commentId w16cid:paraId="4D230C25" w16cid:durableId="586455FE"/>
+  <w16cid:commentId w16cid:paraId="0BB2FE0B" w16cid:durableId="196A3CED"/>
 </w16cid:commentsIds>
 </file>
 

</xml_diff>

<commit_message>
commit: more dissertation stuff
</commit_message>
<xml_diff>
--- a/Documents/Dissertation w feedback 16th april.docx
+++ b/Documents/Dissertation w feedback 16th april.docx
@@ -2154,6 +2154,7 @@
         <w:pStyle w:val="Heading1"/>
       </w:pPr>
       <w:r>
+        <w:lastRenderedPageBreak/>
         <w:br w:type="page"/>
       </w:r>
     </w:p>
@@ -2323,6 +2324,9 @@
     </w:p>
     <w:p>
       <w:r>
+        <w:rPr>
+          <w:noProof/>
+        </w:rPr>
         <w:drawing>
           <wp:inline distT="0" distB="0" distL="0" distR="0" wp14:anchorId="3402FD7A" wp14:editId="119A876E">
             <wp:extent cx="4979035" cy="1666875"/>
@@ -2394,6 +2398,9 @@
     <w:p/>
     <w:p>
       <w:r>
+        <w:rPr>
+          <w:noProof/>
+        </w:rPr>
         <w:drawing>
           <wp:inline distT="0" distB="0" distL="0" distR="0" wp14:anchorId="26695CB5" wp14:editId="71C85FA4">
             <wp:extent cx="4979035" cy="2787650"/>
@@ -2433,6 +2440,9 @@
     </w:p>
     <w:p>
       <w:r>
+        <w:rPr>
+          <w:noProof/>
+        </w:rPr>
         <w:lastRenderedPageBreak/>
         <w:drawing>
           <wp:inline distT="0" distB="0" distL="0" distR="0" wp14:anchorId="0DA53875" wp14:editId="30054D3E">
@@ -2498,12 +2508,16 @@
         <w:rPr>
           <w:b w:val="0"/>
           <w:bCs w:val="0"/>
+          <w:sz w:val="24"/>
+          <w:szCs w:val="28"/>
         </w:rPr>
       </w:pPr>
       <w:r>
         <w:rPr>
           <w:b w:val="0"/>
           <w:bCs w:val="0"/>
+          <w:sz w:val="24"/>
+          <w:szCs w:val="28"/>
         </w:rPr>
         <w:t>User testing was selected for this project to determine if the generated level the user played was enjoyable and if the user managed the user interface just fine</w:t>
       </w:r>
@@ -2511,6 +2525,8 @@
         <w:rPr>
           <w:b w:val="0"/>
           <w:bCs w:val="0"/>
+          <w:sz w:val="24"/>
+          <w:szCs w:val="28"/>
         </w:rPr>
         <w:t xml:space="preserve"> and how they thought about the accuracy of difficulty using it</w:t>
       </w:r>
@@ -2518,6 +2534,8 @@
         <w:rPr>
           <w:b w:val="0"/>
           <w:bCs w:val="0"/>
+          <w:sz w:val="24"/>
+          <w:szCs w:val="28"/>
         </w:rPr>
         <w:t>.</w:t>
       </w:r>
@@ -2525,6 +2543,8 @@
         <w:rPr>
           <w:b w:val="0"/>
           <w:bCs w:val="0"/>
+          <w:sz w:val="24"/>
+          <w:szCs w:val="28"/>
         </w:rPr>
         <w:t xml:space="preserve"> The users also had their desired settings, the level generated which they played, and the results of their gameplay all documented. This was used with a JSON file due to Godot’s ease of use of outputting data through its own built-in functions. </w:t>
       </w:r>
@@ -2532,6 +2552,8 @@
         <w:rPr>
           <w:b w:val="0"/>
           <w:bCs w:val="0"/>
+          <w:sz w:val="24"/>
+          <w:szCs w:val="28"/>
         </w:rPr>
         <w:t xml:space="preserve"> </w:t>
       </w:r>
@@ -2543,12 +2565,16 @@
         <w:rPr>
           <w:b w:val="0"/>
           <w:bCs w:val="0"/>
+          <w:sz w:val="24"/>
+          <w:szCs w:val="28"/>
         </w:rPr>
       </w:pPr>
       <w:r>
         <w:rPr>
           <w:b w:val="0"/>
           <w:bCs w:val="0"/>
+          <w:sz w:val="24"/>
+          <w:szCs w:val="28"/>
         </w:rPr>
         <w:t>The participants selected w</w:t>
       </w:r>
@@ -2556,6 +2582,8 @@
         <w:rPr>
           <w:b w:val="0"/>
           <w:bCs w:val="0"/>
+          <w:sz w:val="24"/>
+          <w:szCs w:val="28"/>
         </w:rPr>
         <w:t>ere</w:t>
       </w:r>
@@ -2563,20 +2591,100 @@
         <w:rPr>
           <w:b w:val="0"/>
           <w:bCs w:val="0"/>
+          <w:sz w:val="24"/>
+          <w:szCs w:val="28"/>
         </w:rPr>
         <w:t xml:space="preserve"> those who are familiar with the procedural generation technique, and those who are familiar with the 3D platformer genre.</w:t>
+      </w:r>
+    </w:p>
+    <w:p/>
+    <w:p>
+      <w:pPr>
+        <w:jc w:val="center"/>
+        <w:rPr>
+          <w:b/>
+          <w:bCs/>
+          <w:sz w:val="28"/>
+          <w:szCs w:val="28"/>
+        </w:rPr>
+      </w:pPr>
+      <w:r>
+        <w:rPr>
+          <w:b/>
+          <w:bCs/>
+          <w:sz w:val="28"/>
+          <w:szCs w:val="28"/>
+        </w:rPr>
+        <w:t>3.4.2 Pilot Test</w:t>
+      </w:r>
+    </w:p>
+    <w:p>
+      <w:pPr>
+        <w:jc w:val="center"/>
+      </w:pPr>
+      <w:r>
+        <w:t>A pilot test was conducted to check if there were any major issues with the application before the real test properly started. This test allowed the researcher to identity what issues were present in the application and needed to be addressed. Five participants were selected for this test, and th</w:t>
+      </w:r>
+      <w:r>
+        <w:t>e participants were four games programming students and the project supervisor of the researcher.</w:t>
+      </w:r>
+    </w:p>
+    <w:p>
+      <w:pPr>
+        <w:jc w:val="center"/>
+      </w:pPr>
+      <w:r>
+        <w:lastRenderedPageBreak/>
+        <w:t>This test was a survey, which required the user to submit a JSON file of their level’s results to assess how the user performed throughout the level.</w:t>
+      </w:r>
+      <w:r>
+        <w:t xml:space="preserve"> </w:t>
+      </w:r>
+    </w:p>
+    <w:p>
+      <w:pPr>
+        <w:jc w:val="center"/>
+      </w:pPr>
+    </w:p>
+    <w:p>
+      <w:pPr>
+        <w:jc w:val="center"/>
+      </w:pPr>
+      <w:r>
+        <w:t>The users were asked the following questions: How familiar they are with the 3D platformer genre, how much they enjoyed the level, whether they believe that 3D platformers are a good example of using procedural generation or if they believe they should be strictly designed by humans</w:t>
+      </w:r>
+      <w:r>
+        <w:t xml:space="preserve">, What they appreciated and detested about the level, and what they wanted to see improved about the level, and if there was anything else they would like to share about the level. </w:t>
+      </w:r>
+    </w:p>
+    <w:p>
+      <w:pPr>
+        <w:jc w:val="center"/>
+      </w:pPr>
+    </w:p>
+    <w:p>
+      <w:pPr>
+        <w:jc w:val="center"/>
+      </w:pPr>
+      <w:r>
+        <w:t>For the familiarity of the 3D platformer genre, this got an average rating of 7.4. The enjoyabiity of the level got an average rating of 5.2</w:t>
+      </w:r>
+    </w:p>
+    <w:p>
+      <w:pPr>
+        <w:jc w:val="center"/>
+      </w:pPr>
+      <w:r>
+        <w:t xml:space="preserve"> </w:t>
       </w:r>
     </w:p>
     <w:p>
       <w:pPr>
         <w:pStyle w:val="Heading1"/>
         <w:jc w:val="center"/>
-        <w:rPr>
-          <w:b w:val="0"/>
-          <w:bCs w:val="0"/>
-        </w:rPr>
-      </w:pPr>
-      <w:r>
+      </w:pPr>
+      <w:r>
+        <w:lastRenderedPageBreak/>
         <w:br w:type="page"/>
       </w:r>
     </w:p>
@@ -2690,6 +2798,7 @@
         <w:pStyle w:val="Heading1"/>
       </w:pPr>
       <w:r>
+        <w:lastRenderedPageBreak/>
         <w:br w:type="page"/>
       </w:r>
     </w:p>
@@ -4594,6 +4703,15 @@
 </file>
 
 <file path=customXml/item1.xml><?xml version="1.0" encoding="utf-8"?>
+<?mso-contentType ?>
+<FormTemplates xmlns="http://schemas.microsoft.com/sharepoint/v3/contenttype/forms">
+  <Display>DocumentLibraryForm</Display>
+  <Edit>DocumentLibraryForm</Edit>
+  <New>DocumentLibraryForm</New>
+</FormTemplates>
+</file>
+
+<file path=customXml/item2.xml><?xml version="1.0" encoding="utf-8"?>
 <ct:contentTypeSchema xmlns:ct="http://schemas.microsoft.com/office/2006/metadata/contentType" xmlns:ma="http://schemas.microsoft.com/office/2006/metadata/properties/metaAttributes" ct:_="" ma:_="" ma:contentTypeName="Document" ma:contentTypeID="0x01010033553FA8616F3A45AD369E275EA42271" ma:contentTypeVersion="11" ma:contentTypeDescription="Create a new document." ma:contentTypeScope="" ma:versionID="8eb4e0804d077bcc139b361cda3a640c">
   <xsd:schema xmlns:xsd="http://www.w3.org/2001/XMLSchema" xmlns:xs="http://www.w3.org/2001/XMLSchema" xmlns:p="http://schemas.microsoft.com/office/2006/metadata/properties" xmlns:ns3="371a10d4-9e19-41a9-948b-d1cca29b4cb6" xmlns:ns4="18dffc30-a361-43f0-bb4a-1f62e819a6f2" targetNamespace="http://schemas.microsoft.com/office/2006/metadata/properties" ma:root="true" ma:fieldsID="ac8e08ff64368403dfb4d2274f8d7465" ns3:_="" ns4:_="">
     <xsd:import namespace="371a10d4-9e19-41a9-948b-d1cca29b4cb6"/>
@@ -4802,26 +4920,25 @@
 </ct:contentTypeSchema>
 </file>
 
-<file path=customXml/item2.xml><?xml version="1.0" encoding="utf-8"?>
-<?mso-contentType ?>
-<FormTemplates xmlns="http://schemas.microsoft.com/sharepoint/v3/contenttype/forms">
-  <Display>DocumentLibraryForm</Display>
-  <Edit>DocumentLibraryForm</Edit>
-  <New>DocumentLibraryForm</New>
-</FormTemplates>
+<file path=customXml/item3.xml><?xml version="1.0" encoding="utf-8"?>
+<b:Sources xmlns:b="http://schemas.openxmlformats.org/officeDocument/2006/bibliography" xmlns="http://schemas.openxmlformats.org/officeDocument/2006/bibliography" SelectedStyle="\APA.XSL" StyleName="APA"/>
 </file>
 
-<file path=customXml/item3.xml><?xml version="1.0" encoding="utf-8"?>
+<file path=customXml/item4.xml><?xml version="1.0" encoding="utf-8"?>
 <p:properties xmlns:p="http://schemas.microsoft.com/office/2006/metadata/properties" xmlns:xsi="http://www.w3.org/2001/XMLSchema-instance" xmlns:pc="http://schemas.microsoft.com/office/infopath/2007/PartnerControls">
   <documentManagement/>
 </p:properties>
 </file>
 
-<file path=customXml/item4.xml><?xml version="1.0" encoding="utf-8"?>
-<b:Sources xmlns:b="http://schemas.openxmlformats.org/officeDocument/2006/bibliography" xmlns="http://schemas.openxmlformats.org/officeDocument/2006/bibliography" SelectedStyle="\APA.XSL" StyleName="APA"/>
+<file path=customXml/itemProps1.xml><?xml version="1.0" encoding="utf-8"?>
+<ds:datastoreItem xmlns:ds="http://schemas.openxmlformats.org/officeDocument/2006/customXml" ds:itemID="{05D9BF79-26A9-4E9A-9793-4E28B04A02DC}">
+  <ds:schemaRefs>
+    <ds:schemaRef ds:uri="http://schemas.microsoft.com/sharepoint/v3/contenttype/forms"/>
+  </ds:schemaRefs>
+</ds:datastoreItem>
 </file>
 
-<file path=customXml/itemProps1.xml><?xml version="1.0" encoding="utf-8"?>
+<file path=customXml/itemProps2.xml><?xml version="1.0" encoding="utf-8"?>
 <ds:datastoreItem xmlns:ds="http://schemas.openxmlformats.org/officeDocument/2006/customXml" ds:itemID="{307A6BE8-0D48-4A7D-A535-369CCDFBF2CB}">
   <ds:schemaRefs>
     <ds:schemaRef ds:uri="http://schemas.microsoft.com/office/2006/metadata/contentType"/>
@@ -4840,27 +4957,19 @@
 </ds:datastoreItem>
 </file>
 
-<file path=customXml/itemProps2.xml><?xml version="1.0" encoding="utf-8"?>
-<ds:datastoreItem xmlns:ds="http://schemas.openxmlformats.org/officeDocument/2006/customXml" ds:itemID="{05D9BF79-26A9-4E9A-9793-4E28B04A02DC}">
+<file path=customXml/itemProps3.xml><?xml version="1.0" encoding="utf-8"?>
+<ds:datastoreItem xmlns:ds="http://schemas.openxmlformats.org/officeDocument/2006/customXml" ds:itemID="{79CEDF70-F74C-4284-98FC-38644A27E791}">
   <ds:schemaRefs>
-    <ds:schemaRef ds:uri="http://schemas.microsoft.com/sharepoint/v3/contenttype/forms"/>
+    <ds:schemaRef ds:uri="http://schemas.openxmlformats.org/officeDocument/2006/bibliography"/>
   </ds:schemaRefs>
 </ds:datastoreItem>
 </file>
 
-<file path=customXml/itemProps3.xml><?xml version="1.0" encoding="utf-8"?>
+<file path=customXml/itemProps4.xml><?xml version="1.0" encoding="utf-8"?>
 <ds:datastoreItem xmlns:ds="http://schemas.openxmlformats.org/officeDocument/2006/customXml" ds:itemID="{10A8F88B-6E38-47A8-8074-155E10D59BDF}">
   <ds:schemaRefs>
     <ds:schemaRef ds:uri="http://schemas.microsoft.com/office/2006/metadata/properties"/>
     <ds:schemaRef ds:uri="http://schemas.microsoft.com/office/infopath/2007/PartnerControls"/>
   </ds:schemaRefs>
 </ds:datastoreItem>
-</file>
-
-<file path=customXml/itemProps4.xml><?xml version="1.0" encoding="utf-8"?>
-<ds:datastoreItem xmlns:ds="http://schemas.openxmlformats.org/officeDocument/2006/customXml" ds:itemID="{79CEDF70-F74C-4284-98FC-38644A27E791}">
-  <ds:schemaRefs>
-    <ds:schemaRef ds:uri="http://schemas.openxmlformats.org/officeDocument/2006/bibliography"/>
-  </ds:schemaRefs>
-</ds:datastoreItem>
 </file>
</xml_diff>

<commit_message>
added: references to dissertation
</commit_message>
<xml_diff>
--- a/Documents/Dissertation w feedback 16th april.docx
+++ b/Documents/Dissertation w feedback 16th april.docx
@@ -2154,7 +2154,6 @@
         <w:pStyle w:val="Heading1"/>
       </w:pPr>
       <w:r>
-        <w:lastRenderedPageBreak/>
         <w:br w:type="page"/>
       </w:r>
     </w:p>
@@ -2684,7 +2683,6 @@
         <w:jc w:val="center"/>
       </w:pPr>
       <w:r>
-        <w:lastRenderedPageBreak/>
         <w:br w:type="page"/>
       </w:r>
     </w:p>
@@ -2773,6 +2771,1806 @@
     </w:p>
     <w:p>
       <w:pPr>
+        <w:pStyle w:val="Bibliography"/>
+      </w:pPr>
+      <w:r>
+        <w:t>References</w:t>
+      </w:r>
+      <w:r>
+        <w:t xml:space="preserve"> List:</w:t>
+      </w:r>
+    </w:p>
+    <w:p>
+      <w:pPr>
+        <w:pStyle w:val="Bibliography"/>
+        <w:ind w:left="405"/>
+        <w:rPr>
+          <w:rFonts w:cs="Arial"/>
+        </w:rPr>
+      </w:pPr>
+      <w:r>
+        <w:rPr>
+          <w:rFonts w:cs="Arial"/>
+          <w:i/>
+          <w:iCs/>
+        </w:rPr>
+        <w:t>3D Leap Land Asset Pack by Essssam</w:t>
+      </w:r>
+      <w:r>
+        <w:rPr>
+          <w:rFonts w:cs="Arial"/>
+        </w:rPr>
+        <w:t xml:space="preserve"> (no date) </w:t>
+      </w:r>
+      <w:r>
+        <w:rPr>
+          <w:rFonts w:cs="Arial"/>
+          <w:i/>
+          <w:iCs/>
+        </w:rPr>
+        <w:t>itch.io</w:t>
+      </w:r>
+      <w:r>
+        <w:rPr>
+          <w:rFonts w:cs="Arial"/>
+        </w:rPr>
+        <w:t>. Available at: https://essssam.itch.io/3d-leap-land (Accessed: 22 April 2026).</w:t>
+      </w:r>
+    </w:p>
+    <w:p>
+      <w:pPr>
+        <w:pStyle w:val="ListParagraph"/>
+        <w:ind w:left="405"/>
+        <w:rPr>
+          <w:rFonts w:ascii="Arial" w:eastAsia="Times New Roman" w:hAnsi="Arial" w:cs="Arial"/>
+          <w:color w:val="000000"/>
+          <w:kern w:val="0"/>
+          <w:lang w:eastAsia="en-GB"/>
+          <w14:ligatures w14:val="none"/>
+        </w:rPr>
+      </w:pPr>
+      <w:r>
+        <w:rPr>
+          <w:rFonts w:ascii="Arial" w:eastAsia="Times New Roman" w:hAnsi="Arial" w:cs="Arial"/>
+          <w:b/>
+          <w:bCs/>
+          <w:color w:val="000000"/>
+          <w:kern w:val="0"/>
+          <w:u w:val="single"/>
+          <w:lang w:eastAsia="en-GB"/>
+          <w14:ligatures w14:val="none"/>
+        </w:rPr>
+        <w:t>‌</w:t>
+      </w:r>
+    </w:p>
+    <w:p>
+      <w:pPr>
+        <w:pStyle w:val="ListParagraph"/>
+        <w:spacing w:after="0" w:line="240" w:lineRule="auto"/>
+        <w:ind w:left="405"/>
+        <w:rPr>
+          <w:rFonts w:ascii="Arial" w:eastAsia="Times New Roman" w:hAnsi="Arial" w:cs="Arial"/>
+          <w:color w:val="000000"/>
+          <w:kern w:val="0"/>
+          <w:lang w:eastAsia="en-GB"/>
+          <w14:ligatures w14:val="none"/>
+        </w:rPr>
+      </w:pPr>
+      <w:r>
+        <w:rPr>
+          <w:rFonts w:ascii="Arial" w:eastAsia="Times New Roman" w:hAnsi="Arial" w:cs="Arial"/>
+          <w:color w:val="000000"/>
+          <w:kern w:val="0"/>
+          <w:lang w:eastAsia="en-GB"/>
+          <w14:ligatures w14:val="none"/>
+        </w:rPr>
+        <w:t xml:space="preserve">A.I. Design (1980) </w:t>
+      </w:r>
+      <w:r>
+        <w:rPr>
+          <w:rFonts w:ascii="Arial" w:eastAsia="Times New Roman" w:hAnsi="Arial" w:cs="Arial"/>
+          <w:i/>
+          <w:iCs/>
+          <w:color w:val="000000"/>
+          <w:kern w:val="0"/>
+          <w:lang w:eastAsia="en-GB"/>
+          <w14:ligatures w14:val="none"/>
+        </w:rPr>
+        <w:t>Rogue</w:t>
+      </w:r>
+      <w:r>
+        <w:rPr>
+          <w:rFonts w:ascii="Arial" w:eastAsia="Times New Roman" w:hAnsi="Arial" w:cs="Arial"/>
+          <w:color w:val="000000"/>
+          <w:kern w:val="0"/>
+          <w:lang w:eastAsia="en-GB"/>
+          <w14:ligatures w14:val="none"/>
+        </w:rPr>
+        <w:t xml:space="preserve"> [Video Game]. Mastertronic.</w:t>
+      </w:r>
+    </w:p>
+    <w:p>
+      <w:pPr>
+        <w:pStyle w:val="ListParagraph"/>
+        <w:spacing w:after="0" w:line="240" w:lineRule="auto"/>
+        <w:ind w:left="405"/>
+        <w:rPr>
+          <w:rFonts w:ascii="Arial" w:eastAsia="Times New Roman" w:hAnsi="Arial" w:cs="Arial"/>
+          <w:kern w:val="0"/>
+          <w:lang w:eastAsia="en-GB"/>
+          <w14:ligatures w14:val="none"/>
+        </w:rPr>
+      </w:pPr>
+    </w:p>
+    <w:p>
+      <w:pPr>
+        <w:pStyle w:val="ListParagraph"/>
+        <w:ind w:left="405"/>
+        <w:rPr>
+          <w:rFonts w:ascii="Arial" w:eastAsia="Times New Roman" w:hAnsi="Arial" w:cs="Arial"/>
+          <w:color w:val="000000"/>
+          <w:kern w:val="0"/>
+          <w:lang w:eastAsia="en-GB"/>
+          <w14:ligatures w14:val="none"/>
+        </w:rPr>
+      </w:pPr>
+      <w:r>
+        <w:rPr>
+          <w:rFonts w:ascii="Arial" w:eastAsia="Times New Roman" w:hAnsi="Arial" w:cs="Arial"/>
+          <w:color w:val="000000"/>
+          <w:kern w:val="0"/>
+          <w:lang w:eastAsia="en-GB"/>
+          <w14:ligatures w14:val="none"/>
+        </w:rPr>
+        <w:t>Biemer, C.F. and Cooper, S. (2022) ‘On Linking Level Segments’, </w:t>
+      </w:r>
+      <w:r>
+        <w:rPr>
+          <w:rFonts w:ascii="Arial" w:eastAsia="Times New Roman" w:hAnsi="Arial" w:cs="Arial"/>
+          <w:i/>
+          <w:iCs/>
+          <w:color w:val="000000"/>
+          <w:kern w:val="0"/>
+          <w:lang w:eastAsia="en-GB"/>
+          <w14:ligatures w14:val="none"/>
+        </w:rPr>
+        <w:t>2022 IEEE Conference on Games (CoG)</w:t>
+      </w:r>
+      <w:r>
+        <w:rPr>
+          <w:rFonts w:ascii="Arial" w:eastAsia="Times New Roman" w:hAnsi="Arial" w:cs="Arial"/>
+          <w:color w:val="000000"/>
+          <w:kern w:val="0"/>
+          <w:lang w:eastAsia="en-GB"/>
+          <w14:ligatures w14:val="none"/>
+        </w:rPr>
+        <w:t xml:space="preserve">, pp. 199–205. Available at: </w:t>
+      </w:r>
+      <w:hyperlink r:id="rId21" w:history="1">
+        <w:r>
+          <w:rPr>
+            <w:rStyle w:val="Hyperlink"/>
+            <w:rFonts w:ascii="Arial" w:eastAsia="Times New Roman" w:hAnsi="Arial" w:cs="Arial"/>
+            <w:kern w:val="0"/>
+            <w:lang w:eastAsia="en-GB"/>
+            <w14:ligatures w14:val="none"/>
+          </w:rPr>
+          <w:t>https://doi.org/10.1109/CoG51982.2022.9893705</w:t>
+        </w:r>
+      </w:hyperlink>
+      <w:r>
+        <w:rPr>
+          <w:rFonts w:ascii="Arial" w:eastAsia="Times New Roman" w:hAnsi="Arial" w:cs="Arial"/>
+          <w:color w:val="000000"/>
+          <w:kern w:val="0"/>
+          <w:lang w:eastAsia="en-GB"/>
+          <w14:ligatures w14:val="none"/>
+        </w:rPr>
+        <w:t>.</w:t>
+      </w:r>
+    </w:p>
+    <w:p>
+      <w:pPr>
+        <w:pStyle w:val="ListParagraph"/>
+        <w:ind w:left="405"/>
+        <w:rPr>
+          <w:rFonts w:ascii="Arial" w:eastAsia="Times New Roman" w:hAnsi="Arial" w:cs="Arial"/>
+          <w:color w:val="000000"/>
+          <w:kern w:val="0"/>
+          <w:lang w:eastAsia="en-GB"/>
+          <w14:ligatures w14:val="none"/>
+        </w:rPr>
+      </w:pPr>
+    </w:p>
+    <w:p>
+      <w:pPr>
+        <w:pStyle w:val="ListParagraph"/>
+        <w:ind w:left="405"/>
+        <w:rPr>
+          <w:rFonts w:ascii="Arial" w:eastAsia="Times New Roman" w:hAnsi="Arial" w:cs="Arial"/>
+          <w:color w:val="000000"/>
+          <w:kern w:val="0"/>
+          <w:lang w:eastAsia="en-GB"/>
+          <w14:ligatures w14:val="none"/>
+        </w:rPr>
+      </w:pPr>
+      <w:r>
+        <w:rPr>
+          <w:rFonts w:ascii="Arial" w:eastAsia="Times New Roman" w:hAnsi="Arial" w:cs="Arial"/>
+          <w:color w:val="000000"/>
+          <w:kern w:val="0"/>
+          <w:lang w:eastAsia="en-GB"/>
+          <w14:ligatures w14:val="none"/>
+        </w:rPr>
+        <w:t>Bramwell (2023) </w:t>
+      </w:r>
+      <w:r>
+        <w:rPr>
+          <w:rFonts w:ascii="Arial" w:eastAsia="Times New Roman" w:hAnsi="Arial" w:cs="Arial"/>
+          <w:i/>
+          <w:iCs/>
+          <w:color w:val="000000"/>
+          <w:kern w:val="0"/>
+          <w:lang w:eastAsia="en-GB"/>
+          <w14:ligatures w14:val="none"/>
+        </w:rPr>
+        <w:t>Make your first 3D Platformer in Godot 4: Setup, Movement, and Camera Controls</w:t>
+      </w:r>
+      <w:r>
+        <w:rPr>
+          <w:rFonts w:ascii="Arial" w:eastAsia="Times New Roman" w:hAnsi="Arial" w:cs="Arial"/>
+          <w:color w:val="000000"/>
+          <w:kern w:val="0"/>
+          <w:lang w:eastAsia="en-GB"/>
+          <w14:ligatures w14:val="none"/>
+        </w:rPr>
+        <w:t>, </w:t>
+      </w:r>
+      <w:r>
+        <w:rPr>
+          <w:rFonts w:ascii="Arial" w:eastAsia="Times New Roman" w:hAnsi="Arial" w:cs="Arial"/>
+          <w:i/>
+          <w:iCs/>
+          <w:color w:val="000000"/>
+          <w:kern w:val="0"/>
+          <w:lang w:eastAsia="en-GB"/>
+          <w14:ligatures w14:val="none"/>
+        </w:rPr>
+        <w:t>YouTube</w:t>
+      </w:r>
+      <w:r>
+        <w:rPr>
+          <w:rFonts w:ascii="Arial" w:eastAsia="Times New Roman" w:hAnsi="Arial" w:cs="Arial"/>
+          <w:color w:val="000000"/>
+          <w:kern w:val="0"/>
+          <w:lang w:eastAsia="en-GB"/>
+          <w14:ligatures w14:val="none"/>
+        </w:rPr>
+        <w:t>. Available at: https://www.youtube.com/watch?v=sVsn9NqpVhg (Accessed: 5 November 2025). </w:t>
+      </w:r>
+    </w:p>
+    <w:p>
+      <w:pPr>
+        <w:pStyle w:val="Bibliography"/>
+        <w:ind w:left="405"/>
+        <w:rPr>
+          <w:rFonts w:cs="Arial"/>
+        </w:rPr>
+      </w:pPr>
+      <w:r>
+        <w:rPr>
+          <w:rFonts w:cs="Arial"/>
+          <w:i/>
+          <w:iCs/>
+        </w:rPr>
+        <w:t>Checkpoint - Download Free 3D model by tiunov.se</w:t>
+      </w:r>
+      <w:r>
+        <w:rPr>
+          <w:rFonts w:cs="Arial"/>
+        </w:rPr>
+        <w:t xml:space="preserve"> (2023). Available at:</w:t>
+      </w:r>
+    </w:p>
+    <w:p>
+      <w:pPr>
+        <w:pStyle w:val="Bibliography"/>
+        <w:ind w:left="405"/>
+        <w:rPr>
+          <w:rFonts w:cs="Arial"/>
+        </w:rPr>
+      </w:pPr>
+      <w:r>
+        <w:rPr>
+          <w:rFonts w:cs="Arial"/>
+        </w:rPr>
+        <w:t>https://sketchfab.com/models/cdeb04f317854d54b23574caeb7845d5/embed?autostart=1 (Accessed: 22 April 2026).</w:t>
+      </w:r>
+    </w:p>
+    <w:p>
+      <w:pPr>
+        <w:pStyle w:val="ListParagraph"/>
+        <w:spacing w:after="0" w:line="240" w:lineRule="auto"/>
+        <w:ind w:left="405"/>
+        <w:rPr>
+          <w:rFonts w:ascii="Arial" w:eastAsia="Times New Roman" w:hAnsi="Arial" w:cs="Arial"/>
+          <w:color w:val="000000"/>
+          <w:kern w:val="0"/>
+          <w:lang w:eastAsia="en-GB"/>
+          <w14:ligatures w14:val="none"/>
+        </w:rPr>
+      </w:pPr>
+      <w:r>
+        <w:rPr>
+          <w:rFonts w:ascii="Arial" w:eastAsia="Times New Roman" w:hAnsi="Arial" w:cs="Arial"/>
+          <w:color w:val="000000"/>
+          <w:kern w:val="0"/>
+          <w:lang w:eastAsia="en-GB"/>
+          <w14:ligatures w14:val="none"/>
+        </w:rPr>
+        <w:t>CodingWithRus (2020) </w:t>
+      </w:r>
+      <w:r>
+        <w:rPr>
+          <w:rFonts w:ascii="Arial" w:eastAsia="Times New Roman" w:hAnsi="Arial" w:cs="Arial"/>
+          <w:i/>
+          <w:iCs/>
+          <w:color w:val="000000"/>
+          <w:kern w:val="0"/>
+          <w:lang w:eastAsia="en-GB"/>
+          <w14:ligatures w14:val="none"/>
+        </w:rPr>
+        <w:t>Procedural Placement : Beginners Guide EP 3 - Unity3D</w:t>
+      </w:r>
+      <w:r>
+        <w:rPr>
+          <w:rFonts w:ascii="Arial" w:eastAsia="Times New Roman" w:hAnsi="Arial" w:cs="Arial"/>
+          <w:color w:val="000000"/>
+          <w:kern w:val="0"/>
+          <w:lang w:eastAsia="en-GB"/>
+          <w14:ligatures w14:val="none"/>
+        </w:rPr>
+        <w:t xml:space="preserve">, </w:t>
+      </w:r>
+      <w:r>
+        <w:rPr>
+          <w:rFonts w:ascii="Arial" w:eastAsia="Times New Roman" w:hAnsi="Arial" w:cs="Arial"/>
+          <w:i/>
+          <w:iCs/>
+          <w:color w:val="000000"/>
+          <w:kern w:val="0"/>
+          <w:lang w:eastAsia="en-GB"/>
+          <w14:ligatures w14:val="none"/>
+        </w:rPr>
+        <w:t>YouTube</w:t>
+      </w:r>
+      <w:r>
+        <w:rPr>
+          <w:rFonts w:ascii="Arial" w:eastAsia="Times New Roman" w:hAnsi="Arial" w:cs="Arial"/>
+          <w:color w:val="000000"/>
+          <w:kern w:val="0"/>
+          <w:lang w:eastAsia="en-GB"/>
+          <w14:ligatures w14:val="none"/>
+        </w:rPr>
+        <w:t xml:space="preserve">. Available at: </w:t>
+      </w:r>
+      <w:r>
+        <w:rPr>
+          <w:rFonts w:ascii="Arial" w:eastAsia="Times New Roman" w:hAnsi="Arial" w:cs="Arial"/>
+          <w:color w:val="1155CC"/>
+          <w:kern w:val="0"/>
+          <w:u w:val="single"/>
+          <w:lang w:eastAsia="en-GB"/>
+          <w14:ligatures w14:val="none"/>
+        </w:rPr>
+        <w:t>https://www.youtube.com/watch?v=vfl2HyEar68</w:t>
+      </w:r>
+      <w:r>
+        <w:rPr>
+          <w:rFonts w:ascii="Arial" w:eastAsia="Times New Roman" w:hAnsi="Arial" w:cs="Arial"/>
+          <w:color w:val="000000"/>
+          <w:kern w:val="0"/>
+          <w:lang w:eastAsia="en-GB"/>
+          <w14:ligatures w14:val="none"/>
+        </w:rPr>
+        <w:t> (Accessed: 13 October 2025).</w:t>
+      </w:r>
+    </w:p>
+    <w:p>
+      <w:pPr>
+        <w:pStyle w:val="ListParagraph"/>
+        <w:spacing w:after="0" w:line="240" w:lineRule="auto"/>
+        <w:ind w:left="405"/>
+        <w:rPr>
+          <w:rFonts w:ascii="Arial" w:eastAsia="Times New Roman" w:hAnsi="Arial" w:cs="Arial"/>
+          <w:color w:val="000000"/>
+          <w:kern w:val="0"/>
+          <w:lang w:eastAsia="en-GB"/>
+          <w14:ligatures w14:val="none"/>
+        </w:rPr>
+      </w:pPr>
+    </w:p>
+    <w:p>
+      <w:pPr>
+        <w:pStyle w:val="ListParagraph"/>
+        <w:spacing w:after="0" w:line="240" w:lineRule="auto"/>
+        <w:ind w:left="405"/>
+        <w:rPr>
+          <w:rFonts w:ascii="Arial" w:eastAsia="Times New Roman" w:hAnsi="Arial" w:cs="Arial"/>
+          <w:color w:val="000000"/>
+          <w:kern w:val="0"/>
+          <w:lang w:eastAsia="en-GB"/>
+          <w14:ligatures w14:val="none"/>
+        </w:rPr>
+      </w:pPr>
+      <w:r>
+        <w:rPr>
+          <w:rFonts w:ascii="Arial" w:eastAsia="Times New Roman" w:hAnsi="Arial" w:cs="Arial"/>
+          <w:color w:val="000000"/>
+          <w:kern w:val="0"/>
+          <w:lang w:eastAsia="en-GB"/>
+          <w14:ligatures w14:val="none"/>
+        </w:rPr>
+        <w:t>Compton, K. and Mateas, M. (2021) ‘Procedural Level Design for Platform Games’, </w:t>
+      </w:r>
+      <w:r>
+        <w:rPr>
+          <w:rFonts w:ascii="Arial" w:eastAsia="Times New Roman" w:hAnsi="Arial" w:cs="Arial"/>
+          <w:i/>
+          <w:iCs/>
+          <w:color w:val="000000"/>
+          <w:kern w:val="0"/>
+          <w:lang w:eastAsia="en-GB"/>
+          <w14:ligatures w14:val="none"/>
+        </w:rPr>
+        <w:t>Proceedings of the AAAI Conference on Artificial Intelligence and Interactive Digital Entertainment</w:t>
+      </w:r>
+      <w:r>
+        <w:rPr>
+          <w:rFonts w:ascii="Arial" w:eastAsia="Times New Roman" w:hAnsi="Arial" w:cs="Arial"/>
+          <w:color w:val="000000"/>
+          <w:kern w:val="0"/>
+          <w:lang w:eastAsia="en-GB"/>
+          <w14:ligatures w14:val="none"/>
+        </w:rPr>
+        <w:t xml:space="preserve">, 2(1), pp. 109-111. Available at: </w:t>
+      </w:r>
+      <w:hyperlink r:id="rId22" w:history="1">
+        <w:r>
+          <w:rPr>
+            <w:rStyle w:val="Hyperlink"/>
+            <w:rFonts w:ascii="Arial" w:eastAsia="Times New Roman" w:hAnsi="Arial" w:cs="Arial"/>
+            <w:kern w:val="0"/>
+            <w:lang w:eastAsia="en-GB"/>
+            <w14:ligatures w14:val="none"/>
+          </w:rPr>
+          <w:t>https://doi.org/10.1609/aiide.v2i1.18755</w:t>
+        </w:r>
+      </w:hyperlink>
+      <w:r>
+        <w:rPr>
+          <w:rFonts w:ascii="Arial" w:eastAsia="Times New Roman" w:hAnsi="Arial" w:cs="Arial"/>
+          <w:color w:val="000000"/>
+          <w:kern w:val="0"/>
+          <w:lang w:eastAsia="en-GB"/>
+          <w14:ligatures w14:val="none"/>
+        </w:rPr>
+        <w:t>.</w:t>
+      </w:r>
+    </w:p>
+    <w:p>
+      <w:pPr>
+        <w:pStyle w:val="ListParagraph"/>
+        <w:spacing w:after="0" w:line="240" w:lineRule="auto"/>
+        <w:ind w:left="405"/>
+        <w:rPr>
+          <w:rFonts w:ascii="Arial" w:eastAsia="Times New Roman" w:hAnsi="Arial" w:cs="Arial"/>
+          <w:color w:val="000000"/>
+          <w:kern w:val="0"/>
+          <w:lang w:eastAsia="en-GB"/>
+          <w14:ligatures w14:val="none"/>
+        </w:rPr>
+      </w:pPr>
+    </w:p>
+    <w:p>
+      <w:pPr>
+        <w:pStyle w:val="Bibliography"/>
+        <w:ind w:left="405"/>
+        <w:rPr>
+          <w:rFonts w:cs="Arial"/>
+        </w:rPr>
+      </w:pPr>
+      <w:r>
+        <w:rPr>
+          <w:rFonts w:cs="Arial"/>
+          <w:i/>
+          <w:iCs/>
+        </w:rPr>
+        <w:t>Coyote Time :: Godot 4 Recipes</w:t>
+      </w:r>
+      <w:r>
+        <w:rPr>
+          <w:rFonts w:cs="Arial"/>
+        </w:rPr>
+        <w:t xml:space="preserve"> (no date). Available at: https://kidscancode.org/godot_recipes/4.x/2d/coyote_time/index.html (Accessed: 22 April 2026).</w:t>
+      </w:r>
+    </w:p>
+    <w:p>
+      <w:pPr>
+        <w:pStyle w:val="Bibliography"/>
+        <w:ind w:left="405"/>
+        <w:rPr>
+          <w:rFonts w:cs="Arial"/>
+        </w:rPr>
+      </w:pPr>
+      <w:r>
+        <w:rPr>
+          <w:rFonts w:cs="Arial"/>
+        </w:rPr>
+        <w:t xml:space="preserve">Felipe Greboge (2023) </w:t>
+      </w:r>
+      <w:r>
+        <w:rPr>
+          <w:rFonts w:cs="Arial"/>
+          <w:i/>
+          <w:iCs/>
+        </w:rPr>
+        <w:t>Export Assets From Blender To Godot (Tutorial)</w:t>
+      </w:r>
+      <w:r>
+        <w:rPr>
+          <w:rFonts w:cs="Arial"/>
+        </w:rPr>
+        <w:t>. Available at: https://www.youtube.com/watch?v=cYfhe5MWqWE (Accessed: 22 April 2026).</w:t>
+      </w:r>
+    </w:p>
+    <w:p>
+      <w:pPr>
+        <w:pStyle w:val="ListParagraph"/>
+        <w:ind w:left="405"/>
+        <w:rPr>
+          <w:rFonts w:ascii="Arial" w:hAnsi="Arial" w:cs="Arial"/>
+        </w:rPr>
+      </w:pPr>
+      <w:r>
+        <w:rPr>
+          <w:rFonts w:ascii="Arial" w:hAnsi="Arial" w:cs="Arial"/>
+        </w:rPr>
+        <w:t xml:space="preserve">Game Design with Reilly (2021) </w:t>
+      </w:r>
+      <w:r>
+        <w:rPr>
+          <w:rFonts w:ascii="Arial" w:hAnsi="Arial" w:cs="Arial"/>
+          <w:i/>
+          <w:iCs/>
+        </w:rPr>
+        <w:t>7.Godot 3D Platformer:Gravity and respawns</w:t>
+      </w:r>
+      <w:r>
+        <w:rPr>
+          <w:rFonts w:ascii="Arial" w:hAnsi="Arial" w:cs="Arial"/>
+        </w:rPr>
+        <w:t>. Available at: https://www.youtube.com/watch?v=G2FSNiLtohk (Accessed: 22 April 2026).</w:t>
+      </w:r>
+      <w:r>
+        <w:rPr>
+          <w:rFonts w:ascii="Arial" w:hAnsi="Arial" w:cs="Arial"/>
+        </w:rPr>
+        <w:tab/>
+      </w:r>
+    </w:p>
+    <w:p>
+      <w:pPr>
+        <w:pStyle w:val="ListParagraph"/>
+        <w:ind w:left="405"/>
+        <w:rPr>
+          <w:rFonts w:ascii="Arial" w:hAnsi="Arial" w:cs="Arial"/>
+        </w:rPr>
+      </w:pPr>
+    </w:p>
+    <w:p>
+      <w:pPr>
+        <w:pStyle w:val="ListParagraph"/>
+        <w:ind w:left="405"/>
+        <w:rPr>
+          <w:rFonts w:ascii="Arial" w:eastAsia="Times New Roman" w:hAnsi="Arial" w:cs="Arial"/>
+          <w:color w:val="000000"/>
+          <w:kern w:val="0"/>
+          <w:lang w:eastAsia="en-GB"/>
+          <w14:ligatures w14:val="none"/>
+        </w:rPr>
+      </w:pPr>
+      <w:r>
+        <w:rPr>
+          <w:rFonts w:ascii="Arial" w:eastAsia="Times New Roman" w:hAnsi="Arial" w:cs="Arial"/>
+          <w:color w:val="000000"/>
+          <w:kern w:val="0"/>
+          <w:lang w:eastAsia="en-GB"/>
+          <w14:ligatures w14:val="none"/>
+        </w:rPr>
+        <w:lastRenderedPageBreak/>
+        <w:t>Gao, T., Zhang, J. and Mi, Q. (2022) ‘Procedural Generation of Game Levels and Maps: A Review’, </w:t>
+      </w:r>
+      <w:r>
+        <w:rPr>
+          <w:rFonts w:ascii="Arial" w:eastAsia="Times New Roman" w:hAnsi="Arial" w:cs="Arial"/>
+          <w:i/>
+          <w:iCs/>
+          <w:color w:val="000000"/>
+          <w:kern w:val="0"/>
+          <w:lang w:eastAsia="en-GB"/>
+          <w14:ligatures w14:val="none"/>
+        </w:rPr>
+        <w:t>2022 International Conference on Artificial Intelligence in Information and Communication (ICAIIC)</w:t>
+      </w:r>
+      <w:r>
+        <w:rPr>
+          <w:rFonts w:ascii="Arial" w:eastAsia="Times New Roman" w:hAnsi="Arial" w:cs="Arial"/>
+          <w:color w:val="000000"/>
+          <w:kern w:val="0"/>
+          <w:lang w:eastAsia="en-GB"/>
+          <w14:ligatures w14:val="none"/>
+        </w:rPr>
+        <w:t xml:space="preserve">, pp. 50–55. Available at: </w:t>
+      </w:r>
+      <w:r>
+        <w:rPr>
+          <w:rFonts w:ascii="Arial" w:eastAsia="Times New Roman" w:hAnsi="Arial" w:cs="Arial"/>
+          <w:kern w:val="0"/>
+          <w:lang w:eastAsia="en-GB"/>
+          <w14:ligatures w14:val="none"/>
+        </w:rPr>
+        <w:t>https://doi.org/10.1109/ICAIIC54071.2022.9722624</w:t>
+      </w:r>
+      <w:r>
+        <w:rPr>
+          <w:rFonts w:ascii="Arial" w:eastAsia="Times New Roman" w:hAnsi="Arial" w:cs="Arial"/>
+          <w:color w:val="000000"/>
+          <w:kern w:val="0"/>
+          <w:lang w:eastAsia="en-GB"/>
+          <w14:ligatures w14:val="none"/>
+        </w:rPr>
+        <w:t>.</w:t>
+      </w:r>
+    </w:p>
+    <w:p>
+      <w:pPr>
+        <w:pStyle w:val="Bibliography"/>
+        <w:ind w:left="405"/>
+        <w:rPr>
+          <w:rFonts w:cs="Arial"/>
+        </w:rPr>
+      </w:pPr>
+      <w:r>
+        <w:rPr>
+          <w:rFonts w:cs="Arial"/>
+        </w:rPr>
+        <w:t xml:space="preserve">GDQuest (2024) </w:t>
+      </w:r>
+      <w:r>
+        <w:rPr>
+          <w:rFonts w:cs="Arial"/>
+          <w:i/>
+          <w:iCs/>
+        </w:rPr>
+        <w:t>3D TUTORIAL: Make a Smooth 3D Character Controller in Godot 4</w:t>
+      </w:r>
+      <w:r>
+        <w:rPr>
+          <w:rFonts w:cs="Arial"/>
+        </w:rPr>
+        <w:t xml:space="preserve">, </w:t>
+      </w:r>
+      <w:r>
+        <w:rPr>
+          <w:rFonts w:cs="Arial"/>
+          <w:i/>
+          <w:iCs/>
+          <w:color w:val="000000"/>
+          <w:lang w:eastAsia="en-GB"/>
+        </w:rPr>
+        <w:t>YouTube</w:t>
+      </w:r>
+      <w:r>
+        <w:rPr>
+          <w:rFonts w:cs="Arial"/>
+          <w:color w:val="000000"/>
+          <w:lang w:eastAsia="en-GB"/>
+        </w:rPr>
+        <w:t>.</w:t>
+      </w:r>
+      <w:r>
+        <w:rPr>
+          <w:rFonts w:cs="Arial"/>
+        </w:rPr>
+        <w:t xml:space="preserve"> Available at: https://www.youtube.com/watch?v=JlgZtOFMdfc (Accessed: 6 November 2025).</w:t>
+      </w:r>
+    </w:p>
+    <w:p>
+      <w:pPr>
+        <w:pStyle w:val="ListParagraph"/>
+        <w:ind w:left="405"/>
+        <w:rPr>
+          <w:rFonts w:ascii="Arial" w:eastAsia="Times New Roman" w:hAnsi="Arial" w:cs="Arial"/>
+          <w:color w:val="000000"/>
+          <w:kern w:val="0"/>
+          <w:lang w:eastAsia="en-GB"/>
+          <w14:ligatures w14:val="none"/>
+        </w:rPr>
+      </w:pPr>
+      <w:r>
+        <w:rPr>
+          <w:rFonts w:ascii="Arial" w:eastAsia="Times New Roman" w:hAnsi="Arial" w:cs="Arial"/>
+          <w:color w:val="000000"/>
+          <w:kern w:val="0"/>
+          <w:lang w:eastAsia="en-GB"/>
+          <w14:ligatures w14:val="none"/>
+        </w:rPr>
+        <w:t>GDQuest (2023) </w:t>
+      </w:r>
+      <w:r>
+        <w:rPr>
+          <w:rFonts w:ascii="Arial" w:eastAsia="Times New Roman" w:hAnsi="Arial" w:cs="Arial"/>
+          <w:i/>
+          <w:iCs/>
+          <w:color w:val="000000"/>
+          <w:kern w:val="0"/>
+          <w:lang w:eastAsia="en-GB"/>
+          <w14:ligatures w14:val="none"/>
+        </w:rPr>
+        <w:t>Get Realistic Lighting in Godot 4 with SDFGI: New Global Illumination</w:t>
+      </w:r>
+      <w:r>
+        <w:rPr>
+          <w:rFonts w:ascii="Arial" w:eastAsia="Times New Roman" w:hAnsi="Arial" w:cs="Arial"/>
+          <w:color w:val="000000"/>
+          <w:kern w:val="0"/>
+          <w:lang w:eastAsia="en-GB"/>
+          <w14:ligatures w14:val="none"/>
+        </w:rPr>
+        <w:t>, </w:t>
+      </w:r>
+      <w:r>
+        <w:rPr>
+          <w:rFonts w:ascii="Arial" w:eastAsia="Times New Roman" w:hAnsi="Arial" w:cs="Arial"/>
+          <w:i/>
+          <w:iCs/>
+          <w:color w:val="000000"/>
+          <w:kern w:val="0"/>
+          <w:lang w:eastAsia="en-GB"/>
+          <w14:ligatures w14:val="none"/>
+        </w:rPr>
+        <w:t>YouTube</w:t>
+      </w:r>
+      <w:r>
+        <w:rPr>
+          <w:rFonts w:ascii="Arial" w:eastAsia="Times New Roman" w:hAnsi="Arial" w:cs="Arial"/>
+          <w:color w:val="000000"/>
+          <w:kern w:val="0"/>
+          <w:lang w:eastAsia="en-GB"/>
+          <w14:ligatures w14:val="none"/>
+        </w:rPr>
+        <w:t>. Available at: https://www.youtube.com/watch?v=oehdIc8NGXE (Accessed: 23 November 2025). </w:t>
+      </w:r>
+    </w:p>
+    <w:p>
+      <w:pPr>
+        <w:pStyle w:val="ListParagraph"/>
+        <w:ind w:left="405"/>
+        <w:rPr>
+          <w:rFonts w:ascii="Arial" w:eastAsia="Times New Roman" w:hAnsi="Arial" w:cs="Arial"/>
+          <w:color w:val="000000"/>
+          <w:kern w:val="0"/>
+          <w:lang w:eastAsia="en-GB"/>
+          <w14:ligatures w14:val="none"/>
+        </w:rPr>
+      </w:pPr>
+    </w:p>
+    <w:p>
+      <w:pPr>
+        <w:pStyle w:val="ListParagraph"/>
+        <w:ind w:left="405"/>
+        <w:rPr>
+          <w:rFonts w:ascii="Arial" w:eastAsia="Times New Roman" w:hAnsi="Arial" w:cs="Arial"/>
+          <w:color w:val="000000"/>
+          <w:kern w:val="0"/>
+          <w:lang w:eastAsia="en-GB"/>
+          <w14:ligatures w14:val="none"/>
+        </w:rPr>
+      </w:pPr>
+      <w:r>
+        <w:rPr>
+          <w:rFonts w:ascii="Arial" w:eastAsia="Times New Roman" w:hAnsi="Arial" w:cs="Arial"/>
+          <w:color w:val="000000"/>
+          <w:kern w:val="0"/>
+          <w:lang w:eastAsia="en-GB"/>
+          <w14:ligatures w14:val="none"/>
+        </w:rPr>
+        <w:t>Green, M.C. </w:t>
+      </w:r>
+      <w:r>
+        <w:rPr>
+          <w:rFonts w:ascii="Arial" w:eastAsia="Times New Roman" w:hAnsi="Arial" w:cs="Arial"/>
+          <w:i/>
+          <w:iCs/>
+          <w:color w:val="000000"/>
+          <w:kern w:val="0"/>
+          <w:lang w:eastAsia="en-GB"/>
+          <w14:ligatures w14:val="none"/>
+        </w:rPr>
+        <w:t>et al.</w:t>
+      </w:r>
+      <w:r>
+        <w:rPr>
+          <w:rFonts w:ascii="Arial" w:eastAsia="Times New Roman" w:hAnsi="Arial" w:cs="Arial"/>
+          <w:color w:val="000000"/>
+          <w:kern w:val="0"/>
+          <w:lang w:eastAsia="en-GB"/>
+          <w14:ligatures w14:val="none"/>
+        </w:rPr>
+        <w:t> (2019) ‘Two-step constructive approaches for dungeon generation’, </w:t>
+      </w:r>
+      <w:r>
+        <w:rPr>
+          <w:rFonts w:ascii="Arial" w:eastAsia="Times New Roman" w:hAnsi="Arial" w:cs="Arial"/>
+          <w:i/>
+          <w:iCs/>
+          <w:color w:val="000000"/>
+          <w:kern w:val="0"/>
+          <w:lang w:eastAsia="en-GB"/>
+          <w14:ligatures w14:val="none"/>
+        </w:rPr>
+        <w:t>FDG ’19: Proceedings of the 14th International Conference on the Foundations of Digital Games</w:t>
+      </w:r>
+      <w:r>
+        <w:rPr>
+          <w:rFonts w:ascii="Arial" w:eastAsia="Times New Roman" w:hAnsi="Arial" w:cs="Arial"/>
+          <w:color w:val="000000"/>
+          <w:kern w:val="0"/>
+          <w:lang w:eastAsia="en-GB"/>
+          <w14:ligatures w14:val="none"/>
+        </w:rPr>
+        <w:t xml:space="preserve">, pp. 1–7. Available at: </w:t>
+      </w:r>
+      <w:r>
+        <w:rPr>
+          <w:rFonts w:ascii="Arial" w:eastAsia="Times New Roman" w:hAnsi="Arial" w:cs="Arial"/>
+          <w:kern w:val="0"/>
+          <w:lang w:eastAsia="en-GB"/>
+          <w14:ligatures w14:val="none"/>
+        </w:rPr>
+        <w:t>https://doi.org/10.1145/3337722.3341847</w:t>
+      </w:r>
+      <w:r>
+        <w:rPr>
+          <w:rFonts w:ascii="Arial" w:eastAsia="Times New Roman" w:hAnsi="Arial" w:cs="Arial"/>
+          <w:color w:val="000000"/>
+          <w:kern w:val="0"/>
+          <w:lang w:eastAsia="en-GB"/>
+          <w14:ligatures w14:val="none"/>
+        </w:rPr>
+        <w:t>.</w:t>
+      </w:r>
+    </w:p>
+    <w:p>
+      <w:pPr>
+        <w:pStyle w:val="Bibliography"/>
+        <w:ind w:left="405"/>
+        <w:rPr>
+          <w:rFonts w:cs="Arial"/>
+        </w:rPr>
+      </w:pPr>
+      <w:r>
+        <w:rPr>
+          <w:rFonts w:cs="Arial"/>
+          <w:i/>
+          <w:iCs/>
+        </w:rPr>
+        <w:t>How does the Time Bonus work?</w:t>
+      </w:r>
+      <w:r>
+        <w:rPr>
+          <w:rFonts w:cs="Arial"/>
+        </w:rPr>
+        <w:t xml:space="preserve"> (no date) </w:t>
+      </w:r>
+      <w:r>
+        <w:rPr>
+          <w:rFonts w:cs="Arial"/>
+          <w:i/>
+          <w:iCs/>
+        </w:rPr>
+        <w:t>Solitaire Cash</w:t>
+      </w:r>
+      <w:r>
+        <w:rPr>
+          <w:rFonts w:cs="Arial"/>
+        </w:rPr>
+        <w:t>. Available at: https://support.solitairecash.com/hc/en-us/articles/360017046818-How-does-the-Time-Bonus-work (Accessed: 22 April 2026).</w:t>
+      </w:r>
+    </w:p>
+    <w:p>
+      <w:pPr>
+        <w:pStyle w:val="Bibliography"/>
+        <w:ind w:left="405"/>
+        <w:rPr>
+          <w:rFonts w:cs="Arial"/>
+        </w:rPr>
+      </w:pPr>
+      <w:r>
+        <w:rPr>
+          <w:rFonts w:cs="Arial"/>
+          <w:i/>
+          <w:iCs/>
+        </w:rPr>
+        <w:t>JSON</w:t>
+      </w:r>
+      <w:r>
+        <w:rPr>
+          <w:rFonts w:cs="Arial"/>
+        </w:rPr>
+        <w:t xml:space="preserve"> (no date) </w:t>
+      </w:r>
+      <w:r>
+        <w:rPr>
+          <w:rFonts w:cs="Arial"/>
+          <w:i/>
+          <w:iCs/>
+        </w:rPr>
+        <w:t>Godot Engine documentation</w:t>
+      </w:r>
+      <w:r>
+        <w:rPr>
+          <w:rFonts w:cs="Arial"/>
+        </w:rPr>
+        <w:t>. Available at: https://docs.godotengine.org/en/stable/classes/class_json.html (Accessed: 22 April 2026).</w:t>
+      </w:r>
+    </w:p>
+    <w:p>
+      <w:pPr>
+        <w:pStyle w:val="Bibliography"/>
+        <w:ind w:left="405"/>
+        <w:rPr>
+          <w:rFonts w:cs="Arial"/>
+        </w:rPr>
+      </w:pPr>
+      <w:r>
+        <w:rPr>
+          <w:rFonts w:cs="Arial"/>
+          <w:i/>
+          <w:iCs/>
+        </w:rPr>
+        <w:t>KayKit - Platformer Pack by Kay Lousberg</w:t>
+      </w:r>
+      <w:r>
+        <w:rPr>
+          <w:rFonts w:cs="Arial"/>
+        </w:rPr>
+        <w:t xml:space="preserve"> (no date) </w:t>
+      </w:r>
+      <w:r>
+        <w:rPr>
+          <w:rFonts w:cs="Arial"/>
+          <w:i/>
+          <w:iCs/>
+        </w:rPr>
+        <w:t>itch.io</w:t>
+      </w:r>
+      <w:r>
+        <w:rPr>
+          <w:rFonts w:cs="Arial"/>
+        </w:rPr>
+        <w:t>. Available at: https://kaylousberg.itch.io/kaykit-platformer (Accessed: 22 April 2026).</w:t>
+      </w:r>
+    </w:p>
+    <w:p>
+      <w:pPr>
+        <w:pStyle w:val="ListParagraph"/>
+        <w:ind w:left="405"/>
+        <w:rPr>
+          <w:rFonts w:ascii="Arial" w:eastAsia="Times New Roman" w:hAnsi="Arial" w:cs="Arial"/>
+          <w:color w:val="000000"/>
+          <w:kern w:val="0"/>
+          <w:lang w:eastAsia="en-GB"/>
+          <w14:ligatures w14:val="none"/>
+        </w:rPr>
+      </w:pPr>
+      <w:r>
+        <w:rPr>
+          <w:rFonts w:ascii="Arial" w:eastAsia="Times New Roman" w:hAnsi="Arial" w:cs="Arial"/>
+          <w:color w:val="000000"/>
+          <w:kern w:val="0"/>
+          <w:lang w:eastAsia="en-GB"/>
+          <w14:ligatures w14:val="none"/>
+        </w:rPr>
+        <w:t>Keith at Fertile Soil Productions (2023) </w:t>
+      </w:r>
+      <w:r>
+        <w:rPr>
+          <w:rFonts w:ascii="Arial" w:eastAsia="Times New Roman" w:hAnsi="Arial" w:cs="Arial"/>
+          <w:i/>
+          <w:iCs/>
+          <w:color w:val="000000"/>
+          <w:kern w:val="0"/>
+          <w:lang w:eastAsia="en-GB"/>
+          <w14:ligatures w14:val="none"/>
+        </w:rPr>
+        <w:t>Modular Platformer</w:t>
+      </w:r>
+      <w:r>
+        <w:rPr>
+          <w:rFonts w:ascii="Arial" w:eastAsia="Times New Roman" w:hAnsi="Arial" w:cs="Arial"/>
+          <w:color w:val="000000"/>
+          <w:kern w:val="0"/>
+          <w:lang w:eastAsia="en-GB"/>
+          <w14:ligatures w14:val="none"/>
+        </w:rPr>
+        <w:t>, </w:t>
+      </w:r>
+      <w:r>
+        <w:rPr>
+          <w:rFonts w:ascii="Arial" w:eastAsia="Times New Roman" w:hAnsi="Arial" w:cs="Arial"/>
+          <w:i/>
+          <w:iCs/>
+          <w:color w:val="000000"/>
+          <w:kern w:val="0"/>
+          <w:lang w:eastAsia="en-GB"/>
+          <w14:ligatures w14:val="none"/>
+        </w:rPr>
+        <w:t>itch.io</w:t>
+      </w:r>
+      <w:r>
+        <w:rPr>
+          <w:rFonts w:ascii="Arial" w:eastAsia="Times New Roman" w:hAnsi="Arial" w:cs="Arial"/>
+          <w:color w:val="000000"/>
+          <w:kern w:val="0"/>
+          <w:lang w:eastAsia="en-GB"/>
+          <w14:ligatures w14:val="none"/>
+        </w:rPr>
+        <w:t>. Available at: https://fertile-soil-productions.itch.io/modular-platformer (Accessed: 28 October 2025). </w:t>
+      </w:r>
+    </w:p>
+    <w:p>
+      <w:pPr>
+        <w:pStyle w:val="ListParagraph"/>
+        <w:ind w:left="405"/>
+        <w:rPr>
+          <w:rFonts w:ascii="Arial" w:eastAsia="Times New Roman" w:hAnsi="Arial" w:cs="Arial"/>
+          <w:color w:val="000000"/>
+          <w:kern w:val="0"/>
+          <w:lang w:eastAsia="en-GB"/>
+          <w14:ligatures w14:val="none"/>
+        </w:rPr>
+      </w:pPr>
+    </w:p>
+    <w:p>
+      <w:pPr>
+        <w:pStyle w:val="ListParagraph"/>
+        <w:spacing w:after="0" w:line="240" w:lineRule="auto"/>
+        <w:ind w:left="405"/>
+        <w:rPr>
+          <w:rFonts w:ascii="Arial" w:eastAsia="Times New Roman" w:hAnsi="Arial" w:cs="Arial"/>
+          <w:color w:val="000000"/>
+          <w:kern w:val="0"/>
+          <w:lang w:eastAsia="en-GB"/>
+          <w14:ligatures w14:val="none"/>
+        </w:rPr>
+      </w:pPr>
+      <w:r>
+        <w:rPr>
+          <w:rFonts w:ascii="Arial" w:eastAsia="Times New Roman" w:hAnsi="Arial" w:cs="Arial"/>
+          <w:color w:val="000000"/>
+          <w:kern w:val="0"/>
+          <w:lang w:eastAsia="en-GB"/>
+          <w14:ligatures w14:val="none"/>
+        </w:rPr>
+        <w:t>Khalifa, A., Silva, F. de M. and Togelius, J. (2019) ‘Level Design Patterns in 2D Games’, </w:t>
+      </w:r>
+      <w:r>
+        <w:rPr>
+          <w:rFonts w:ascii="Arial" w:eastAsia="Times New Roman" w:hAnsi="Arial" w:cs="Arial"/>
+          <w:i/>
+          <w:iCs/>
+          <w:color w:val="000000"/>
+          <w:kern w:val="0"/>
+          <w:lang w:eastAsia="en-GB"/>
+          <w14:ligatures w14:val="none"/>
+        </w:rPr>
+        <w:t>2019 IEEE Conference on Games, CoG</w:t>
+      </w:r>
+      <w:r>
+        <w:rPr>
+          <w:rFonts w:ascii="Arial" w:eastAsia="Times New Roman" w:hAnsi="Arial" w:cs="Arial"/>
+          <w:color w:val="000000"/>
+          <w:kern w:val="0"/>
+          <w:lang w:eastAsia="en-GB"/>
+          <w14:ligatures w14:val="none"/>
+        </w:rPr>
+        <w:t xml:space="preserve">, pp. 1–8. Available at: </w:t>
+      </w:r>
+      <w:hyperlink r:id="rId23" w:history="1">
+        <w:r>
+          <w:rPr>
+            <w:rStyle w:val="Hyperlink"/>
+            <w:rFonts w:ascii="Arial" w:eastAsia="Times New Roman" w:hAnsi="Arial" w:cs="Arial"/>
+            <w:kern w:val="0"/>
+            <w:lang w:eastAsia="en-GB"/>
+            <w14:ligatures w14:val="none"/>
+          </w:rPr>
+          <w:t>https://doi.org/10.1109/CIG.2019.8847953</w:t>
+        </w:r>
+      </w:hyperlink>
+      <w:r>
+        <w:rPr>
+          <w:rFonts w:ascii="Arial" w:eastAsia="Times New Roman" w:hAnsi="Arial" w:cs="Arial"/>
+          <w:color w:val="000000"/>
+          <w:kern w:val="0"/>
+          <w:lang w:eastAsia="en-GB"/>
+          <w14:ligatures w14:val="none"/>
+        </w:rPr>
+        <w:t>.</w:t>
+      </w:r>
+    </w:p>
+    <w:p>
+      <w:pPr>
+        <w:pStyle w:val="ListParagraph"/>
+        <w:spacing w:after="0" w:line="240" w:lineRule="auto"/>
+        <w:ind w:left="405"/>
+        <w:rPr>
+          <w:rFonts w:ascii="Arial" w:eastAsia="Times New Roman" w:hAnsi="Arial" w:cs="Arial"/>
+          <w:kern w:val="0"/>
+          <w:lang w:eastAsia="en-GB"/>
+          <w14:ligatures w14:val="none"/>
+        </w:rPr>
+      </w:pPr>
+    </w:p>
+    <w:p>
+      <w:pPr>
+        <w:pStyle w:val="Bibliography"/>
+        <w:ind w:left="405"/>
+        <w:rPr>
+          <w:rFonts w:cs="Arial"/>
+        </w:rPr>
+      </w:pPr>
+      <w:r>
+        <w:rPr>
+          <w:rFonts w:cs="Arial"/>
+        </w:rPr>
+        <w:t xml:space="preserve">KobeDev (2024) </w:t>
+      </w:r>
+      <w:r>
+        <w:rPr>
+          <w:rFonts w:cs="Arial"/>
+          <w:i/>
+          <w:iCs/>
+        </w:rPr>
+        <w:t>Make a Pause Menu in Godot 4+ in 5 Minutes!</w:t>
+      </w:r>
+      <w:r>
+        <w:rPr>
+          <w:rFonts w:cs="Arial"/>
+        </w:rPr>
+        <w:t xml:space="preserve"> Available at: https://www.youtube.com/watch?v=e9-WQg1yMCY (Accessed: 22 April 2026).</w:t>
+      </w:r>
+    </w:p>
+    <w:p>
+      <w:pPr>
+        <w:pStyle w:val="ListParagraph"/>
+        <w:ind w:left="405"/>
+        <w:rPr>
+          <w:rFonts w:ascii="Arial" w:eastAsia="Times New Roman" w:hAnsi="Arial" w:cs="Arial"/>
+          <w:color w:val="000000"/>
+          <w:kern w:val="0"/>
+          <w:lang w:eastAsia="en-GB"/>
+          <w14:ligatures w14:val="none"/>
+        </w:rPr>
+      </w:pPr>
+      <w:r>
+        <w:rPr>
+          <w:rFonts w:ascii="Arial" w:eastAsia="Times New Roman" w:hAnsi="Arial" w:cs="Arial"/>
+          <w:color w:val="000000"/>
+          <w:kern w:val="0"/>
+          <w:lang w:eastAsia="en-GB"/>
+          <w14:ligatures w14:val="none"/>
+        </w:rPr>
+        <w:lastRenderedPageBreak/>
+        <w:t>Lazaridis, L. and Fragulis, G.F. (2024) ‘Creating a Newer and Improved Procedural Content Generation (PCG) Algorithm with Minimal Human Intervention for Computer Gaming Development’, </w:t>
+      </w:r>
+      <w:r>
+        <w:rPr>
+          <w:rFonts w:ascii="Arial" w:eastAsia="Times New Roman" w:hAnsi="Arial" w:cs="Arial"/>
+          <w:i/>
+          <w:iCs/>
+          <w:color w:val="000000"/>
+          <w:kern w:val="0"/>
+          <w:lang w:eastAsia="en-GB"/>
+          <w14:ligatures w14:val="none"/>
+        </w:rPr>
+        <w:t>Game-Based Learning, Gamification in Education and Serious Games 2023,</w:t>
+      </w:r>
+      <w:r>
+        <w:rPr>
+          <w:rFonts w:ascii="Arial" w:eastAsia="Times New Roman" w:hAnsi="Arial" w:cs="Arial"/>
+          <w:color w:val="000000"/>
+          <w:kern w:val="0"/>
+          <w:lang w:eastAsia="en-GB"/>
+          <w14:ligatures w14:val="none"/>
+        </w:rPr>
+        <w:t xml:space="preserve"> 13(11), article 304. Available at: </w:t>
+      </w:r>
+      <w:hyperlink r:id="rId24" w:history="1">
+        <w:r>
+          <w:rPr>
+            <w:rStyle w:val="Hyperlink"/>
+            <w:rFonts w:ascii="Arial" w:eastAsia="Times New Roman" w:hAnsi="Arial" w:cs="Arial"/>
+            <w:kern w:val="0"/>
+            <w:lang w:eastAsia="en-GB"/>
+            <w14:ligatures w14:val="none"/>
+          </w:rPr>
+          <w:t>https://doi.org/10.3390/computers13110304</w:t>
+        </w:r>
+      </w:hyperlink>
+      <w:r>
+        <w:rPr>
+          <w:rFonts w:ascii="Arial" w:eastAsia="Times New Roman" w:hAnsi="Arial" w:cs="Arial"/>
+          <w:color w:val="000000"/>
+          <w:kern w:val="0"/>
+          <w:lang w:eastAsia="en-GB"/>
+          <w14:ligatures w14:val="none"/>
+        </w:rPr>
+        <w:t>.</w:t>
+      </w:r>
+    </w:p>
+    <w:p>
+      <w:pPr>
+        <w:pStyle w:val="ListParagraph"/>
+        <w:ind w:left="405"/>
+        <w:rPr>
+          <w:rFonts w:ascii="Arial" w:eastAsia="Times New Roman" w:hAnsi="Arial" w:cs="Arial"/>
+          <w:color w:val="000000"/>
+          <w:kern w:val="0"/>
+          <w:lang w:eastAsia="en-GB"/>
+          <w14:ligatures w14:val="none"/>
+        </w:rPr>
+      </w:pPr>
+    </w:p>
+    <w:p>
+      <w:pPr>
+        <w:pStyle w:val="ListParagraph"/>
+        <w:ind w:left="405"/>
+        <w:rPr>
+          <w:rFonts w:ascii="Arial" w:eastAsia="Times New Roman" w:hAnsi="Arial" w:cs="Arial"/>
+          <w:color w:val="000000"/>
+          <w:kern w:val="0"/>
+          <w:lang w:eastAsia="en-GB"/>
+          <w14:ligatures w14:val="none"/>
+        </w:rPr>
+      </w:pPr>
+      <w:r>
+        <w:rPr>
+          <w:rFonts w:ascii="Arial" w:eastAsia="Times New Roman" w:hAnsi="Arial" w:cs="Arial"/>
+          <w:color w:val="000000"/>
+          <w:kern w:val="0"/>
+          <w:lang w:eastAsia="en-GB"/>
+          <w14:ligatures w14:val="none"/>
+        </w:rPr>
+        <w:t>Linietsky, J. and Manzur, A. (2014) </w:t>
+      </w:r>
+      <w:r>
+        <w:rPr>
+          <w:rFonts w:ascii="Arial" w:eastAsia="Times New Roman" w:hAnsi="Arial" w:cs="Arial"/>
+          <w:i/>
+          <w:iCs/>
+          <w:color w:val="000000"/>
+          <w:kern w:val="0"/>
+          <w:lang w:eastAsia="en-GB"/>
+          <w14:ligatures w14:val="none"/>
+        </w:rPr>
+        <w:t>RigidBody3D</w:t>
+      </w:r>
+      <w:r>
+        <w:rPr>
+          <w:rFonts w:ascii="Arial" w:eastAsia="Times New Roman" w:hAnsi="Arial" w:cs="Arial"/>
+          <w:color w:val="000000"/>
+          <w:kern w:val="0"/>
+          <w:lang w:eastAsia="en-GB"/>
+          <w14:ligatures w14:val="none"/>
+        </w:rPr>
+        <w:t>, </w:t>
+      </w:r>
+      <w:r>
+        <w:rPr>
+          <w:rFonts w:ascii="Arial" w:eastAsia="Times New Roman" w:hAnsi="Arial" w:cs="Arial"/>
+          <w:i/>
+          <w:iCs/>
+          <w:color w:val="000000"/>
+          <w:kern w:val="0"/>
+          <w:lang w:eastAsia="en-GB"/>
+          <w14:ligatures w14:val="none"/>
+        </w:rPr>
+        <w:t>Godot Docs</w:t>
+      </w:r>
+      <w:r>
+        <w:rPr>
+          <w:rFonts w:ascii="Arial" w:eastAsia="Times New Roman" w:hAnsi="Arial" w:cs="Arial"/>
+          <w:color w:val="000000"/>
+          <w:kern w:val="0"/>
+          <w:lang w:eastAsia="en-GB"/>
+          <w14:ligatures w14:val="none"/>
+        </w:rPr>
+        <w:t>. Available at: https://docs.godotengine.org/en/stable/classes/class_rigidbody3d.html#class-rigidbody3d-method-apply-central-impulse (Accessed: 7 November 2025). </w:t>
+      </w:r>
+    </w:p>
+    <w:p>
+      <w:pPr>
+        <w:pStyle w:val="Bibliography"/>
+        <w:ind w:left="405"/>
+        <w:rPr>
+          <w:rFonts w:cs="Arial"/>
+        </w:rPr>
+      </w:pPr>
+      <w:r>
+        <w:rPr>
+          <w:rFonts w:cs="Arial"/>
+          <w:i/>
+          <w:iCs/>
+        </w:rPr>
+        <w:t>LowPoly Platformer Pack by Quaternius</w:t>
+      </w:r>
+      <w:r>
+        <w:rPr>
+          <w:rFonts w:cs="Arial"/>
+        </w:rPr>
+        <w:t xml:space="preserve"> (no date) </w:t>
+      </w:r>
+      <w:r>
+        <w:rPr>
+          <w:rFonts w:cs="Arial"/>
+          <w:i/>
+          <w:iCs/>
+        </w:rPr>
+        <w:t>itch.io</w:t>
+      </w:r>
+      <w:r>
+        <w:rPr>
+          <w:rFonts w:cs="Arial"/>
+        </w:rPr>
+        <w:t>. Available at: https://quaternius.itch.io/platformer-pack (Accessed: 22 April 2026).</w:t>
+      </w:r>
+    </w:p>
+    <w:p>
+      <w:pPr>
+        <w:pStyle w:val="ListParagraph"/>
+        <w:spacing w:after="0" w:line="240" w:lineRule="auto"/>
+        <w:ind w:left="405"/>
+        <w:rPr>
+          <w:rFonts w:ascii="Arial" w:eastAsia="Times New Roman" w:hAnsi="Arial" w:cs="Arial"/>
+          <w:color w:val="000000"/>
+          <w:kern w:val="0"/>
+          <w:lang w:eastAsia="en-GB"/>
+          <w14:ligatures w14:val="none"/>
+        </w:rPr>
+      </w:pPr>
+      <w:r>
+        <w:rPr>
+          <w:rFonts w:ascii="Arial" w:eastAsia="Times New Roman" w:hAnsi="Arial" w:cs="Arial"/>
+          <w:color w:val="000000"/>
+          <w:kern w:val="0"/>
+          <w:lang w:eastAsia="en-GB"/>
+          <w14:ligatures w14:val="none"/>
+        </w:rPr>
+        <w:t xml:space="preserve">Markus Persson (2006) </w:t>
+      </w:r>
+      <w:r>
+        <w:rPr>
+          <w:rFonts w:ascii="Arial" w:eastAsia="Times New Roman" w:hAnsi="Arial" w:cs="Arial"/>
+          <w:i/>
+          <w:iCs/>
+          <w:color w:val="000000"/>
+          <w:kern w:val="0"/>
+          <w:lang w:eastAsia="en-GB"/>
+          <w14:ligatures w14:val="none"/>
+        </w:rPr>
+        <w:t>Infinite Mario Bros</w:t>
+      </w:r>
+      <w:r>
+        <w:rPr>
+          <w:rFonts w:ascii="Arial" w:eastAsia="Times New Roman" w:hAnsi="Arial" w:cs="Arial"/>
+          <w:color w:val="000000"/>
+          <w:kern w:val="0"/>
+          <w:lang w:eastAsia="en-GB"/>
+          <w14:ligatures w14:val="none"/>
+        </w:rPr>
+        <w:t xml:space="preserve"> [Video Game].</w:t>
+      </w:r>
+    </w:p>
+    <w:p>
+      <w:pPr>
+        <w:pStyle w:val="ListParagraph"/>
+        <w:spacing w:after="0" w:line="240" w:lineRule="auto"/>
+        <w:ind w:left="405"/>
+        <w:rPr>
+          <w:rFonts w:ascii="Arial" w:eastAsia="Times New Roman" w:hAnsi="Arial" w:cs="Arial"/>
+          <w:color w:val="000000"/>
+          <w:kern w:val="0"/>
+          <w:lang w:eastAsia="en-GB"/>
+          <w14:ligatures w14:val="none"/>
+        </w:rPr>
+      </w:pPr>
+    </w:p>
+    <w:p>
+      <w:pPr>
+        <w:pStyle w:val="ListParagraph"/>
+        <w:ind w:left="405"/>
+        <w:rPr>
+          <w:rFonts w:ascii="Arial" w:eastAsia="Times New Roman" w:hAnsi="Arial" w:cs="Arial"/>
+          <w:color w:val="000000"/>
+          <w:kern w:val="0"/>
+          <w:lang w:eastAsia="en-GB"/>
+          <w14:ligatures w14:val="none"/>
+        </w:rPr>
+      </w:pPr>
+      <w:r>
+        <w:rPr>
+          <w:rFonts w:ascii="Arial" w:eastAsia="Times New Roman" w:hAnsi="Arial" w:cs="Arial"/>
+          <w:color w:val="000000"/>
+          <w:kern w:val="0"/>
+          <w:lang w:eastAsia="en-GB"/>
+          <w14:ligatures w14:val="none"/>
+        </w:rPr>
+        <w:t>Moghadam, A.B. and Rafsanjani, M.K. (2017) ‘A genetic approach in procedural content generation for platformer games level creation’, </w:t>
+      </w:r>
+      <w:r>
+        <w:rPr>
+          <w:rFonts w:ascii="Arial" w:eastAsia="Times New Roman" w:hAnsi="Arial" w:cs="Arial"/>
+          <w:i/>
+          <w:iCs/>
+          <w:color w:val="000000"/>
+          <w:kern w:val="0"/>
+          <w:lang w:eastAsia="en-GB"/>
+          <w14:ligatures w14:val="none"/>
+        </w:rPr>
+        <w:t>2017 2nd Conference on Swarm Intelligence and Evolutionary Computation (CSIEC)</w:t>
+      </w:r>
+      <w:r>
+        <w:rPr>
+          <w:rFonts w:ascii="Arial" w:eastAsia="Times New Roman" w:hAnsi="Arial" w:cs="Arial"/>
+          <w:color w:val="000000"/>
+          <w:kern w:val="0"/>
+          <w:lang w:eastAsia="en-GB"/>
+          <w14:ligatures w14:val="none"/>
+        </w:rPr>
+        <w:t xml:space="preserve">, pp. 141–146. Available at: </w:t>
+      </w:r>
+      <w:hyperlink r:id="rId25" w:history="1">
+        <w:r>
+          <w:rPr>
+            <w:rStyle w:val="Hyperlink"/>
+            <w:rFonts w:ascii="Arial" w:eastAsia="Times New Roman" w:hAnsi="Arial" w:cs="Arial"/>
+            <w:kern w:val="0"/>
+            <w:lang w:eastAsia="en-GB"/>
+            <w14:ligatures w14:val="none"/>
+          </w:rPr>
+          <w:t>https://doi.org/10.1109/CSIEC.2017.7940160</w:t>
+        </w:r>
+      </w:hyperlink>
+      <w:r>
+        <w:rPr>
+          <w:rFonts w:ascii="Arial" w:eastAsia="Times New Roman" w:hAnsi="Arial" w:cs="Arial"/>
+          <w:color w:val="000000"/>
+          <w:kern w:val="0"/>
+          <w:lang w:eastAsia="en-GB"/>
+          <w14:ligatures w14:val="none"/>
+        </w:rPr>
+        <w:t>.</w:t>
+      </w:r>
+    </w:p>
+    <w:p>
+      <w:pPr>
+        <w:pStyle w:val="ListParagraph"/>
+        <w:ind w:left="405"/>
+        <w:rPr>
+          <w:rFonts w:ascii="Arial" w:eastAsia="Times New Roman" w:hAnsi="Arial" w:cs="Arial"/>
+          <w:color w:val="000000"/>
+          <w:kern w:val="0"/>
+          <w:lang w:eastAsia="en-GB"/>
+          <w14:ligatures w14:val="none"/>
+        </w:rPr>
+      </w:pPr>
+    </w:p>
+    <w:p>
+      <w:pPr>
+        <w:pStyle w:val="ListParagraph"/>
+        <w:spacing w:after="0" w:line="240" w:lineRule="auto"/>
+        <w:ind w:left="405"/>
+        <w:rPr>
+          <w:rFonts w:ascii="Arial" w:eastAsia="Times New Roman" w:hAnsi="Arial" w:cs="Arial"/>
+          <w:color w:val="000000"/>
+          <w:kern w:val="0"/>
+          <w:lang w:eastAsia="en-GB"/>
+          <w14:ligatures w14:val="none"/>
+        </w:rPr>
+      </w:pPr>
+      <w:r>
+        <w:rPr>
+          <w:rFonts w:ascii="Arial" w:eastAsia="Times New Roman" w:hAnsi="Arial" w:cs="Arial"/>
+          <w:color w:val="000000"/>
+          <w:kern w:val="0"/>
+          <w:lang w:eastAsia="en-GB"/>
+          <w14:ligatures w14:val="none"/>
+        </w:rPr>
+        <w:t xml:space="preserve">Mojang (2011) </w:t>
+      </w:r>
+      <w:r>
+        <w:rPr>
+          <w:rFonts w:ascii="Arial" w:eastAsia="Times New Roman" w:hAnsi="Arial" w:cs="Arial"/>
+          <w:i/>
+          <w:iCs/>
+          <w:color w:val="000000"/>
+          <w:kern w:val="0"/>
+          <w:lang w:eastAsia="en-GB"/>
+          <w14:ligatures w14:val="none"/>
+        </w:rPr>
+        <w:t>Minecraft</w:t>
+      </w:r>
+      <w:r>
+        <w:rPr>
+          <w:rFonts w:ascii="Arial" w:eastAsia="Times New Roman" w:hAnsi="Arial" w:cs="Arial"/>
+          <w:color w:val="000000"/>
+          <w:kern w:val="0"/>
+          <w:lang w:eastAsia="en-GB"/>
+          <w14:ligatures w14:val="none"/>
+        </w:rPr>
+        <w:t xml:space="preserve"> [Video Game].</w:t>
+      </w:r>
+    </w:p>
+    <w:p>
+      <w:pPr>
+        <w:pStyle w:val="ListParagraph"/>
+        <w:spacing w:after="0" w:line="240" w:lineRule="auto"/>
+        <w:ind w:left="405"/>
+        <w:rPr>
+          <w:rFonts w:ascii="Arial" w:eastAsia="Times New Roman" w:hAnsi="Arial" w:cs="Arial"/>
+          <w:color w:val="000000"/>
+          <w:kern w:val="0"/>
+          <w:lang w:eastAsia="en-GB"/>
+          <w14:ligatures w14:val="none"/>
+        </w:rPr>
+      </w:pPr>
+    </w:p>
+    <w:p>
+      <w:pPr>
+        <w:pStyle w:val="Bibliography"/>
+        <w:ind w:left="405"/>
+        <w:rPr>
+          <w:rFonts w:cs="Arial"/>
+        </w:rPr>
+      </w:pPr>
+      <w:r>
+        <w:rPr>
+          <w:rFonts w:cs="Arial"/>
+        </w:rPr>
+        <w:t xml:space="preserve">Red Indie Games (2024) </w:t>
+      </w:r>
+      <w:r>
+        <w:rPr>
+          <w:rFonts w:cs="Arial"/>
+          <w:i/>
+          <w:iCs/>
+        </w:rPr>
+        <w:t>Master JSON in Godot: Save Systems, Data Handling, and More!</w:t>
+      </w:r>
+      <w:r>
+        <w:rPr>
+          <w:rFonts w:cs="Arial"/>
+        </w:rPr>
+        <w:t xml:space="preserve"> Available at: https://www.youtube.com/watch?v=JqJ5duB0Xhs (Accessed: 22 April 2026).</w:t>
+      </w:r>
+    </w:p>
+    <w:p>
+      <w:pPr>
+        <w:pStyle w:val="ListParagraph"/>
+        <w:spacing w:after="0" w:line="240" w:lineRule="auto"/>
+        <w:ind w:left="405"/>
+        <w:rPr>
+          <w:rFonts w:ascii="Arial" w:eastAsia="Times New Roman" w:hAnsi="Arial" w:cs="Arial"/>
+          <w:color w:val="000000"/>
+          <w:kern w:val="0"/>
+          <w:lang w:eastAsia="en-GB"/>
+          <w14:ligatures w14:val="none"/>
+        </w:rPr>
+      </w:pPr>
+      <w:r>
+        <w:rPr>
+          <w:rFonts w:ascii="Arial" w:eastAsia="Times New Roman" w:hAnsi="Arial" w:cs="Arial"/>
+          <w:color w:val="000000"/>
+          <w:kern w:val="0"/>
+          <w:lang w:eastAsia="en-GB"/>
+          <w14:ligatures w14:val="none"/>
+        </w:rPr>
+        <w:t xml:space="preserve">Smith G., Cha M., and Whitehead J. (2008) ‘A framework for analysis of 2D platformer levels’, </w:t>
+      </w:r>
+      <w:r>
+        <w:rPr>
+          <w:rFonts w:ascii="Arial" w:eastAsia="Times New Roman" w:hAnsi="Arial" w:cs="Arial"/>
+          <w:i/>
+          <w:iCs/>
+          <w:color w:val="000000"/>
+          <w:kern w:val="0"/>
+          <w:lang w:eastAsia="en-GB"/>
+          <w14:ligatures w14:val="none"/>
+        </w:rPr>
+        <w:t>Proceedings of the 2008 ACM SIGGRAPH symposium on Video games, Sandbox '08</w:t>
+      </w:r>
+      <w:r>
+        <w:rPr>
+          <w:rFonts w:ascii="Arial" w:eastAsia="Times New Roman" w:hAnsi="Arial" w:cs="Arial"/>
+          <w:color w:val="000000"/>
+          <w:kern w:val="0"/>
+          <w:lang w:eastAsia="en-GB"/>
+          <w14:ligatures w14:val="none"/>
+        </w:rPr>
+        <w:t xml:space="preserve">, pp. 75–80. Available at: </w:t>
+      </w:r>
+      <w:hyperlink r:id="rId26" w:history="1">
+        <w:r>
+          <w:rPr>
+            <w:rStyle w:val="Hyperlink"/>
+            <w:rFonts w:ascii="Arial" w:eastAsia="Times New Roman" w:hAnsi="Arial" w:cs="Arial"/>
+            <w:kern w:val="0"/>
+            <w:lang w:eastAsia="en-GB"/>
+            <w14:ligatures w14:val="none"/>
+          </w:rPr>
+          <w:t>https://doi.org/10.1145/1401843.1401858</w:t>
+        </w:r>
+      </w:hyperlink>
+      <w:r>
+        <w:rPr>
+          <w:rFonts w:ascii="Arial" w:eastAsia="Times New Roman" w:hAnsi="Arial" w:cs="Arial"/>
+          <w:color w:val="000000"/>
+          <w:kern w:val="0"/>
+          <w:lang w:eastAsia="en-GB"/>
+          <w14:ligatures w14:val="none"/>
+        </w:rPr>
+        <w:t>.</w:t>
+      </w:r>
+    </w:p>
+    <w:p>
+      <w:pPr>
+        <w:pStyle w:val="ListParagraph"/>
+        <w:spacing w:after="0" w:line="240" w:lineRule="auto"/>
+        <w:ind w:left="405"/>
+        <w:rPr>
+          <w:rFonts w:ascii="Arial" w:eastAsia="Times New Roman" w:hAnsi="Arial" w:cs="Arial"/>
+          <w:color w:val="000000"/>
+          <w:kern w:val="0"/>
+          <w:lang w:eastAsia="en-GB"/>
+          <w14:ligatures w14:val="none"/>
+        </w:rPr>
+      </w:pPr>
+    </w:p>
+    <w:p>
+      <w:pPr>
+        <w:pStyle w:val="ListParagraph"/>
+        <w:spacing w:after="0" w:line="240" w:lineRule="auto"/>
+        <w:ind w:left="405"/>
+        <w:rPr>
+          <w:rFonts w:ascii="Arial" w:eastAsia="Times New Roman" w:hAnsi="Arial" w:cs="Arial"/>
+          <w:color w:val="000000"/>
+          <w:kern w:val="0"/>
+          <w:lang w:eastAsia="en-GB"/>
+          <w14:ligatures w14:val="none"/>
+        </w:rPr>
+      </w:pPr>
+      <w:r>
+        <w:rPr>
+          <w:rFonts w:ascii="Arial" w:eastAsia="Times New Roman" w:hAnsi="Arial" w:cs="Arial"/>
+          <w:color w:val="000000"/>
+          <w:kern w:val="0"/>
+          <w:lang w:eastAsia="en-GB"/>
+          <w14:ligatures w14:val="none"/>
+        </w:rPr>
+        <w:t xml:space="preserve">Smith G., Treanor M., Whitehead J., and Mateas M. (2009) ‘Rhythm-based level generation for 2D platformers’, </w:t>
+      </w:r>
+      <w:r>
+        <w:rPr>
+          <w:rFonts w:ascii="Arial" w:eastAsia="Times New Roman" w:hAnsi="Arial" w:cs="Arial"/>
+          <w:i/>
+          <w:iCs/>
+          <w:color w:val="000000"/>
+          <w:kern w:val="0"/>
+          <w:lang w:eastAsia="en-GB"/>
+          <w14:ligatures w14:val="none"/>
+        </w:rPr>
+        <w:t>Proceedings of the 4th International Conference on Foundations of Digital Games,</w:t>
+      </w:r>
+      <w:r>
+        <w:rPr>
+          <w:rFonts w:ascii="Arial" w:eastAsia="Times New Roman" w:hAnsi="Arial" w:cs="Arial"/>
+          <w:color w:val="000000"/>
+          <w:kern w:val="0"/>
+          <w:lang w:eastAsia="en-GB"/>
+          <w14:ligatures w14:val="none"/>
+        </w:rPr>
+        <w:t xml:space="preserve"> </w:t>
+      </w:r>
+      <w:r>
+        <w:rPr>
+          <w:rFonts w:ascii="Arial" w:eastAsia="Times New Roman" w:hAnsi="Arial" w:cs="Arial"/>
+          <w:i/>
+          <w:iCs/>
+          <w:color w:val="000000"/>
+          <w:kern w:val="0"/>
+          <w:lang w:eastAsia="en-GB"/>
+          <w14:ligatures w14:val="none"/>
+        </w:rPr>
+        <w:t>FDG '09</w:t>
+      </w:r>
+      <w:r>
+        <w:rPr>
+          <w:rFonts w:ascii="Arial" w:eastAsia="Times New Roman" w:hAnsi="Arial" w:cs="Arial"/>
+          <w:color w:val="000000"/>
+          <w:kern w:val="0"/>
+          <w:lang w:eastAsia="en-GB"/>
+          <w14:ligatures w14:val="none"/>
+        </w:rPr>
+        <w:t xml:space="preserve">, pp. 175–182. Available at: </w:t>
+      </w:r>
+      <w:hyperlink r:id="rId27" w:history="1">
+        <w:r>
+          <w:rPr>
+            <w:rStyle w:val="Hyperlink"/>
+            <w:rFonts w:ascii="Arial" w:eastAsia="Times New Roman" w:hAnsi="Arial" w:cs="Arial"/>
+            <w:kern w:val="0"/>
+            <w:lang w:eastAsia="en-GB"/>
+            <w14:ligatures w14:val="none"/>
+          </w:rPr>
+          <w:t>https://doi.org/10.1145/1536513.1536548</w:t>
+        </w:r>
+      </w:hyperlink>
+      <w:r>
+        <w:rPr>
+          <w:rFonts w:ascii="Arial" w:eastAsia="Times New Roman" w:hAnsi="Arial" w:cs="Arial"/>
+          <w:color w:val="000000"/>
+          <w:kern w:val="0"/>
+          <w:lang w:eastAsia="en-GB"/>
+          <w14:ligatures w14:val="none"/>
+        </w:rPr>
+        <w:t>.</w:t>
+      </w:r>
+    </w:p>
+    <w:p>
+      <w:pPr>
+        <w:pStyle w:val="ListParagraph"/>
+        <w:ind w:left="405"/>
+        <w:rPr>
+          <w:rFonts w:eastAsia="Times New Roman" w:cs="Times New Roman"/>
+          <w:color w:val="000000"/>
+          <w:kern w:val="0"/>
+          <w:lang w:eastAsia="en-GB"/>
+          <w14:ligatures w14:val="none"/>
+        </w:rPr>
+      </w:pPr>
+    </w:p>
+    <w:p>
+      <w:pPr>
+        <w:pStyle w:val="ListParagraph"/>
+        <w:spacing w:after="0" w:line="240" w:lineRule="auto"/>
+        <w:ind w:left="405"/>
+        <w:rPr>
+          <w:rFonts w:eastAsia="Times New Roman" w:cs="Times New Roman"/>
+          <w:color w:val="000000"/>
+          <w:kern w:val="0"/>
+          <w:lang w:eastAsia="en-GB"/>
+          <w14:ligatures w14:val="none"/>
+        </w:rPr>
+      </w:pPr>
+    </w:p>
+    <w:p/>
+    <w:p/>
+    <w:p/>
+    <w:p>
+      <w:pPr>
         <w:pStyle w:val="Heading1"/>
       </w:pPr>
       <w:r>
@@ -2798,7 +4596,6 @@
         <w:pStyle w:val="Heading1"/>
       </w:pPr>
       <w:r>
-        <w:lastRenderedPageBreak/>
         <w:br w:type="page"/>
       </w:r>
     </w:p>
@@ -2818,8 +4615,8 @@
     </w:p>
     <w:p/>
     <w:sectPr>
-      <w:headerReference w:type="default" r:id="rId21"/>
-      <w:footerReference w:type="default" r:id="rId22"/>
+      <w:headerReference w:type="default" r:id="rId28"/>
+      <w:footerReference w:type="default" r:id="rId29"/>
       <w:pgSz w:w="11906" w:h="16838"/>
       <w:pgMar w:top="1440" w:right="1797" w:bottom="1440" w:left="2268" w:header="720" w:footer="720" w:gutter="0"/>
       <w:pgNumType w:start="1"/>
@@ -4414,6 +6211,32 @@
       <w14:ligatures w14:val="standardContextual"/>
     </w:rPr>
   </w:style>
+  <w:style w:type="paragraph" w:styleId="Bibliography">
+    <w:name w:val="Bibliography"/>
+    <w:basedOn w:val="Normal"/>
+    <w:next w:val="Normal"/>
+    <w:uiPriority w:val="37"/>
+    <w:semiHidden/>
+    <w:unhideWhenUsed/>
+    <w:rsid w:val="00E36993"/>
+  </w:style>
+  <w:style w:type="paragraph" w:styleId="ListParagraph">
+    <w:name w:val="List Paragraph"/>
+    <w:basedOn w:val="Normal"/>
+    <w:uiPriority w:val="34"/>
+    <w:qFormat/>
+    <w:rsid w:val="00E36993"/>
+    <w:pPr>
+      <w:spacing w:after="160" w:line="278" w:lineRule="auto"/>
+      <w:ind w:left="720"/>
+      <w:contextualSpacing/>
+    </w:pPr>
+    <w:rPr>
+      <w:rFonts w:asciiTheme="minorHAnsi" w:eastAsiaTheme="minorHAnsi" w:hAnsiTheme="minorHAnsi" w:cstheme="minorBidi"/>
+      <w:kern w:val="2"/>
+      <w14:ligatures w14:val="standardContextual"/>
+    </w:rPr>
+  </w:style>
 </w:styles>
 </file>
 
@@ -4703,15 +6526,6 @@
 </file>
 
 <file path=customXml/item1.xml><?xml version="1.0" encoding="utf-8"?>
-<?mso-contentType ?>
-<FormTemplates xmlns="http://schemas.microsoft.com/sharepoint/v3/contenttype/forms">
-  <Display>DocumentLibraryForm</Display>
-  <Edit>DocumentLibraryForm</Edit>
-  <New>DocumentLibraryForm</New>
-</FormTemplates>
-</file>
-
-<file path=customXml/item2.xml><?xml version="1.0" encoding="utf-8"?>
 <ct:contentTypeSchema xmlns:ct="http://schemas.microsoft.com/office/2006/metadata/contentType" xmlns:ma="http://schemas.microsoft.com/office/2006/metadata/properties/metaAttributes" ct:_="" ma:_="" ma:contentTypeName="Document" ma:contentTypeID="0x01010033553FA8616F3A45AD369E275EA42271" ma:contentTypeVersion="11" ma:contentTypeDescription="Create a new document." ma:contentTypeScope="" ma:versionID="8eb4e0804d077bcc139b361cda3a640c">
   <xsd:schema xmlns:xsd="http://www.w3.org/2001/XMLSchema" xmlns:xs="http://www.w3.org/2001/XMLSchema" xmlns:p="http://schemas.microsoft.com/office/2006/metadata/properties" xmlns:ns3="371a10d4-9e19-41a9-948b-d1cca29b4cb6" xmlns:ns4="18dffc30-a361-43f0-bb4a-1f62e819a6f2" targetNamespace="http://schemas.microsoft.com/office/2006/metadata/properties" ma:root="true" ma:fieldsID="ac8e08ff64368403dfb4d2274f8d7465" ns3:_="" ns4:_="">
     <xsd:import namespace="371a10d4-9e19-41a9-948b-d1cca29b4cb6"/>
@@ -4920,25 +6734,26 @@
 </ct:contentTypeSchema>
 </file>
 
-<file path=customXml/item3.xml><?xml version="1.0" encoding="utf-8"?>
-<b:Sources xmlns:b="http://schemas.openxmlformats.org/officeDocument/2006/bibliography" xmlns="http://schemas.openxmlformats.org/officeDocument/2006/bibliography" SelectedStyle="\APA.XSL" StyleName="APA"/>
+<file path=customXml/item2.xml><?xml version="1.0" encoding="utf-8"?>
+<?mso-contentType ?>
+<FormTemplates xmlns="http://schemas.microsoft.com/sharepoint/v3/contenttype/forms">
+  <Display>DocumentLibraryForm</Display>
+  <Edit>DocumentLibraryForm</Edit>
+  <New>DocumentLibraryForm</New>
+</FormTemplates>
 </file>
 
-<file path=customXml/item4.xml><?xml version="1.0" encoding="utf-8"?>
+<file path=customXml/item3.xml><?xml version="1.0" encoding="utf-8"?>
 <p:properties xmlns:p="http://schemas.microsoft.com/office/2006/metadata/properties" xmlns:xsi="http://www.w3.org/2001/XMLSchema-instance" xmlns:pc="http://schemas.microsoft.com/office/infopath/2007/PartnerControls">
   <documentManagement/>
 </p:properties>
 </file>
 
-<file path=customXml/itemProps1.xml><?xml version="1.0" encoding="utf-8"?>
-<ds:datastoreItem xmlns:ds="http://schemas.openxmlformats.org/officeDocument/2006/customXml" ds:itemID="{05D9BF79-26A9-4E9A-9793-4E28B04A02DC}">
-  <ds:schemaRefs>
-    <ds:schemaRef ds:uri="http://schemas.microsoft.com/sharepoint/v3/contenttype/forms"/>
-  </ds:schemaRefs>
-</ds:datastoreItem>
+<file path=customXml/item4.xml><?xml version="1.0" encoding="utf-8"?>
+<b:Sources xmlns:b="http://schemas.openxmlformats.org/officeDocument/2006/bibliography" xmlns="http://schemas.openxmlformats.org/officeDocument/2006/bibliography" SelectedStyle="\APA.XSL" StyleName="APA"/>
 </file>
 
-<file path=customXml/itemProps2.xml><?xml version="1.0" encoding="utf-8"?>
+<file path=customXml/itemProps1.xml><?xml version="1.0" encoding="utf-8"?>
 <ds:datastoreItem xmlns:ds="http://schemas.openxmlformats.org/officeDocument/2006/customXml" ds:itemID="{307A6BE8-0D48-4A7D-A535-369CCDFBF2CB}">
   <ds:schemaRefs>
     <ds:schemaRef ds:uri="http://schemas.microsoft.com/office/2006/metadata/contentType"/>
@@ -4957,19 +6772,27 @@
 </ds:datastoreItem>
 </file>
 
-<file path=customXml/itemProps3.xml><?xml version="1.0" encoding="utf-8"?>
-<ds:datastoreItem xmlns:ds="http://schemas.openxmlformats.org/officeDocument/2006/customXml" ds:itemID="{79CEDF70-F74C-4284-98FC-38644A27E791}">
+<file path=customXml/itemProps2.xml><?xml version="1.0" encoding="utf-8"?>
+<ds:datastoreItem xmlns:ds="http://schemas.openxmlformats.org/officeDocument/2006/customXml" ds:itemID="{05D9BF79-26A9-4E9A-9793-4E28B04A02DC}">
   <ds:schemaRefs>
-    <ds:schemaRef ds:uri="http://schemas.openxmlformats.org/officeDocument/2006/bibliography"/>
+    <ds:schemaRef ds:uri="http://schemas.microsoft.com/sharepoint/v3/contenttype/forms"/>
   </ds:schemaRefs>
 </ds:datastoreItem>
 </file>
 
-<file path=customXml/itemProps4.xml><?xml version="1.0" encoding="utf-8"?>
+<file path=customXml/itemProps3.xml><?xml version="1.0" encoding="utf-8"?>
 <ds:datastoreItem xmlns:ds="http://schemas.openxmlformats.org/officeDocument/2006/customXml" ds:itemID="{10A8F88B-6E38-47A8-8074-155E10D59BDF}">
   <ds:schemaRefs>
     <ds:schemaRef ds:uri="http://schemas.microsoft.com/office/2006/metadata/properties"/>
     <ds:schemaRef ds:uri="http://schemas.microsoft.com/office/infopath/2007/PartnerControls"/>
   </ds:schemaRefs>
 </ds:datastoreItem>
+</file>
+
+<file path=customXml/itemProps4.xml><?xml version="1.0" encoding="utf-8"?>
+<ds:datastoreItem xmlns:ds="http://schemas.openxmlformats.org/officeDocument/2006/customXml" ds:itemID="{79CEDF70-F74C-4284-98FC-38644A27E791}">
+  <ds:schemaRefs>
+    <ds:schemaRef ds:uri="http://schemas.openxmlformats.org/officeDocument/2006/bibliography"/>
+  </ds:schemaRefs>
+</ds:datastoreItem>
 </file>
</xml_diff>

<commit_message>
added: more dissertation stuff
</commit_message>
<xml_diff>
--- a/Documents/Dissertation w feedback 16th april.docx
+++ b/Documents/Dissertation w feedback 16th april.docx
@@ -2660,13 +2660,176 @@
       <w:pPr>
         <w:jc w:val="center"/>
       </w:pPr>
+      <w:r>
+        <w:t xml:space="preserve"> </w:t>
+      </w:r>
+      <w:r>
+        <w:drawing>
+          <wp:inline distT="0" distB="0" distL="0" distR="0" wp14:anchorId="68A4155E" wp14:editId="26D7C67F">
+            <wp:extent cx="4979035" cy="3241675"/>
+            <wp:effectExtent l="0" t="0" r="0" b="0"/>
+            <wp:docPr id="2076514218" name="Picture 1"/>
+            <wp:cNvGraphicFramePr>
+              <a:graphicFrameLocks xmlns:a="http://schemas.openxmlformats.org/drawingml/2006/main" noChangeAspect="1"/>
+            </wp:cNvGraphicFramePr>
+            <a:graphic xmlns:a="http://schemas.openxmlformats.org/drawingml/2006/main">
+              <a:graphicData uri="http://schemas.openxmlformats.org/drawingml/2006/picture">
+                <pic:pic xmlns:pic="http://schemas.openxmlformats.org/drawingml/2006/picture">
+                  <pic:nvPicPr>
+                    <pic:cNvPr id="2076514218" name=""/>
+                    <pic:cNvPicPr/>
+                  </pic:nvPicPr>
+                  <pic:blipFill>
+                    <a:blip r:embed="rId21"/>
+                    <a:stretch>
+                      <a:fillRect/>
+                    </a:stretch>
+                  </pic:blipFill>
+                  <pic:spPr>
+                    <a:xfrm>
+                      <a:off x="0" y="0"/>
+                      <a:ext cx="4979035" cy="3241675"/>
+                    </a:xfrm>
+                    <a:prstGeom prst="rect">
+                      <a:avLst/>
+                    </a:prstGeom>
+                  </pic:spPr>
+                </pic:pic>
+              </a:graphicData>
+            </a:graphic>
+          </wp:inline>
+        </w:drawing>
+      </w:r>
     </w:p>
     <w:p>
       <w:pPr>
         <w:jc w:val="center"/>
       </w:pPr>
       <w:r>
-        <w:t>For the familiarity of the 3D platformer genre, this got an average rating of 7.4. The enjoyabiity of the level got an average rating of 5.2</w:t>
+        <w:drawing>
+          <wp:inline distT="0" distB="0" distL="0" distR="0" wp14:anchorId="28FF215B" wp14:editId="3B2B26E6">
+            <wp:extent cx="4979035" cy="2280920"/>
+            <wp:effectExtent l="0" t="0" r="0" b="5080"/>
+            <wp:docPr id="1988893542" name="Picture 1"/>
+            <wp:cNvGraphicFramePr>
+              <a:graphicFrameLocks xmlns:a="http://schemas.openxmlformats.org/drawingml/2006/main" noChangeAspect="1"/>
+            </wp:cNvGraphicFramePr>
+            <a:graphic xmlns:a="http://schemas.openxmlformats.org/drawingml/2006/main">
+              <a:graphicData uri="http://schemas.openxmlformats.org/drawingml/2006/picture">
+                <pic:pic xmlns:pic="http://schemas.openxmlformats.org/drawingml/2006/picture">
+                  <pic:nvPicPr>
+                    <pic:cNvPr id="1988893542" name=""/>
+                    <pic:cNvPicPr/>
+                  </pic:nvPicPr>
+                  <pic:blipFill>
+                    <a:blip r:embed="rId22"/>
+                    <a:stretch>
+                      <a:fillRect/>
+                    </a:stretch>
+                  </pic:blipFill>
+                  <pic:spPr>
+                    <a:xfrm>
+                      <a:off x="0" y="0"/>
+                      <a:ext cx="4979035" cy="2280920"/>
+                    </a:xfrm>
+                    <a:prstGeom prst="rect">
+                      <a:avLst/>
+                    </a:prstGeom>
+                  </pic:spPr>
+                </pic:pic>
+              </a:graphicData>
+            </a:graphic>
+          </wp:inline>
+        </w:drawing>
+      </w:r>
+    </w:p>
+    <w:p>
+      <w:pPr>
+        <w:jc w:val="center"/>
+      </w:pPr>
+      <w:r>
+        <w:lastRenderedPageBreak/>
+        <w:t>Figure 4</w:t>
+      </w:r>
+      <w:r>
+        <w:t xml:space="preserve"> and 5</w:t>
+      </w:r>
+      <w:r>
+        <w:t>. Pilot Test Responses</w:t>
+      </w:r>
+    </w:p>
+    <w:p>
+      <w:pPr>
+        <w:jc w:val="center"/>
+      </w:pPr>
+    </w:p>
+    <w:p>
+      <w:pPr>
+        <w:jc w:val="center"/>
+      </w:pPr>
+    </w:p>
+    <w:p>
+      <w:pPr>
+        <w:jc w:val="center"/>
+      </w:pPr>
+      <w:r>
+        <w:t xml:space="preserve">For the familiarity of the 3D platformer genre, this got an average rating of 7.4. The </w:t>
+      </w:r>
+      <w:r>
+        <w:t>enjoyability</w:t>
+      </w:r>
+      <w:r>
+        <w:t xml:space="preserve"> of the level got an average rating of 5.2</w:t>
+      </w:r>
+      <w:r>
+        <w:t xml:space="preserve">. What people detested about the level is how the player character behaved, particularly the double jump functionality and the floaty movement. </w:t>
+      </w:r>
+      <w:r>
+        <w:t>Most</w:t>
+      </w:r>
+      <w:r>
+        <w:t xml:space="preserve"> users also felt that the game was considered too difficult for them in terms of the level generation and losing a score of 5000 per death. As a result of this, there was some fixes made. </w:t>
+      </w:r>
+    </w:p>
+    <w:p>
+      <w:pPr>
+        <w:jc w:val="center"/>
+      </w:pPr>
+    </w:p>
+    <w:p>
+      <w:pPr>
+        <w:jc w:val="center"/>
+      </w:pPr>
+      <w:r>
+        <w:t>To address the issue of the player’s double jump</w:t>
+      </w:r>
+      <w:r>
+        <w:t xml:space="preserve">, when </w:t>
+      </w:r>
+      <w:r>
+        <w:t>the second</w:t>
+      </w:r>
+      <w:r>
+        <w:t xml:space="preserve"> jump is made, the velocity y direction is set to 0 before adding the jump impulse to the player. This is so the double jump would behave regardless of the players current y velocity after jumping. The floaty movement was resolved by using a very high acceleration to ensure that the velocity of the player movement felt constant. This meant the player wouldn’t slide across the map when stopping or start sliding when they are running.</w:t>
+      </w:r>
+    </w:p>
+    <w:p>
+      <w:pPr>
+        <w:jc w:val="center"/>
+      </w:pPr>
+    </w:p>
+    <w:p>
+      <w:pPr>
+        <w:jc w:val="center"/>
+      </w:pPr>
+      <w:r>
+        <w:t xml:space="preserve">Dead-end spawns and poor generations have also been mitigated by taking measures to ensure that each level is able to be beaten. For instance, setting a limit for the furthest jump on a platform. Every platform also has a set gap when translating itself </w:t>
+      </w:r>
+      <w:r>
+        <w:t>to</w:t>
+      </w:r>
+      <w:r>
+        <w:t xml:space="preserve"> prevent overlap between other platforms. The game has also been made less harsh for players by reducing the score lost from 5000 to 3000. Players now also gain 1000 points for every health pack they contain. </w:t>
       </w:r>
     </w:p>
     <w:p>
@@ -2683,7 +2846,8 @@
         <w:jc w:val="center"/>
       </w:pPr>
       <w:r>
-        <w:br w:type="page"/>
+        <w:lastRenderedPageBreak/>
+        <w:t>3.4.3 Survey Design</w:t>
       </w:r>
     </w:p>
     <w:p>
@@ -2691,9 +2855,221 @@
         <w:pStyle w:val="Heading1"/>
         <w:jc w:val="center"/>
       </w:pPr>
+      <w:r>
+        <w:drawing>
+          <wp:inline distT="0" distB="0" distL="0" distR="0" wp14:anchorId="722F9DBE" wp14:editId="1EBADE04">
+            <wp:extent cx="4979035" cy="6298565"/>
+            <wp:effectExtent l="0" t="0" r="0" b="6985"/>
+            <wp:docPr id="1375497242" name="Picture 1"/>
+            <wp:cNvGraphicFramePr>
+              <a:graphicFrameLocks xmlns:a="http://schemas.openxmlformats.org/drawingml/2006/main" noChangeAspect="1"/>
+            </wp:cNvGraphicFramePr>
+            <a:graphic xmlns:a="http://schemas.openxmlformats.org/drawingml/2006/main">
+              <a:graphicData uri="http://schemas.openxmlformats.org/drawingml/2006/picture">
+                <pic:pic xmlns:pic="http://schemas.openxmlformats.org/drawingml/2006/picture">
+                  <pic:nvPicPr>
+                    <pic:cNvPr id="1375497242" name=""/>
+                    <pic:cNvPicPr/>
+                  </pic:nvPicPr>
+                  <pic:blipFill>
+                    <a:blip r:embed="rId23"/>
+                    <a:stretch>
+                      <a:fillRect/>
+                    </a:stretch>
+                  </pic:blipFill>
+                  <pic:spPr>
+                    <a:xfrm>
+                      <a:off x="0" y="0"/>
+                      <a:ext cx="4979035" cy="6298565"/>
+                    </a:xfrm>
+                    <a:prstGeom prst="rect">
+                      <a:avLst/>
+                    </a:prstGeom>
+                  </pic:spPr>
+                </pic:pic>
+              </a:graphicData>
+            </a:graphic>
+          </wp:inline>
+        </w:drawing>
+      </w:r>
+    </w:p>
+    <w:p>
+      <w:pPr>
+        <w:pStyle w:val="Heading1"/>
+        <w:jc w:val="center"/>
+      </w:pPr>
+      <w:r>
+        <w:lastRenderedPageBreak/>
+        <w:drawing>
+          <wp:inline distT="0" distB="0" distL="0" distR="0" wp14:anchorId="7F3CC324" wp14:editId="1DFA32E1">
+            <wp:extent cx="4979035" cy="5237480"/>
+            <wp:effectExtent l="0" t="0" r="0" b="1270"/>
+            <wp:docPr id="1442658749" name="Picture 1"/>
+            <wp:cNvGraphicFramePr>
+              <a:graphicFrameLocks xmlns:a="http://schemas.openxmlformats.org/drawingml/2006/main" noChangeAspect="1"/>
+            </wp:cNvGraphicFramePr>
+            <a:graphic xmlns:a="http://schemas.openxmlformats.org/drawingml/2006/main">
+              <a:graphicData uri="http://schemas.openxmlformats.org/drawingml/2006/picture">
+                <pic:pic xmlns:pic="http://schemas.openxmlformats.org/drawingml/2006/picture">
+                  <pic:nvPicPr>
+                    <pic:cNvPr id="1442658749" name=""/>
+                    <pic:cNvPicPr/>
+                  </pic:nvPicPr>
+                  <pic:blipFill>
+                    <a:blip r:embed="rId24"/>
+                    <a:stretch>
+                      <a:fillRect/>
+                    </a:stretch>
+                  </pic:blipFill>
+                  <pic:spPr>
+                    <a:xfrm>
+                      <a:off x="0" y="0"/>
+                      <a:ext cx="4979035" cy="5237480"/>
+                    </a:xfrm>
+                    <a:prstGeom prst="rect">
+                      <a:avLst/>
+                    </a:prstGeom>
+                  </pic:spPr>
+                </pic:pic>
+              </a:graphicData>
+            </a:graphic>
+          </wp:inline>
+        </w:drawing>
+      </w:r>
+    </w:p>
+    <w:p>
+      <w:r>
+        <w:lastRenderedPageBreak/>
+        <w:drawing>
+          <wp:inline distT="0" distB="0" distL="0" distR="0" wp14:anchorId="0F8612A3" wp14:editId="783A161B">
+            <wp:extent cx="4979035" cy="4839970"/>
+            <wp:effectExtent l="0" t="0" r="0" b="0"/>
+            <wp:docPr id="1558109284" name="Picture 1"/>
+            <wp:cNvGraphicFramePr>
+              <a:graphicFrameLocks xmlns:a="http://schemas.openxmlformats.org/drawingml/2006/main" noChangeAspect="1"/>
+            </wp:cNvGraphicFramePr>
+            <a:graphic xmlns:a="http://schemas.openxmlformats.org/drawingml/2006/main">
+              <a:graphicData uri="http://schemas.openxmlformats.org/drawingml/2006/picture">
+                <pic:pic xmlns:pic="http://schemas.openxmlformats.org/drawingml/2006/picture">
+                  <pic:nvPicPr>
+                    <pic:cNvPr id="1558109284" name=""/>
+                    <pic:cNvPicPr/>
+                  </pic:nvPicPr>
+                  <pic:blipFill>
+                    <a:blip r:embed="rId25"/>
+                    <a:stretch>
+                      <a:fillRect/>
+                    </a:stretch>
+                  </pic:blipFill>
+                  <pic:spPr>
+                    <a:xfrm>
+                      <a:off x="0" y="0"/>
+                      <a:ext cx="4979035" cy="4839970"/>
+                    </a:xfrm>
+                    <a:prstGeom prst="rect">
+                      <a:avLst/>
+                    </a:prstGeom>
+                  </pic:spPr>
+                </pic:pic>
+              </a:graphicData>
+            </a:graphic>
+          </wp:inline>
+        </w:drawing>
+      </w:r>
+    </w:p>
+    <w:p>
+      <w:r>
+        <w:lastRenderedPageBreak/>
+        <w:drawing>
+          <wp:inline distT="0" distB="0" distL="0" distR="0" wp14:anchorId="07D915AF" wp14:editId="0408DC0C">
+            <wp:extent cx="4979035" cy="4486910"/>
+            <wp:effectExtent l="0" t="0" r="0" b="8890"/>
+            <wp:docPr id="1482182750" name="Picture 1"/>
+            <wp:cNvGraphicFramePr>
+              <a:graphicFrameLocks xmlns:a="http://schemas.openxmlformats.org/drawingml/2006/main" noChangeAspect="1"/>
+            </wp:cNvGraphicFramePr>
+            <a:graphic xmlns:a="http://schemas.openxmlformats.org/drawingml/2006/main">
+              <a:graphicData uri="http://schemas.openxmlformats.org/drawingml/2006/picture">
+                <pic:pic xmlns:pic="http://schemas.openxmlformats.org/drawingml/2006/picture">
+                  <pic:nvPicPr>
+                    <pic:cNvPr id="1482182750" name=""/>
+                    <pic:cNvPicPr/>
+                  </pic:nvPicPr>
+                  <pic:blipFill>
+                    <a:blip r:embed="rId26"/>
+                    <a:stretch>
+                      <a:fillRect/>
+                    </a:stretch>
+                  </pic:blipFill>
+                  <pic:spPr>
+                    <a:xfrm>
+                      <a:off x="0" y="0"/>
+                      <a:ext cx="4979035" cy="4486910"/>
+                    </a:xfrm>
+                    <a:prstGeom prst="rect">
+                      <a:avLst/>
+                    </a:prstGeom>
+                  </pic:spPr>
+                </pic:pic>
+              </a:graphicData>
+            </a:graphic>
+          </wp:inline>
+        </w:drawing>
+      </w:r>
+    </w:p>
+    <w:p/>
+    <w:p>
+      <w:r>
+        <w:t xml:space="preserve">Google Forms (Google, 2008) was selected for its flexibility with uploading JSON files and with its ability to send anonymous responses. </w:t>
+      </w:r>
+    </w:p>
+    <w:p>
+      <w:r>
+        <w:lastRenderedPageBreak/>
+        <w:drawing>
+          <wp:inline distT="0" distB="0" distL="0" distR="0" wp14:anchorId="4CA90BC9" wp14:editId="553AC71D">
+            <wp:extent cx="4979035" cy="6040120"/>
+            <wp:effectExtent l="0" t="0" r="0" b="0"/>
+            <wp:docPr id="2055265724" name="Picture 1"/>
+            <wp:cNvGraphicFramePr>
+              <a:graphicFrameLocks xmlns:a="http://schemas.openxmlformats.org/drawingml/2006/main" noChangeAspect="1"/>
+            </wp:cNvGraphicFramePr>
+            <a:graphic xmlns:a="http://schemas.openxmlformats.org/drawingml/2006/main">
+              <a:graphicData uri="http://schemas.openxmlformats.org/drawingml/2006/picture">
+                <pic:pic xmlns:pic="http://schemas.openxmlformats.org/drawingml/2006/picture">
+                  <pic:nvPicPr>
+                    <pic:cNvPr id="2055265724" name=""/>
+                    <pic:cNvPicPr/>
+                  </pic:nvPicPr>
+                  <pic:blipFill>
+                    <a:blip r:embed="rId27"/>
+                    <a:stretch>
+                      <a:fillRect/>
+                    </a:stretch>
+                  </pic:blipFill>
+                  <pic:spPr>
+                    <a:xfrm>
+                      <a:off x="0" y="0"/>
+                      <a:ext cx="4979035" cy="6040120"/>
+                    </a:xfrm>
+                    <a:prstGeom prst="rect">
+                      <a:avLst/>
+                    </a:prstGeom>
+                  </pic:spPr>
+                </pic:pic>
+              </a:graphicData>
+            </a:graphic>
+          </wp:inline>
+        </w:drawing>
+      </w:r>
+    </w:p>
+    <w:p>
+      <w:pPr>
+        <w:pStyle w:val="Heading1"/>
+        <w:jc w:val="center"/>
+      </w:pPr>
       <w:bookmarkStart w:id="28" w:name="_Toc92987355"/>
       <w:r>
-        <w:lastRenderedPageBreak/>
         <w:t>Chapter 4</w:t>
       </w:r>
       <w:r>
@@ -2946,7 +3322,7 @@
         </w:rPr>
         <w:t xml:space="preserve">, pp. 199–205. Available at: </w:t>
       </w:r>
-      <w:hyperlink r:id="rId21" w:history="1">
+      <w:hyperlink r:id="rId28" w:history="1">
         <w:r>
           <w:rPr>
             <w:rStyle w:val="Hyperlink"/>
@@ -3235,7 +3611,7 @@
         </w:rPr>
         <w:t xml:space="preserve">, 2(1), pp. 109-111. Available at: </w:t>
       </w:r>
-      <w:hyperlink r:id="rId22" w:history="1">
+      <w:hyperlink r:id="rId29" w:history="1">
         <w:r>
           <w:rPr>
             <w:rStyle w:val="Hyperlink"/>
@@ -3888,7 +4264,7 @@
         </w:rPr>
         <w:t xml:space="preserve">, pp. 1–8. Available at: </w:t>
       </w:r>
-      <w:hyperlink r:id="rId23" w:history="1">
+      <w:hyperlink r:id="rId30" w:history="1">
         <w:r>
           <w:rPr>
             <w:rStyle w:val="Hyperlink"/>
@@ -3998,7 +4374,7 @@
         </w:rPr>
         <w:t xml:space="preserve"> 13(11), article 304. Available at: </w:t>
       </w:r>
-      <w:hyperlink r:id="rId24" w:history="1">
+      <w:hyperlink r:id="rId31" w:history="1">
         <w:r>
           <w:rPr>
             <w:rStyle w:val="Hyperlink"/>
@@ -4242,7 +4618,7 @@
         </w:rPr>
         <w:t xml:space="preserve">, pp. 141–146. Available at: </w:t>
       </w:r>
-      <w:hyperlink r:id="rId25" w:history="1">
+      <w:hyperlink r:id="rId32" w:history="1">
         <w:r>
           <w:rPr>
             <w:rStyle w:val="Hyperlink"/>
@@ -4412,7 +4788,7 @@
         </w:rPr>
         <w:t xml:space="preserve">, pp. 75–80. Available at: </w:t>
       </w:r>
-      <w:hyperlink r:id="rId26" w:history="1">
+      <w:hyperlink r:id="rId33" w:history="1">
         <w:r>
           <w:rPr>
             <w:rStyle w:val="Hyperlink"/>
@@ -4516,7 +4892,7 @@
         </w:rPr>
         <w:t xml:space="preserve">, pp. 175–182. Available at: </w:t>
       </w:r>
-      <w:hyperlink r:id="rId27" w:history="1">
+      <w:hyperlink r:id="rId34" w:history="1">
         <w:r>
           <w:rPr>
             <w:rStyle w:val="Hyperlink"/>
@@ -4615,8 +4991,8 @@
     </w:p>
     <w:p/>
     <w:sectPr>
-      <w:headerReference w:type="default" r:id="rId28"/>
-      <w:footerReference w:type="default" r:id="rId29"/>
+      <w:headerReference w:type="default" r:id="rId35"/>
+      <w:footerReference w:type="default" r:id="rId36"/>
       <w:pgSz w:w="11906" w:h="16838"/>
       <w:pgMar w:top="1440" w:right="1797" w:bottom="1440" w:left="2268" w:header="720" w:footer="720" w:gutter="0"/>
       <w:pgNumType w:start="1"/>
@@ -6735,12 +7111,7 @@
 </file>
 
 <file path=customXml/item2.xml><?xml version="1.0" encoding="utf-8"?>
-<?mso-contentType ?>
-<FormTemplates xmlns="http://schemas.microsoft.com/sharepoint/v3/contenttype/forms">
-  <Display>DocumentLibraryForm</Display>
-  <Edit>DocumentLibraryForm</Edit>
-  <New>DocumentLibraryForm</New>
-</FormTemplates>
+<b:Sources xmlns:b="http://schemas.openxmlformats.org/officeDocument/2006/bibliography" xmlns="http://schemas.openxmlformats.org/officeDocument/2006/bibliography" SelectedStyle="\APA.XSL" StyleName="APA"/>
 </file>
 
 <file path=customXml/item3.xml><?xml version="1.0" encoding="utf-8"?>
@@ -6750,7 +7121,12 @@
 </file>
 
 <file path=customXml/item4.xml><?xml version="1.0" encoding="utf-8"?>
-<b:Sources xmlns:b="http://schemas.openxmlformats.org/officeDocument/2006/bibliography" xmlns="http://schemas.openxmlformats.org/officeDocument/2006/bibliography" SelectedStyle="\APA.XSL" StyleName="APA"/>
+<?mso-contentType ?>
+<FormTemplates xmlns="http://schemas.microsoft.com/sharepoint/v3/contenttype/forms">
+  <Display>DocumentLibraryForm</Display>
+  <Edit>DocumentLibraryForm</Edit>
+  <New>DocumentLibraryForm</New>
+</FormTemplates>
 </file>
 
 <file path=customXml/itemProps1.xml><?xml version="1.0" encoding="utf-8"?>
@@ -6773,9 +7149,9 @@
 </file>
 
 <file path=customXml/itemProps2.xml><?xml version="1.0" encoding="utf-8"?>
-<ds:datastoreItem xmlns:ds="http://schemas.openxmlformats.org/officeDocument/2006/customXml" ds:itemID="{05D9BF79-26A9-4E9A-9793-4E28B04A02DC}">
+<ds:datastoreItem xmlns:ds="http://schemas.openxmlformats.org/officeDocument/2006/customXml" ds:itemID="{79CEDF70-F74C-4284-98FC-38644A27E791}">
   <ds:schemaRefs>
-    <ds:schemaRef ds:uri="http://schemas.microsoft.com/sharepoint/v3/contenttype/forms"/>
+    <ds:schemaRef ds:uri="http://schemas.openxmlformats.org/officeDocument/2006/bibliography"/>
   </ds:schemaRefs>
 </ds:datastoreItem>
 </file>
@@ -6790,9 +7166,9 @@
 </file>
 
 <file path=customXml/itemProps4.xml><?xml version="1.0" encoding="utf-8"?>
-<ds:datastoreItem xmlns:ds="http://schemas.openxmlformats.org/officeDocument/2006/customXml" ds:itemID="{79CEDF70-F74C-4284-98FC-38644A27E791}">
+<ds:datastoreItem xmlns:ds="http://schemas.openxmlformats.org/officeDocument/2006/customXml" ds:itemID="{05D9BF79-26A9-4E9A-9793-4E28B04A02DC}">
   <ds:schemaRefs>
-    <ds:schemaRef ds:uri="http://schemas.openxmlformats.org/officeDocument/2006/bibliography"/>
+    <ds:schemaRef ds:uri="http://schemas.microsoft.com/sharepoint/v3/contenttype/forms"/>
   </ds:schemaRefs>
 </ds:datastoreItem>
 </file>
</xml_diff>

<commit_message>
added: diagrams for dissertation and more dissertation writing
</commit_message>
<xml_diff>
--- a/Documents/Dissertation w feedback 16th april.docx
+++ b/Documents/Dissertation w feedback 16th april.docx
@@ -1489,6 +1489,29 @@
           <w:rFonts w:cs="Arial"/>
           <w:kern w:val="32"/>
         </w:rPr>
+      </w:pPr>
+      <w:r>
+        <w:rPr>
+          <w:rFonts w:cs="Arial"/>
+          <w:kern w:val="32"/>
+        </w:rPr>
+        <w:t>PCG – Procedural Content Generation</w:t>
+      </w:r>
+    </w:p>
+    <w:p>
+      <w:pPr>
+        <w:rPr>
+          <w:rFonts w:cs="Arial"/>
+          <w:kern w:val="32"/>
+        </w:rPr>
+      </w:pPr>
+    </w:p>
+    <w:p>
+      <w:pPr>
+        <w:rPr>
+          <w:rFonts w:cs="Arial"/>
+          <w:kern w:val="32"/>
+        </w:rPr>
         <w:sectPr>
           <w:headerReference w:type="default" r:id="rId16"/>
           <w:footerReference w:type="default" r:id="rId17"/>
@@ -1504,7 +1527,7 @@
           <w:rFonts w:cs="Arial"/>
           <w:kern w:val="32"/>
         </w:rPr>
-        <w:t>PCG – Procedural Content Generation</w:t>
+        <w:t>UI – User Interface</w:t>
       </w:r>
     </w:p>
     <w:p>
@@ -2664,6 +2687,9 @@
         <w:t xml:space="preserve"> </w:t>
       </w:r>
       <w:r>
+        <w:rPr>
+          <w:noProof/>
+        </w:rPr>
         <w:drawing>
           <wp:inline distT="0" distB="0" distL="0" distR="0" wp14:anchorId="68A4155E" wp14:editId="26D7C67F">
             <wp:extent cx="4979035" cy="3241675"/>
@@ -2706,6 +2732,9 @@
         <w:jc w:val="center"/>
       </w:pPr>
       <w:r>
+        <w:rPr>
+          <w:noProof/>
+        </w:rPr>
         <w:drawing>
           <wp:inline distT="0" distB="0" distL="0" distR="0" wp14:anchorId="28FF215B" wp14:editId="3B2B26E6">
             <wp:extent cx="4979035" cy="2280920"/>
@@ -2856,11 +2885,14 @@
         <w:jc w:val="center"/>
       </w:pPr>
       <w:r>
+        <w:rPr>
+          <w:noProof/>
+        </w:rPr>
         <w:drawing>
-          <wp:inline distT="0" distB="0" distL="0" distR="0" wp14:anchorId="722F9DBE" wp14:editId="1EBADE04">
-            <wp:extent cx="4979035" cy="6298565"/>
-            <wp:effectExtent l="0" t="0" r="0" b="6985"/>
-            <wp:docPr id="1375497242" name="Picture 1"/>
+          <wp:inline distT="0" distB="0" distL="0" distR="0" wp14:anchorId="258EBFDC" wp14:editId="7C1A6110">
+            <wp:extent cx="4979035" cy="6295390"/>
+            <wp:effectExtent l="0" t="0" r="0" b="0"/>
+            <wp:docPr id="614634850" name="Picture 1"/>
             <wp:cNvGraphicFramePr>
               <a:graphicFrameLocks xmlns:a="http://schemas.openxmlformats.org/drawingml/2006/main" noChangeAspect="1"/>
             </wp:cNvGraphicFramePr>
@@ -2868,23 +2900,36 @@
               <a:graphicData uri="http://schemas.openxmlformats.org/drawingml/2006/picture">
                 <pic:pic xmlns:pic="http://schemas.openxmlformats.org/drawingml/2006/picture">
                   <pic:nvPicPr>
-                    <pic:cNvPr id="1375497242" name=""/>
-                    <pic:cNvPicPr/>
+                    <pic:cNvPr id="0" name="Picture 1"/>
+                    <pic:cNvPicPr>
+                      <a:picLocks noChangeAspect="1" noChangeArrowheads="1"/>
+                    </pic:cNvPicPr>
                   </pic:nvPicPr>
                   <pic:blipFill>
-                    <a:blip r:embed="rId23"/>
+                    <a:blip r:embed="rId23">
+                      <a:extLst>
+                        <a:ext uri="{28A0092B-C50C-407E-A947-70E740481C1C}">
+                          <a14:useLocalDpi xmlns:a14="http://schemas.microsoft.com/office/drawing/2010/main" val="0"/>
+                        </a:ext>
+                      </a:extLst>
+                    </a:blip>
+                    <a:srcRect/>
                     <a:stretch>
                       <a:fillRect/>
                     </a:stretch>
                   </pic:blipFill>
-                  <pic:spPr>
+                  <pic:spPr bwMode="auto">
                     <a:xfrm>
                       <a:off x="0" y="0"/>
-                      <a:ext cx="4979035" cy="6298565"/>
+                      <a:ext cx="4979035" cy="6295390"/>
                     </a:xfrm>
                     <a:prstGeom prst="rect">
                       <a:avLst/>
                     </a:prstGeom>
+                    <a:noFill/>
+                    <a:ln>
+                      <a:noFill/>
+                    </a:ln>
                   </pic:spPr>
                 </pic:pic>
               </a:graphicData>
@@ -2898,13 +2943,19 @@
         <w:pStyle w:val="Heading1"/>
         <w:jc w:val="center"/>
       </w:pPr>
-      <w:r>
+    </w:p>
+    <w:p/>
+    <w:p>
+      <w:r>
+        <w:rPr>
+          <w:noProof/>
+        </w:rPr>
         <w:lastRenderedPageBreak/>
         <w:drawing>
-          <wp:inline distT="0" distB="0" distL="0" distR="0" wp14:anchorId="7F3CC324" wp14:editId="1DFA32E1">
-            <wp:extent cx="4979035" cy="5237480"/>
-            <wp:effectExtent l="0" t="0" r="0" b="1270"/>
-            <wp:docPr id="1442658749" name="Picture 1"/>
+          <wp:inline distT="0" distB="0" distL="0" distR="0" wp14:anchorId="3EC2F55C" wp14:editId="6EEFA5FC">
+            <wp:extent cx="4979035" cy="5234940"/>
+            <wp:effectExtent l="0" t="0" r="0" b="3810"/>
+            <wp:docPr id="268349745" name="Picture 2"/>
             <wp:cNvGraphicFramePr>
               <a:graphicFrameLocks xmlns:a="http://schemas.openxmlformats.org/drawingml/2006/main" noChangeAspect="1"/>
             </wp:cNvGraphicFramePr>
@@ -2912,23 +2963,36 @@
               <a:graphicData uri="http://schemas.openxmlformats.org/drawingml/2006/picture">
                 <pic:pic xmlns:pic="http://schemas.openxmlformats.org/drawingml/2006/picture">
                   <pic:nvPicPr>
-                    <pic:cNvPr id="1442658749" name=""/>
-                    <pic:cNvPicPr/>
+                    <pic:cNvPr id="0" name="Picture 3"/>
+                    <pic:cNvPicPr>
+                      <a:picLocks noChangeAspect="1" noChangeArrowheads="1"/>
+                    </pic:cNvPicPr>
                   </pic:nvPicPr>
                   <pic:blipFill>
-                    <a:blip r:embed="rId24"/>
+                    <a:blip r:embed="rId24">
+                      <a:extLst>
+                        <a:ext uri="{28A0092B-C50C-407E-A947-70E740481C1C}">
+                          <a14:useLocalDpi xmlns:a14="http://schemas.microsoft.com/office/drawing/2010/main" val="0"/>
+                        </a:ext>
+                      </a:extLst>
+                    </a:blip>
+                    <a:srcRect/>
                     <a:stretch>
                       <a:fillRect/>
                     </a:stretch>
                   </pic:blipFill>
-                  <pic:spPr>
+                  <pic:spPr bwMode="auto">
                     <a:xfrm>
                       <a:off x="0" y="0"/>
-                      <a:ext cx="4979035" cy="5237480"/>
+                      <a:ext cx="4979035" cy="5234940"/>
                     </a:xfrm>
                     <a:prstGeom prst="rect">
                       <a:avLst/>
                     </a:prstGeom>
+                    <a:noFill/>
+                    <a:ln>
+                      <a:noFill/>
+                    </a:ln>
                   </pic:spPr>
                 </pic:pic>
               </a:graphicData>
@@ -2936,15 +3000,19 @@
           </wp:inline>
         </w:drawing>
       </w:r>
-    </w:p>
-    <w:p>
-      <w:r>
+      <w:r>
+        <w:br/>
+      </w:r>
+      <w:r>
+        <w:rPr>
+          <w:noProof/>
+        </w:rPr>
         <w:lastRenderedPageBreak/>
         <w:drawing>
-          <wp:inline distT="0" distB="0" distL="0" distR="0" wp14:anchorId="0F8612A3" wp14:editId="783A161B">
-            <wp:extent cx="4979035" cy="4839970"/>
+          <wp:inline distT="0" distB="0" distL="0" distR="0" wp14:anchorId="0540FC63" wp14:editId="172056AF">
+            <wp:extent cx="4979035" cy="4838700"/>
             <wp:effectExtent l="0" t="0" r="0" b="0"/>
-            <wp:docPr id="1558109284" name="Picture 1"/>
+            <wp:docPr id="2121104783" name="Picture 3"/>
             <wp:cNvGraphicFramePr>
               <a:graphicFrameLocks xmlns:a="http://schemas.openxmlformats.org/drawingml/2006/main" noChangeAspect="1"/>
             </wp:cNvGraphicFramePr>
@@ -2952,23 +3020,36 @@
               <a:graphicData uri="http://schemas.openxmlformats.org/drawingml/2006/picture">
                 <pic:pic xmlns:pic="http://schemas.openxmlformats.org/drawingml/2006/picture">
                   <pic:nvPicPr>
-                    <pic:cNvPr id="1558109284" name=""/>
-                    <pic:cNvPicPr/>
+                    <pic:cNvPr id="0" name="Picture 5"/>
+                    <pic:cNvPicPr>
+                      <a:picLocks noChangeAspect="1" noChangeArrowheads="1"/>
+                    </pic:cNvPicPr>
                   </pic:nvPicPr>
                   <pic:blipFill>
-                    <a:blip r:embed="rId25"/>
+                    <a:blip r:embed="rId25">
+                      <a:extLst>
+                        <a:ext uri="{28A0092B-C50C-407E-A947-70E740481C1C}">
+                          <a14:useLocalDpi xmlns:a14="http://schemas.microsoft.com/office/drawing/2010/main" val="0"/>
+                        </a:ext>
+                      </a:extLst>
+                    </a:blip>
+                    <a:srcRect/>
                     <a:stretch>
                       <a:fillRect/>
                     </a:stretch>
                   </pic:blipFill>
-                  <pic:spPr>
+                  <pic:spPr bwMode="auto">
                     <a:xfrm>
                       <a:off x="0" y="0"/>
-                      <a:ext cx="4979035" cy="4839970"/>
+                      <a:ext cx="4979035" cy="4838700"/>
                     </a:xfrm>
                     <a:prstGeom prst="rect">
                       <a:avLst/>
                     </a:prstGeom>
+                    <a:noFill/>
+                    <a:ln>
+                      <a:noFill/>
+                    </a:ln>
                   </pic:spPr>
                 </pic:pic>
               </a:graphicData>
@@ -2979,12 +3060,15 @@
     </w:p>
     <w:p>
       <w:r>
+        <w:rPr>
+          <w:noProof/>
+        </w:rPr>
         <w:lastRenderedPageBreak/>
         <w:drawing>
-          <wp:inline distT="0" distB="0" distL="0" distR="0" wp14:anchorId="07D915AF" wp14:editId="0408DC0C">
-            <wp:extent cx="4979035" cy="4486910"/>
-            <wp:effectExtent l="0" t="0" r="0" b="8890"/>
-            <wp:docPr id="1482182750" name="Picture 1"/>
+          <wp:inline distT="0" distB="0" distL="0" distR="0" wp14:anchorId="47F5DF01" wp14:editId="5CDFBB28">
+            <wp:extent cx="4979035" cy="4485640"/>
+            <wp:effectExtent l="0" t="0" r="0" b="0"/>
+            <wp:docPr id="491899199" name="Picture 4"/>
             <wp:cNvGraphicFramePr>
               <a:graphicFrameLocks xmlns:a="http://schemas.openxmlformats.org/drawingml/2006/main" noChangeAspect="1"/>
             </wp:cNvGraphicFramePr>
@@ -2992,23 +3076,36 @@
               <a:graphicData uri="http://schemas.openxmlformats.org/drawingml/2006/picture">
                 <pic:pic xmlns:pic="http://schemas.openxmlformats.org/drawingml/2006/picture">
                   <pic:nvPicPr>
-                    <pic:cNvPr id="1482182750" name=""/>
-                    <pic:cNvPicPr/>
+                    <pic:cNvPr id="0" name="Picture 7"/>
+                    <pic:cNvPicPr>
+                      <a:picLocks noChangeAspect="1" noChangeArrowheads="1"/>
+                    </pic:cNvPicPr>
                   </pic:nvPicPr>
                   <pic:blipFill>
-                    <a:blip r:embed="rId26"/>
+                    <a:blip r:embed="rId26">
+                      <a:extLst>
+                        <a:ext uri="{28A0092B-C50C-407E-A947-70E740481C1C}">
+                          <a14:useLocalDpi xmlns:a14="http://schemas.microsoft.com/office/drawing/2010/main" val="0"/>
+                        </a:ext>
+                      </a:extLst>
+                    </a:blip>
+                    <a:srcRect/>
                     <a:stretch>
                       <a:fillRect/>
                     </a:stretch>
                   </pic:blipFill>
-                  <pic:spPr>
+                  <pic:spPr bwMode="auto">
                     <a:xfrm>
                       <a:off x="0" y="0"/>
-                      <a:ext cx="4979035" cy="4486910"/>
+                      <a:ext cx="4979035" cy="4485640"/>
                     </a:xfrm>
                     <a:prstGeom prst="rect">
                       <a:avLst/>
                     </a:prstGeom>
+                    <a:noFill/>
+                    <a:ln>
+                      <a:noFill/>
+                    </a:ln>
                   </pic:spPr>
                 </pic:pic>
               </a:graphicData>
@@ -3017,15 +3114,89 @@
         </w:drawing>
       </w:r>
     </w:p>
+    <w:p>
+      <w:r>
+        <w:rPr>
+          <w:noProof/>
+        </w:rPr>
+        <w:lastRenderedPageBreak/>
+        <w:drawing>
+          <wp:inline distT="0" distB="0" distL="0" distR="0" wp14:anchorId="7FBA7DCC" wp14:editId="6A00CDBA">
+            <wp:extent cx="4979035" cy="6039485"/>
+            <wp:effectExtent l="0" t="0" r="0" b="0"/>
+            <wp:docPr id="1016528810" name="Picture 5"/>
+            <wp:cNvGraphicFramePr>
+              <a:graphicFrameLocks xmlns:a="http://schemas.openxmlformats.org/drawingml/2006/main" noChangeAspect="1"/>
+            </wp:cNvGraphicFramePr>
+            <a:graphic xmlns:a="http://schemas.openxmlformats.org/drawingml/2006/main">
+              <a:graphicData uri="http://schemas.openxmlformats.org/drawingml/2006/picture">
+                <pic:pic xmlns:pic="http://schemas.openxmlformats.org/drawingml/2006/picture">
+                  <pic:nvPicPr>
+                    <pic:cNvPr id="0" name="Picture 9"/>
+                    <pic:cNvPicPr>
+                      <a:picLocks noChangeAspect="1" noChangeArrowheads="1"/>
+                    </pic:cNvPicPr>
+                  </pic:nvPicPr>
+                  <pic:blipFill>
+                    <a:blip r:embed="rId27">
+                      <a:extLst>
+                        <a:ext uri="{28A0092B-C50C-407E-A947-70E740481C1C}">
+                          <a14:useLocalDpi xmlns:a14="http://schemas.microsoft.com/office/drawing/2010/main" val="0"/>
+                        </a:ext>
+                      </a:extLst>
+                    </a:blip>
+                    <a:srcRect/>
+                    <a:stretch>
+                      <a:fillRect/>
+                    </a:stretch>
+                  </pic:blipFill>
+                  <pic:spPr bwMode="auto">
+                    <a:xfrm>
+                      <a:off x="0" y="0"/>
+                      <a:ext cx="4979035" cy="6039485"/>
+                    </a:xfrm>
+                    <a:prstGeom prst="rect">
+                      <a:avLst/>
+                    </a:prstGeom>
+                    <a:noFill/>
+                    <a:ln>
+                      <a:noFill/>
+                    </a:ln>
+                  </pic:spPr>
+                </pic:pic>
+              </a:graphicData>
+            </a:graphic>
+          </wp:inline>
+        </w:drawing>
+      </w:r>
+    </w:p>
+    <w:p>
+      <w:r>
+        <w:t xml:space="preserve">Google Forms (Google, 2008) was selected for its flexibility with uploading JSON files and with its ability to send anonymous responses. </w:t>
+      </w:r>
+      <w:r>
+        <w:t>The survey contains 3 required questions to upload JSON files, 8 required questions, and 2 optional questions.</w:t>
+      </w:r>
+      <w:r>
+        <w:t xml:space="preserve"> Users were asked the following: their skill level in games, how often they played video games, if they are familiar with popular 3D platformer titles</w:t>
+      </w:r>
+      <w:r>
+        <w:t xml:space="preserve">, their familiarity of the 3D platformer genre, if they are aware about the concept of Procedural Generation before hearing about this project, how much they enjoyed the level from a scale of 1 to 10, what they thought about the level and wanted to see improved about it, how manageable they found their ability </w:t>
+      </w:r>
+      <w:r>
+        <w:lastRenderedPageBreak/>
+        <w:t>to change the level’s rules from a scale of 1 to 10, how accurate they thought they thought the difficulty was based on the rules from a scale of 1 to 10, and what they appreciated about the UI</w:t>
+      </w:r>
+      <w:r>
+        <w:t xml:space="preserve"> and wanted to see improved.</w:t>
+      </w:r>
+    </w:p>
     <w:p/>
     <w:p>
       <w:r>
-        <w:t xml:space="preserve">Google Forms (Google, 2008) was selected for its flexibility with uploading JSON files and with its ability to send anonymous responses. </w:t>
-      </w:r>
-    </w:p>
-    <w:p>
-      <w:r>
-        <w:lastRenderedPageBreak/>
+        <w:rPr>
+          <w:noProof/>
+        </w:rPr>
         <w:drawing>
           <wp:inline distT="0" distB="0" distL="0" distR="0" wp14:anchorId="4CA90BC9" wp14:editId="553AC71D">
             <wp:extent cx="4979035" cy="6040120"/>
@@ -3042,7 +3213,7 @@
                     <pic:cNvPicPr/>
                   </pic:nvPicPr>
                   <pic:blipFill>
-                    <a:blip r:embed="rId27"/>
+                    <a:blip r:embed="rId28"/>
                     <a:stretch>
                       <a:fillRect/>
                     </a:stretch>
@@ -3081,15 +3252,300 @@
       <w:pPr>
         <w:pStyle w:val="Heading1"/>
         <w:jc w:val="center"/>
-      </w:pPr>
-    </w:p>
+        <w:rPr>
+          <w:b w:val="0"/>
+          <w:bCs w:val="0"/>
+          <w:sz w:val="24"/>
+          <w:szCs w:val="28"/>
+        </w:rPr>
+      </w:pPr>
+      <w:r>
+        <w:rPr>
+          <w:b w:val="0"/>
+          <w:bCs w:val="0"/>
+          <w:sz w:val="24"/>
+          <w:szCs w:val="28"/>
+        </w:rPr>
+        <w:t xml:space="preserve">Participants selected were people who had either familiarity of the 3D platformer genre or people who were familiar with the concept of procedural generation, or people who had familiarity of </w:t>
+      </w:r>
+      <w:r>
+        <w:rPr>
+          <w:b w:val="0"/>
+          <w:bCs w:val="0"/>
+          <w:sz w:val="24"/>
+          <w:szCs w:val="28"/>
+        </w:rPr>
+        <w:t>both</w:t>
+      </w:r>
+      <w:r>
+        <w:rPr>
+          <w:b w:val="0"/>
+          <w:bCs w:val="0"/>
+          <w:sz w:val="24"/>
+          <w:szCs w:val="28"/>
+        </w:rPr>
+        <w:t xml:space="preserve"> areas. In </w:t>
+      </w:r>
+      <w:r>
+        <w:lastRenderedPageBreak/>
+        <w:drawing>
+          <wp:anchor distT="0" distB="0" distL="114300" distR="114300" simplePos="0" relativeHeight="251658240" behindDoc="0" locked="0" layoutInCell="1" allowOverlap="1" wp14:anchorId="1736CA34" wp14:editId="11FB9ED9">
+            <wp:simplePos x="0" y="0"/>
+            <wp:positionH relativeFrom="column">
+              <wp:posOffset>-830580</wp:posOffset>
+            </wp:positionH>
+            <wp:positionV relativeFrom="paragraph">
+              <wp:posOffset>725805</wp:posOffset>
+            </wp:positionV>
+            <wp:extent cx="6772275" cy="8131666"/>
+            <wp:effectExtent l="0" t="0" r="0" b="3175"/>
+            <wp:wrapSquare wrapText="bothSides"/>
+            <wp:docPr id="1642969571" name="Picture 1"/>
+            <wp:cNvGraphicFramePr>
+              <a:graphicFrameLocks xmlns:a="http://schemas.openxmlformats.org/drawingml/2006/main" noChangeAspect="1"/>
+            </wp:cNvGraphicFramePr>
+            <a:graphic xmlns:a="http://schemas.openxmlformats.org/drawingml/2006/main">
+              <a:graphicData uri="http://schemas.openxmlformats.org/drawingml/2006/picture">
+                <pic:pic xmlns:pic="http://schemas.openxmlformats.org/drawingml/2006/picture">
+                  <pic:nvPicPr>
+                    <pic:cNvPr id="1642969571" name=""/>
+                    <pic:cNvPicPr/>
+                  </pic:nvPicPr>
+                  <pic:blipFill>
+                    <a:blip r:embed="rId29">
+                      <a:extLst>
+                        <a:ext uri="{28A0092B-C50C-407E-A947-70E740481C1C}">
+                          <a14:useLocalDpi xmlns:a14="http://schemas.microsoft.com/office/drawing/2010/main" val="0"/>
+                        </a:ext>
+                      </a:extLst>
+                    </a:blip>
+                    <a:stretch>
+                      <a:fillRect/>
+                    </a:stretch>
+                  </pic:blipFill>
+                  <pic:spPr>
+                    <a:xfrm>
+                      <a:off x="0" y="0"/>
+                      <a:ext cx="6772684" cy="8132157"/>
+                    </a:xfrm>
+                    <a:prstGeom prst="rect">
+                      <a:avLst/>
+                    </a:prstGeom>
+                  </pic:spPr>
+                </pic:pic>
+              </a:graphicData>
+            </a:graphic>
+            <wp14:sizeRelH relativeFrom="page">
+              <wp14:pctWidth>0</wp14:pctWidth>
+            </wp14:sizeRelH>
+            <wp14:sizeRelV relativeFrom="page">
+              <wp14:pctHeight>0</wp14:pctHeight>
+            </wp14:sizeRelV>
+          </wp:anchor>
+        </w:drawing>
+      </w:r>
+      <w:r>
+        <w:rPr>
+          <w:b w:val="0"/>
+          <w:bCs w:val="0"/>
+          <w:sz w:val="24"/>
+          <w:szCs w:val="28"/>
+        </w:rPr>
+        <w:t>total, there was 18 responses for the testing.</w:t>
+      </w:r>
+      <w:r>
+        <w:rPr>
+          <w:b w:val="0"/>
+          <w:bCs w:val="0"/>
+          <w:sz w:val="24"/>
+          <w:szCs w:val="28"/>
+        </w:rPr>
+        <w:t xml:space="preserve"> What they chose for the level’s attributes, the level layout they played, and how they performed during the level was recorded.</w:t>
+      </w:r>
+    </w:p>
+    <w:p>
+      <w:r>
+        <w:lastRenderedPageBreak/>
+        <w:drawing>
+          <wp:anchor distT="0" distB="0" distL="114300" distR="114300" simplePos="0" relativeHeight="251659264" behindDoc="0" locked="0" layoutInCell="1" allowOverlap="1" wp14:anchorId="6B0262BB" wp14:editId="7CB20EB8">
+            <wp:simplePos x="0" y="0"/>
+            <wp:positionH relativeFrom="column">
+              <wp:posOffset>-1087755</wp:posOffset>
+            </wp:positionH>
+            <wp:positionV relativeFrom="paragraph">
+              <wp:posOffset>0</wp:posOffset>
+            </wp:positionV>
+            <wp:extent cx="6981825" cy="6485255"/>
+            <wp:effectExtent l="0" t="0" r="9525" b="0"/>
+            <wp:wrapSquare wrapText="bothSides"/>
+            <wp:docPr id="878124697" name="Picture 1"/>
+            <wp:cNvGraphicFramePr>
+              <a:graphicFrameLocks xmlns:a="http://schemas.openxmlformats.org/drawingml/2006/main" noChangeAspect="1"/>
+            </wp:cNvGraphicFramePr>
+            <a:graphic xmlns:a="http://schemas.openxmlformats.org/drawingml/2006/main">
+              <a:graphicData uri="http://schemas.openxmlformats.org/drawingml/2006/picture">
+                <pic:pic xmlns:pic="http://schemas.openxmlformats.org/drawingml/2006/picture">
+                  <pic:nvPicPr>
+                    <pic:cNvPr id="878124697" name=""/>
+                    <pic:cNvPicPr/>
+                  </pic:nvPicPr>
+                  <pic:blipFill>
+                    <a:blip r:embed="rId30">
+                      <a:extLst>
+                        <a:ext uri="{28A0092B-C50C-407E-A947-70E740481C1C}">
+                          <a14:useLocalDpi xmlns:a14="http://schemas.microsoft.com/office/drawing/2010/main" val="0"/>
+                        </a:ext>
+                      </a:extLst>
+                    </a:blip>
+                    <a:stretch>
+                      <a:fillRect/>
+                    </a:stretch>
+                  </pic:blipFill>
+                  <pic:spPr>
+                    <a:xfrm>
+                      <a:off x="0" y="0"/>
+                      <a:ext cx="6981825" cy="6485255"/>
+                    </a:xfrm>
+                    <a:prstGeom prst="rect">
+                      <a:avLst/>
+                    </a:prstGeom>
+                  </pic:spPr>
+                </pic:pic>
+              </a:graphicData>
+            </a:graphic>
+            <wp14:sizeRelH relativeFrom="page">
+              <wp14:pctWidth>0</wp14:pctWidth>
+            </wp14:sizeRelH>
+            <wp14:sizeRelV relativeFrom="page">
+              <wp14:pctHeight>0</wp14:pctHeight>
+            </wp14:sizeRelV>
+          </wp:anchor>
+        </w:drawing>
+      </w:r>
+    </w:p>
+    <w:p/>
+    <w:p/>
+    <w:p/>
     <w:p>
       <w:pPr>
         <w:pStyle w:val="Heading1"/>
         <w:jc w:val="center"/>
       </w:pPr>
-      <w:r>
-        <w:br w:type="page"/>
+      <w:bookmarkStart w:id="29" w:name="_Toc92987356"/>
+      <w:r>
+        <w:lastRenderedPageBreak/>
+        <w:drawing>
+          <wp:anchor distT="0" distB="0" distL="114300" distR="114300" simplePos="0" relativeHeight="251661312" behindDoc="0" locked="0" layoutInCell="1" allowOverlap="1" wp14:anchorId="4DE8B8A1" wp14:editId="7ADE048C">
+            <wp:simplePos x="0" y="0"/>
+            <wp:positionH relativeFrom="margin">
+              <wp:posOffset>-1198880</wp:posOffset>
+            </wp:positionH>
+            <wp:positionV relativeFrom="paragraph">
+              <wp:posOffset>4571365</wp:posOffset>
+            </wp:positionV>
+            <wp:extent cx="7082155" cy="4110990"/>
+            <wp:effectExtent l="0" t="0" r="4445" b="3810"/>
+            <wp:wrapSquare wrapText="bothSides"/>
+            <wp:docPr id="216449415" name="Picture 1"/>
+            <wp:cNvGraphicFramePr>
+              <a:graphicFrameLocks xmlns:a="http://schemas.openxmlformats.org/drawingml/2006/main" noChangeAspect="1"/>
+            </wp:cNvGraphicFramePr>
+            <a:graphic xmlns:a="http://schemas.openxmlformats.org/drawingml/2006/main">
+              <a:graphicData uri="http://schemas.openxmlformats.org/drawingml/2006/picture">
+                <pic:pic xmlns:pic="http://schemas.openxmlformats.org/drawingml/2006/picture">
+                  <pic:nvPicPr>
+                    <pic:cNvPr id="216449415" name=""/>
+                    <pic:cNvPicPr/>
+                  </pic:nvPicPr>
+                  <pic:blipFill>
+                    <a:blip r:embed="rId31">
+                      <a:extLst>
+                        <a:ext uri="{28A0092B-C50C-407E-A947-70E740481C1C}">
+                          <a14:useLocalDpi xmlns:a14="http://schemas.microsoft.com/office/drawing/2010/main" val="0"/>
+                        </a:ext>
+                      </a:extLst>
+                    </a:blip>
+                    <a:stretch>
+                      <a:fillRect/>
+                    </a:stretch>
+                  </pic:blipFill>
+                  <pic:spPr>
+                    <a:xfrm>
+                      <a:off x="0" y="0"/>
+                      <a:ext cx="7082155" cy="4110990"/>
+                    </a:xfrm>
+                    <a:prstGeom prst="rect">
+                      <a:avLst/>
+                    </a:prstGeom>
+                  </pic:spPr>
+                </pic:pic>
+              </a:graphicData>
+            </a:graphic>
+            <wp14:sizeRelH relativeFrom="page">
+              <wp14:pctWidth>0</wp14:pctWidth>
+            </wp14:sizeRelH>
+            <wp14:sizeRelV relativeFrom="page">
+              <wp14:pctHeight>0</wp14:pctHeight>
+            </wp14:sizeRelV>
+          </wp:anchor>
+        </w:drawing>
+      </w:r>
+      <w:r>
+        <w:drawing>
+          <wp:anchor distT="0" distB="0" distL="114300" distR="114300" simplePos="0" relativeHeight="251660288" behindDoc="0" locked="0" layoutInCell="1" allowOverlap="1" wp14:anchorId="67E1FDB5" wp14:editId="137F6E08">
+            <wp:simplePos x="0" y="0"/>
+            <wp:positionH relativeFrom="margin">
+              <wp:posOffset>-1421130</wp:posOffset>
+            </wp:positionH>
+            <wp:positionV relativeFrom="paragraph">
+              <wp:posOffset>0</wp:posOffset>
+            </wp:positionV>
+            <wp:extent cx="7437755" cy="4419600"/>
+            <wp:effectExtent l="0" t="0" r="0" b="0"/>
+            <wp:wrapSquare wrapText="bothSides"/>
+            <wp:docPr id="1651715452" name="Picture 1"/>
+            <wp:cNvGraphicFramePr>
+              <a:graphicFrameLocks xmlns:a="http://schemas.openxmlformats.org/drawingml/2006/main" noChangeAspect="1"/>
+            </wp:cNvGraphicFramePr>
+            <a:graphic xmlns:a="http://schemas.openxmlformats.org/drawingml/2006/main">
+              <a:graphicData uri="http://schemas.openxmlformats.org/drawingml/2006/picture">
+                <pic:pic xmlns:pic="http://schemas.openxmlformats.org/drawingml/2006/picture">
+                  <pic:nvPicPr>
+                    <pic:cNvPr id="1651715452" name=""/>
+                    <pic:cNvPicPr/>
+                  </pic:nvPicPr>
+                  <pic:blipFill>
+                    <a:blip r:embed="rId32">
+                      <a:extLst>
+                        <a:ext uri="{28A0092B-C50C-407E-A947-70E740481C1C}">
+                          <a14:useLocalDpi xmlns:a14="http://schemas.microsoft.com/office/drawing/2010/main" val="0"/>
+                        </a:ext>
+                      </a:extLst>
+                    </a:blip>
+                    <a:stretch>
+                      <a:fillRect/>
+                    </a:stretch>
+                  </pic:blipFill>
+                  <pic:spPr>
+                    <a:xfrm>
+                      <a:off x="0" y="0"/>
+                      <a:ext cx="7437755" cy="4419600"/>
+                    </a:xfrm>
+                    <a:prstGeom prst="rect">
+                      <a:avLst/>
+                    </a:prstGeom>
+                  </pic:spPr>
+                </pic:pic>
+              </a:graphicData>
+            </a:graphic>
+            <wp14:sizeRelH relativeFrom="page">
+              <wp14:pctWidth>0</wp14:pctWidth>
+            </wp14:sizeRelH>
+            <wp14:sizeRelV relativeFrom="page">
+              <wp14:pctHeight>0</wp14:pctHeight>
+            </wp14:sizeRelV>
+          </wp:anchor>
+        </w:drawing>
       </w:r>
     </w:p>
     <w:p>
@@ -3097,9 +3553,25 @@
         <w:pStyle w:val="Heading1"/>
         <w:jc w:val="center"/>
       </w:pPr>
-      <w:bookmarkStart w:id="29" w:name="_Toc92987356"/>
-      <w:r>
-        <w:lastRenderedPageBreak/>
+    </w:p>
+    <w:p>
+      <w:pPr>
+        <w:pStyle w:val="Heading1"/>
+        <w:jc w:val="center"/>
+      </w:pPr>
+    </w:p>
+    <w:p>
+      <w:pPr>
+        <w:pStyle w:val="Heading1"/>
+        <w:jc w:val="center"/>
+      </w:pPr>
+    </w:p>
+    <w:p>
+      <w:pPr>
+        <w:pStyle w:val="Heading1"/>
+        <w:jc w:val="center"/>
+      </w:pPr>
+      <w:r>
         <w:t>Chapter 5</w:t>
       </w:r>
       <w:r>
@@ -3322,7 +3794,7 @@
         </w:rPr>
         <w:t xml:space="preserve">, pp. 199–205. Available at: </w:t>
       </w:r>
-      <w:hyperlink r:id="rId28" w:history="1">
+      <w:hyperlink r:id="rId33" w:history="1">
         <w:r>
           <w:rPr>
             <w:rStyle w:val="Hyperlink"/>
@@ -3611,7 +4083,7 @@
         </w:rPr>
         <w:t xml:space="preserve">, 2(1), pp. 109-111. Available at: </w:t>
       </w:r>
-      <w:hyperlink r:id="rId29" w:history="1">
+      <w:hyperlink r:id="rId34" w:history="1">
         <w:r>
           <w:rPr>
             <w:rStyle w:val="Hyperlink"/>
@@ -4264,7 +4736,7 @@
         </w:rPr>
         <w:t xml:space="preserve">, pp. 1–8. Available at: </w:t>
       </w:r>
-      <w:hyperlink r:id="rId30" w:history="1">
+      <w:hyperlink r:id="rId35" w:history="1">
         <w:r>
           <w:rPr>
             <w:rStyle w:val="Hyperlink"/>
@@ -4374,7 +4846,7 @@
         </w:rPr>
         <w:t xml:space="preserve"> 13(11), article 304. Available at: </w:t>
       </w:r>
-      <w:hyperlink r:id="rId31" w:history="1">
+      <w:hyperlink r:id="rId36" w:history="1">
         <w:r>
           <w:rPr>
             <w:rStyle w:val="Hyperlink"/>
@@ -4618,7 +5090,7 @@
         </w:rPr>
         <w:t xml:space="preserve">, pp. 141–146. Available at: </w:t>
       </w:r>
-      <w:hyperlink r:id="rId32" w:history="1">
+      <w:hyperlink r:id="rId37" w:history="1">
         <w:r>
           <w:rPr>
             <w:rStyle w:val="Hyperlink"/>
@@ -4788,7 +5260,7 @@
         </w:rPr>
         <w:t xml:space="preserve">, pp. 75–80. Available at: </w:t>
       </w:r>
-      <w:hyperlink r:id="rId33" w:history="1">
+      <w:hyperlink r:id="rId38" w:history="1">
         <w:r>
           <w:rPr>
             <w:rStyle w:val="Hyperlink"/>
@@ -4892,7 +5364,7 @@
         </w:rPr>
         <w:t xml:space="preserve">, pp. 175–182. Available at: </w:t>
       </w:r>
-      <w:hyperlink r:id="rId34" w:history="1">
+      <w:hyperlink r:id="rId39" w:history="1">
         <w:r>
           <w:rPr>
             <w:rStyle w:val="Hyperlink"/>
@@ -4991,8 +5463,8 @@
     </w:p>
     <w:p/>
     <w:sectPr>
-      <w:headerReference w:type="default" r:id="rId35"/>
-      <w:footerReference w:type="default" r:id="rId36"/>
+      <w:headerReference w:type="default" r:id="rId40"/>
+      <w:footerReference w:type="default" r:id="rId41"/>
       <w:pgSz w:w="11906" w:h="16838"/>
       <w:pgMar w:top="1440" w:right="1797" w:bottom="1440" w:left="2268" w:header="720" w:footer="720" w:gutter="0"/>
       <w:pgNumType w:start="1"/>
@@ -6368,7 +6840,6 @@
   <w:style w:type="character" w:default="1" w:styleId="DefaultParagraphFont">
     <w:name w:val="Default Paragraph Font"/>
     <w:uiPriority w:val="1"/>
-    <w:semiHidden/>
     <w:unhideWhenUsed/>
   </w:style>
   <w:style w:type="table" w:default="1" w:styleId="TableNormal">
@@ -6902,6 +7373,10 @@
 </file>
 
 <file path=customXml/item1.xml><?xml version="1.0" encoding="utf-8"?>
+<b:Sources xmlns:b="http://schemas.openxmlformats.org/officeDocument/2006/bibliography" xmlns="http://schemas.openxmlformats.org/officeDocument/2006/bibliography" SelectedStyle="\APA.XSL" StyleName="APA"/>
+</file>
+
+<file path=customXml/item2.xml><?xml version="1.0" encoding="utf-8"?>
 <ct:contentTypeSchema xmlns:ct="http://schemas.microsoft.com/office/2006/metadata/contentType" xmlns:ma="http://schemas.microsoft.com/office/2006/metadata/properties/metaAttributes" ct:_="" ma:_="" ma:contentTypeName="Document" ma:contentTypeID="0x01010033553FA8616F3A45AD369E275EA42271" ma:contentTypeVersion="11" ma:contentTypeDescription="Create a new document." ma:contentTypeScope="" ma:versionID="8eb4e0804d077bcc139b361cda3a640c">
   <xsd:schema xmlns:xsd="http://www.w3.org/2001/XMLSchema" xmlns:xs="http://www.w3.org/2001/XMLSchema" xmlns:p="http://schemas.microsoft.com/office/2006/metadata/properties" xmlns:ns3="371a10d4-9e19-41a9-948b-d1cca29b4cb6" xmlns:ns4="18dffc30-a361-43f0-bb4a-1f62e819a6f2" targetNamespace="http://schemas.microsoft.com/office/2006/metadata/properties" ma:root="true" ma:fieldsID="ac8e08ff64368403dfb4d2274f8d7465" ns3:_="" ns4:_="">
     <xsd:import namespace="371a10d4-9e19-41a9-948b-d1cca29b4cb6"/>
@@ -7110,17 +7585,7 @@
 </ct:contentTypeSchema>
 </file>
 
-<file path=customXml/item2.xml><?xml version="1.0" encoding="utf-8"?>
-<b:Sources xmlns:b="http://schemas.openxmlformats.org/officeDocument/2006/bibliography" xmlns="http://schemas.openxmlformats.org/officeDocument/2006/bibliography" SelectedStyle="\APA.XSL" StyleName="APA"/>
-</file>
-
 <file path=customXml/item3.xml><?xml version="1.0" encoding="utf-8"?>
-<p:properties xmlns:p="http://schemas.microsoft.com/office/2006/metadata/properties" xmlns:xsi="http://www.w3.org/2001/XMLSchema-instance" xmlns:pc="http://schemas.microsoft.com/office/infopath/2007/PartnerControls">
-  <documentManagement/>
-</p:properties>
-</file>
-
-<file path=customXml/item4.xml><?xml version="1.0" encoding="utf-8"?>
 <?mso-contentType ?>
 <FormTemplates xmlns="http://schemas.microsoft.com/sharepoint/v3/contenttype/forms">
   <Display>DocumentLibraryForm</Display>
@@ -7129,7 +7594,21 @@
 </FormTemplates>
 </file>
 
+<file path=customXml/item4.xml><?xml version="1.0" encoding="utf-8"?>
+<p:properties xmlns:p="http://schemas.microsoft.com/office/2006/metadata/properties" xmlns:xsi="http://www.w3.org/2001/XMLSchema-instance" xmlns:pc="http://schemas.microsoft.com/office/infopath/2007/PartnerControls">
+  <documentManagement/>
+</p:properties>
+</file>
+
 <file path=customXml/itemProps1.xml><?xml version="1.0" encoding="utf-8"?>
+<ds:datastoreItem xmlns:ds="http://schemas.openxmlformats.org/officeDocument/2006/customXml" ds:itemID="{79CEDF70-F74C-4284-98FC-38644A27E791}">
+  <ds:schemaRefs>
+    <ds:schemaRef ds:uri="http://schemas.openxmlformats.org/officeDocument/2006/bibliography"/>
+  </ds:schemaRefs>
+</ds:datastoreItem>
+</file>
+
+<file path=customXml/itemProps2.xml><?xml version="1.0" encoding="utf-8"?>
 <ds:datastoreItem xmlns:ds="http://schemas.openxmlformats.org/officeDocument/2006/customXml" ds:itemID="{307A6BE8-0D48-4A7D-A535-369CCDFBF2CB}">
   <ds:schemaRefs>
     <ds:schemaRef ds:uri="http://schemas.microsoft.com/office/2006/metadata/contentType"/>
@@ -7148,27 +7627,19 @@
 </ds:datastoreItem>
 </file>
 
-<file path=customXml/itemProps2.xml><?xml version="1.0" encoding="utf-8"?>
-<ds:datastoreItem xmlns:ds="http://schemas.openxmlformats.org/officeDocument/2006/customXml" ds:itemID="{79CEDF70-F74C-4284-98FC-38644A27E791}">
+<file path=customXml/itemProps3.xml><?xml version="1.0" encoding="utf-8"?>
+<ds:datastoreItem xmlns:ds="http://schemas.openxmlformats.org/officeDocument/2006/customXml" ds:itemID="{05D9BF79-26A9-4E9A-9793-4E28B04A02DC}">
   <ds:schemaRefs>
-    <ds:schemaRef ds:uri="http://schemas.openxmlformats.org/officeDocument/2006/bibliography"/>
+    <ds:schemaRef ds:uri="http://schemas.microsoft.com/sharepoint/v3/contenttype/forms"/>
   </ds:schemaRefs>
 </ds:datastoreItem>
 </file>
 
-<file path=customXml/itemProps3.xml><?xml version="1.0" encoding="utf-8"?>
+<file path=customXml/itemProps4.xml><?xml version="1.0" encoding="utf-8"?>
 <ds:datastoreItem xmlns:ds="http://schemas.openxmlformats.org/officeDocument/2006/customXml" ds:itemID="{10A8F88B-6E38-47A8-8074-155E10D59BDF}">
   <ds:schemaRefs>
     <ds:schemaRef ds:uri="http://schemas.microsoft.com/office/2006/metadata/properties"/>
     <ds:schemaRef ds:uri="http://schemas.microsoft.com/office/infopath/2007/PartnerControls"/>
   </ds:schemaRefs>
 </ds:datastoreItem>
-</file>
-
-<file path=customXml/itemProps4.xml><?xml version="1.0" encoding="utf-8"?>
-<ds:datastoreItem xmlns:ds="http://schemas.openxmlformats.org/officeDocument/2006/customXml" ds:itemID="{05D9BF79-26A9-4E9A-9793-4E28B04A02DC}">
-  <ds:schemaRefs>
-    <ds:schemaRef ds:uri="http://schemas.microsoft.com/sharepoint/v3/contenttype/forms"/>
-  </ds:schemaRefs>
-</ds:datastoreItem>
 </file>
</xml_diff>

<commit_message>
added: diagrams for dissertation
</commit_message>
<xml_diff>
--- a/Documents/Dissertation w feedback 16th april.docx
+++ b/Documents/Dissertation w feedback 16th april.docx
@@ -1489,6 +1489,29 @@
           <w:rFonts w:cs="Arial"/>
           <w:kern w:val="32"/>
         </w:rPr>
+      </w:pPr>
+      <w:r>
+        <w:rPr>
+          <w:rFonts w:cs="Arial"/>
+          <w:kern w:val="32"/>
+        </w:rPr>
+        <w:t>PCG – Procedural Content Generation</w:t>
+      </w:r>
+    </w:p>
+    <w:p>
+      <w:pPr>
+        <w:rPr>
+          <w:rFonts w:cs="Arial"/>
+          <w:kern w:val="32"/>
+        </w:rPr>
+      </w:pPr>
+    </w:p>
+    <w:p>
+      <w:pPr>
+        <w:rPr>
+          <w:rFonts w:cs="Arial"/>
+          <w:kern w:val="32"/>
+        </w:rPr>
         <w:sectPr>
           <w:headerReference w:type="default" r:id="rId16"/>
           <w:footerReference w:type="default" r:id="rId17"/>
@@ -1504,7 +1527,7 @@
           <w:rFonts w:cs="Arial"/>
           <w:kern w:val="32"/>
         </w:rPr>
-        <w:t>PCG – Procedural Content Generation</w:t>
+        <w:t>UI – User Interface</w:t>
       </w:r>
     </w:p>
     <w:p>
@@ -2664,6 +2687,9 @@
         <w:t xml:space="preserve"> </w:t>
       </w:r>
       <w:r>
+        <w:rPr>
+          <w:noProof/>
+        </w:rPr>
         <w:drawing>
           <wp:inline distT="0" distB="0" distL="0" distR="0" wp14:anchorId="68A4155E" wp14:editId="26D7C67F">
             <wp:extent cx="4979035" cy="3241675"/>
@@ -2706,6 +2732,9 @@
         <w:jc w:val="center"/>
       </w:pPr>
       <w:r>
+        <w:rPr>
+          <w:noProof/>
+        </w:rPr>
         <w:drawing>
           <wp:inline distT="0" distB="0" distL="0" distR="0" wp14:anchorId="28FF215B" wp14:editId="3B2B26E6">
             <wp:extent cx="4979035" cy="2280920"/>
@@ -2856,11 +2885,14 @@
         <w:jc w:val="center"/>
       </w:pPr>
       <w:r>
+        <w:rPr>
+          <w:noProof/>
+        </w:rPr>
         <w:drawing>
-          <wp:inline distT="0" distB="0" distL="0" distR="0" wp14:anchorId="722F9DBE" wp14:editId="1EBADE04">
-            <wp:extent cx="4979035" cy="6298565"/>
-            <wp:effectExtent l="0" t="0" r="0" b="6985"/>
-            <wp:docPr id="1375497242" name="Picture 1"/>
+          <wp:inline distT="0" distB="0" distL="0" distR="0" wp14:anchorId="258EBFDC" wp14:editId="7C1A6110">
+            <wp:extent cx="4979035" cy="6295390"/>
+            <wp:effectExtent l="0" t="0" r="0" b="0"/>
+            <wp:docPr id="614634850" name="Picture 1"/>
             <wp:cNvGraphicFramePr>
               <a:graphicFrameLocks xmlns:a="http://schemas.openxmlformats.org/drawingml/2006/main" noChangeAspect="1"/>
             </wp:cNvGraphicFramePr>
@@ -2868,23 +2900,36 @@
               <a:graphicData uri="http://schemas.openxmlformats.org/drawingml/2006/picture">
                 <pic:pic xmlns:pic="http://schemas.openxmlformats.org/drawingml/2006/picture">
                   <pic:nvPicPr>
-                    <pic:cNvPr id="1375497242" name=""/>
-                    <pic:cNvPicPr/>
+                    <pic:cNvPr id="0" name="Picture 1"/>
+                    <pic:cNvPicPr>
+                      <a:picLocks noChangeAspect="1" noChangeArrowheads="1"/>
+                    </pic:cNvPicPr>
                   </pic:nvPicPr>
                   <pic:blipFill>
-                    <a:blip r:embed="rId23"/>
+                    <a:blip r:embed="rId23">
+                      <a:extLst>
+                        <a:ext uri="{28A0092B-C50C-407E-A947-70E740481C1C}">
+                          <a14:useLocalDpi xmlns:a14="http://schemas.microsoft.com/office/drawing/2010/main" val="0"/>
+                        </a:ext>
+                      </a:extLst>
+                    </a:blip>
+                    <a:srcRect/>
                     <a:stretch>
                       <a:fillRect/>
                     </a:stretch>
                   </pic:blipFill>
-                  <pic:spPr>
+                  <pic:spPr bwMode="auto">
                     <a:xfrm>
                       <a:off x="0" y="0"/>
-                      <a:ext cx="4979035" cy="6298565"/>
+                      <a:ext cx="4979035" cy="6295390"/>
                     </a:xfrm>
                     <a:prstGeom prst="rect">
                       <a:avLst/>
                     </a:prstGeom>
+                    <a:noFill/>
+                    <a:ln>
+                      <a:noFill/>
+                    </a:ln>
                   </pic:spPr>
                 </pic:pic>
               </a:graphicData>
@@ -2898,13 +2943,19 @@
         <w:pStyle w:val="Heading1"/>
         <w:jc w:val="center"/>
       </w:pPr>
-      <w:r>
+    </w:p>
+    <w:p/>
+    <w:p>
+      <w:r>
+        <w:rPr>
+          <w:noProof/>
+        </w:rPr>
         <w:lastRenderedPageBreak/>
         <w:drawing>
-          <wp:inline distT="0" distB="0" distL="0" distR="0" wp14:anchorId="7F3CC324" wp14:editId="1DFA32E1">
-            <wp:extent cx="4979035" cy="5237480"/>
-            <wp:effectExtent l="0" t="0" r="0" b="1270"/>
-            <wp:docPr id="1442658749" name="Picture 1"/>
+          <wp:inline distT="0" distB="0" distL="0" distR="0" wp14:anchorId="3EC2F55C" wp14:editId="6EEFA5FC">
+            <wp:extent cx="4979035" cy="5234940"/>
+            <wp:effectExtent l="0" t="0" r="0" b="3810"/>
+            <wp:docPr id="268349745" name="Picture 2"/>
             <wp:cNvGraphicFramePr>
               <a:graphicFrameLocks xmlns:a="http://schemas.openxmlformats.org/drawingml/2006/main" noChangeAspect="1"/>
             </wp:cNvGraphicFramePr>
@@ -2912,23 +2963,36 @@
               <a:graphicData uri="http://schemas.openxmlformats.org/drawingml/2006/picture">
                 <pic:pic xmlns:pic="http://schemas.openxmlformats.org/drawingml/2006/picture">
                   <pic:nvPicPr>
-                    <pic:cNvPr id="1442658749" name=""/>
-                    <pic:cNvPicPr/>
+                    <pic:cNvPr id="0" name="Picture 3"/>
+                    <pic:cNvPicPr>
+                      <a:picLocks noChangeAspect="1" noChangeArrowheads="1"/>
+                    </pic:cNvPicPr>
                   </pic:nvPicPr>
                   <pic:blipFill>
-                    <a:blip r:embed="rId24"/>
+                    <a:blip r:embed="rId24">
+                      <a:extLst>
+                        <a:ext uri="{28A0092B-C50C-407E-A947-70E740481C1C}">
+                          <a14:useLocalDpi xmlns:a14="http://schemas.microsoft.com/office/drawing/2010/main" val="0"/>
+                        </a:ext>
+                      </a:extLst>
+                    </a:blip>
+                    <a:srcRect/>
                     <a:stretch>
                       <a:fillRect/>
                     </a:stretch>
                   </pic:blipFill>
-                  <pic:spPr>
+                  <pic:spPr bwMode="auto">
                     <a:xfrm>
                       <a:off x="0" y="0"/>
-                      <a:ext cx="4979035" cy="5237480"/>
+                      <a:ext cx="4979035" cy="5234940"/>
                     </a:xfrm>
                     <a:prstGeom prst="rect">
                       <a:avLst/>
                     </a:prstGeom>
+                    <a:noFill/>
+                    <a:ln>
+                      <a:noFill/>
+                    </a:ln>
                   </pic:spPr>
                 </pic:pic>
               </a:graphicData>
@@ -2936,15 +3000,19 @@
           </wp:inline>
         </w:drawing>
       </w:r>
-    </w:p>
-    <w:p>
-      <w:r>
+      <w:r>
+        <w:br/>
+      </w:r>
+      <w:r>
+        <w:rPr>
+          <w:noProof/>
+        </w:rPr>
         <w:lastRenderedPageBreak/>
         <w:drawing>
-          <wp:inline distT="0" distB="0" distL="0" distR="0" wp14:anchorId="0F8612A3" wp14:editId="783A161B">
-            <wp:extent cx="4979035" cy="4839970"/>
+          <wp:inline distT="0" distB="0" distL="0" distR="0" wp14:anchorId="0540FC63" wp14:editId="172056AF">
+            <wp:extent cx="4979035" cy="4838700"/>
             <wp:effectExtent l="0" t="0" r="0" b="0"/>
-            <wp:docPr id="1558109284" name="Picture 1"/>
+            <wp:docPr id="2121104783" name="Picture 3"/>
             <wp:cNvGraphicFramePr>
               <a:graphicFrameLocks xmlns:a="http://schemas.openxmlformats.org/drawingml/2006/main" noChangeAspect="1"/>
             </wp:cNvGraphicFramePr>
@@ -2952,23 +3020,36 @@
               <a:graphicData uri="http://schemas.openxmlformats.org/drawingml/2006/picture">
                 <pic:pic xmlns:pic="http://schemas.openxmlformats.org/drawingml/2006/picture">
                   <pic:nvPicPr>
-                    <pic:cNvPr id="1558109284" name=""/>
-                    <pic:cNvPicPr/>
+                    <pic:cNvPr id="0" name="Picture 5"/>
+                    <pic:cNvPicPr>
+                      <a:picLocks noChangeAspect="1" noChangeArrowheads="1"/>
+                    </pic:cNvPicPr>
                   </pic:nvPicPr>
                   <pic:blipFill>
-                    <a:blip r:embed="rId25"/>
+                    <a:blip r:embed="rId25">
+                      <a:extLst>
+                        <a:ext uri="{28A0092B-C50C-407E-A947-70E740481C1C}">
+                          <a14:useLocalDpi xmlns:a14="http://schemas.microsoft.com/office/drawing/2010/main" val="0"/>
+                        </a:ext>
+                      </a:extLst>
+                    </a:blip>
+                    <a:srcRect/>
                     <a:stretch>
                       <a:fillRect/>
                     </a:stretch>
                   </pic:blipFill>
-                  <pic:spPr>
+                  <pic:spPr bwMode="auto">
                     <a:xfrm>
                       <a:off x="0" y="0"/>
-                      <a:ext cx="4979035" cy="4839970"/>
+                      <a:ext cx="4979035" cy="4838700"/>
                     </a:xfrm>
                     <a:prstGeom prst="rect">
                       <a:avLst/>
                     </a:prstGeom>
+                    <a:noFill/>
+                    <a:ln>
+                      <a:noFill/>
+                    </a:ln>
                   </pic:spPr>
                 </pic:pic>
               </a:graphicData>
@@ -2979,12 +3060,15 @@
     </w:p>
     <w:p>
       <w:r>
+        <w:rPr>
+          <w:noProof/>
+        </w:rPr>
         <w:lastRenderedPageBreak/>
         <w:drawing>
-          <wp:inline distT="0" distB="0" distL="0" distR="0" wp14:anchorId="07D915AF" wp14:editId="0408DC0C">
-            <wp:extent cx="4979035" cy="4486910"/>
-            <wp:effectExtent l="0" t="0" r="0" b="8890"/>
-            <wp:docPr id="1482182750" name="Picture 1"/>
+          <wp:inline distT="0" distB="0" distL="0" distR="0" wp14:anchorId="47F5DF01" wp14:editId="5CDFBB28">
+            <wp:extent cx="4979035" cy="4485640"/>
+            <wp:effectExtent l="0" t="0" r="0" b="0"/>
+            <wp:docPr id="491899199" name="Picture 4"/>
             <wp:cNvGraphicFramePr>
               <a:graphicFrameLocks xmlns:a="http://schemas.openxmlformats.org/drawingml/2006/main" noChangeAspect="1"/>
             </wp:cNvGraphicFramePr>
@@ -2992,23 +3076,36 @@
               <a:graphicData uri="http://schemas.openxmlformats.org/drawingml/2006/picture">
                 <pic:pic xmlns:pic="http://schemas.openxmlformats.org/drawingml/2006/picture">
                   <pic:nvPicPr>
-                    <pic:cNvPr id="1482182750" name=""/>
-                    <pic:cNvPicPr/>
+                    <pic:cNvPr id="0" name="Picture 7"/>
+                    <pic:cNvPicPr>
+                      <a:picLocks noChangeAspect="1" noChangeArrowheads="1"/>
+                    </pic:cNvPicPr>
                   </pic:nvPicPr>
                   <pic:blipFill>
-                    <a:blip r:embed="rId26"/>
+                    <a:blip r:embed="rId26">
+                      <a:extLst>
+                        <a:ext uri="{28A0092B-C50C-407E-A947-70E740481C1C}">
+                          <a14:useLocalDpi xmlns:a14="http://schemas.microsoft.com/office/drawing/2010/main" val="0"/>
+                        </a:ext>
+                      </a:extLst>
+                    </a:blip>
+                    <a:srcRect/>
                     <a:stretch>
                       <a:fillRect/>
                     </a:stretch>
                   </pic:blipFill>
-                  <pic:spPr>
+                  <pic:spPr bwMode="auto">
                     <a:xfrm>
                       <a:off x="0" y="0"/>
-                      <a:ext cx="4979035" cy="4486910"/>
+                      <a:ext cx="4979035" cy="4485640"/>
                     </a:xfrm>
                     <a:prstGeom prst="rect">
                       <a:avLst/>
                     </a:prstGeom>
+                    <a:noFill/>
+                    <a:ln>
+                      <a:noFill/>
+                    </a:ln>
                   </pic:spPr>
                 </pic:pic>
               </a:graphicData>
@@ -3017,15 +3114,89 @@
         </w:drawing>
       </w:r>
     </w:p>
+    <w:p>
+      <w:r>
+        <w:rPr>
+          <w:noProof/>
+        </w:rPr>
+        <w:lastRenderedPageBreak/>
+        <w:drawing>
+          <wp:inline distT="0" distB="0" distL="0" distR="0" wp14:anchorId="7FBA7DCC" wp14:editId="6A00CDBA">
+            <wp:extent cx="4979035" cy="6039485"/>
+            <wp:effectExtent l="0" t="0" r="0" b="0"/>
+            <wp:docPr id="1016528810" name="Picture 5"/>
+            <wp:cNvGraphicFramePr>
+              <a:graphicFrameLocks xmlns:a="http://schemas.openxmlformats.org/drawingml/2006/main" noChangeAspect="1"/>
+            </wp:cNvGraphicFramePr>
+            <a:graphic xmlns:a="http://schemas.openxmlformats.org/drawingml/2006/main">
+              <a:graphicData uri="http://schemas.openxmlformats.org/drawingml/2006/picture">
+                <pic:pic xmlns:pic="http://schemas.openxmlformats.org/drawingml/2006/picture">
+                  <pic:nvPicPr>
+                    <pic:cNvPr id="0" name="Picture 9"/>
+                    <pic:cNvPicPr>
+                      <a:picLocks noChangeAspect="1" noChangeArrowheads="1"/>
+                    </pic:cNvPicPr>
+                  </pic:nvPicPr>
+                  <pic:blipFill>
+                    <a:blip r:embed="rId27">
+                      <a:extLst>
+                        <a:ext uri="{28A0092B-C50C-407E-A947-70E740481C1C}">
+                          <a14:useLocalDpi xmlns:a14="http://schemas.microsoft.com/office/drawing/2010/main" val="0"/>
+                        </a:ext>
+                      </a:extLst>
+                    </a:blip>
+                    <a:srcRect/>
+                    <a:stretch>
+                      <a:fillRect/>
+                    </a:stretch>
+                  </pic:blipFill>
+                  <pic:spPr bwMode="auto">
+                    <a:xfrm>
+                      <a:off x="0" y="0"/>
+                      <a:ext cx="4979035" cy="6039485"/>
+                    </a:xfrm>
+                    <a:prstGeom prst="rect">
+                      <a:avLst/>
+                    </a:prstGeom>
+                    <a:noFill/>
+                    <a:ln>
+                      <a:noFill/>
+                    </a:ln>
+                  </pic:spPr>
+                </pic:pic>
+              </a:graphicData>
+            </a:graphic>
+          </wp:inline>
+        </w:drawing>
+      </w:r>
+    </w:p>
+    <w:p>
+      <w:r>
+        <w:t xml:space="preserve">Google Forms (Google, 2008) was selected for its flexibility with uploading JSON files and with its ability to send anonymous responses. </w:t>
+      </w:r>
+      <w:r>
+        <w:t>The survey contains 3 required questions to upload JSON files, 8 required questions, and 2 optional questions.</w:t>
+      </w:r>
+      <w:r>
+        <w:t xml:space="preserve"> Users were asked the following: their skill level in games, how often they played video games, if they are familiar with popular 3D platformer titles</w:t>
+      </w:r>
+      <w:r>
+        <w:t xml:space="preserve">, their familiarity of the 3D platformer genre, if they are aware about the concept of Procedural Generation before hearing about this project, how much they enjoyed the level from a scale of 1 to 10, what they thought about the level and wanted to see improved about it, how manageable they found their ability </w:t>
+      </w:r>
+      <w:r>
+        <w:lastRenderedPageBreak/>
+        <w:t>to change the level’s rules from a scale of 1 to 10, how accurate they thought they thought the difficulty was based on the rules from a scale of 1 to 10, and what they appreciated about the UI</w:t>
+      </w:r>
+      <w:r>
+        <w:t xml:space="preserve"> and wanted to see improved.</w:t>
+      </w:r>
+    </w:p>
     <w:p/>
     <w:p>
       <w:r>
-        <w:t xml:space="preserve">Google Forms (Google, 2008) was selected for its flexibility with uploading JSON files and with its ability to send anonymous responses. </w:t>
-      </w:r>
-    </w:p>
-    <w:p>
-      <w:r>
-        <w:lastRenderedPageBreak/>
+        <w:rPr>
+          <w:noProof/>
+        </w:rPr>
         <w:drawing>
           <wp:inline distT="0" distB="0" distL="0" distR="0" wp14:anchorId="4CA90BC9" wp14:editId="553AC71D">
             <wp:extent cx="4979035" cy="6040120"/>
@@ -3042,7 +3213,7 @@
                     <pic:cNvPicPr/>
                   </pic:nvPicPr>
                   <pic:blipFill>
-                    <a:blip r:embed="rId27"/>
+                    <a:blip r:embed="rId28"/>
                     <a:stretch>
                       <a:fillRect/>
                     </a:stretch>
@@ -3081,15 +3252,300 @@
       <w:pPr>
         <w:pStyle w:val="Heading1"/>
         <w:jc w:val="center"/>
-      </w:pPr>
-    </w:p>
+        <w:rPr>
+          <w:b w:val="0"/>
+          <w:bCs w:val="0"/>
+          <w:sz w:val="24"/>
+          <w:szCs w:val="28"/>
+        </w:rPr>
+      </w:pPr>
+      <w:r>
+        <w:rPr>
+          <w:b w:val="0"/>
+          <w:bCs w:val="0"/>
+          <w:sz w:val="24"/>
+          <w:szCs w:val="28"/>
+        </w:rPr>
+        <w:t xml:space="preserve">Participants selected were people who had either familiarity of the 3D platformer genre or people who were familiar with the concept of procedural generation, or people who had familiarity of </w:t>
+      </w:r>
+      <w:r>
+        <w:rPr>
+          <w:b w:val="0"/>
+          <w:bCs w:val="0"/>
+          <w:sz w:val="24"/>
+          <w:szCs w:val="28"/>
+        </w:rPr>
+        <w:t>both</w:t>
+      </w:r>
+      <w:r>
+        <w:rPr>
+          <w:b w:val="0"/>
+          <w:bCs w:val="0"/>
+          <w:sz w:val="24"/>
+          <w:szCs w:val="28"/>
+        </w:rPr>
+        <w:t xml:space="preserve"> areas. In </w:t>
+      </w:r>
+      <w:r>
+        <w:lastRenderedPageBreak/>
+        <w:drawing>
+          <wp:anchor distT="0" distB="0" distL="114300" distR="114300" simplePos="0" relativeHeight="251658240" behindDoc="0" locked="0" layoutInCell="1" allowOverlap="1" wp14:anchorId="1736CA34" wp14:editId="11FB9ED9">
+            <wp:simplePos x="0" y="0"/>
+            <wp:positionH relativeFrom="column">
+              <wp:posOffset>-830580</wp:posOffset>
+            </wp:positionH>
+            <wp:positionV relativeFrom="paragraph">
+              <wp:posOffset>725805</wp:posOffset>
+            </wp:positionV>
+            <wp:extent cx="6772275" cy="8131666"/>
+            <wp:effectExtent l="0" t="0" r="0" b="3175"/>
+            <wp:wrapSquare wrapText="bothSides"/>
+            <wp:docPr id="1642969571" name="Picture 1"/>
+            <wp:cNvGraphicFramePr>
+              <a:graphicFrameLocks xmlns:a="http://schemas.openxmlformats.org/drawingml/2006/main" noChangeAspect="1"/>
+            </wp:cNvGraphicFramePr>
+            <a:graphic xmlns:a="http://schemas.openxmlformats.org/drawingml/2006/main">
+              <a:graphicData uri="http://schemas.openxmlformats.org/drawingml/2006/picture">
+                <pic:pic xmlns:pic="http://schemas.openxmlformats.org/drawingml/2006/picture">
+                  <pic:nvPicPr>
+                    <pic:cNvPr id="1642969571" name=""/>
+                    <pic:cNvPicPr/>
+                  </pic:nvPicPr>
+                  <pic:blipFill>
+                    <a:blip r:embed="rId29">
+                      <a:extLst>
+                        <a:ext uri="{28A0092B-C50C-407E-A947-70E740481C1C}">
+                          <a14:useLocalDpi xmlns:a14="http://schemas.microsoft.com/office/drawing/2010/main" val="0"/>
+                        </a:ext>
+                      </a:extLst>
+                    </a:blip>
+                    <a:stretch>
+                      <a:fillRect/>
+                    </a:stretch>
+                  </pic:blipFill>
+                  <pic:spPr>
+                    <a:xfrm>
+                      <a:off x="0" y="0"/>
+                      <a:ext cx="6772684" cy="8132157"/>
+                    </a:xfrm>
+                    <a:prstGeom prst="rect">
+                      <a:avLst/>
+                    </a:prstGeom>
+                  </pic:spPr>
+                </pic:pic>
+              </a:graphicData>
+            </a:graphic>
+            <wp14:sizeRelH relativeFrom="page">
+              <wp14:pctWidth>0</wp14:pctWidth>
+            </wp14:sizeRelH>
+            <wp14:sizeRelV relativeFrom="page">
+              <wp14:pctHeight>0</wp14:pctHeight>
+            </wp14:sizeRelV>
+          </wp:anchor>
+        </w:drawing>
+      </w:r>
+      <w:r>
+        <w:rPr>
+          <w:b w:val="0"/>
+          <w:bCs w:val="0"/>
+          <w:sz w:val="24"/>
+          <w:szCs w:val="28"/>
+        </w:rPr>
+        <w:t>total, there was 18 responses for the testing.</w:t>
+      </w:r>
+      <w:r>
+        <w:rPr>
+          <w:b w:val="0"/>
+          <w:bCs w:val="0"/>
+          <w:sz w:val="24"/>
+          <w:szCs w:val="28"/>
+        </w:rPr>
+        <w:t xml:space="preserve"> What they chose for the level’s attributes, the level layout they played, and how they performed during the level was recorded.</w:t>
+      </w:r>
+    </w:p>
+    <w:p>
+      <w:r>
+        <w:lastRenderedPageBreak/>
+        <w:drawing>
+          <wp:anchor distT="0" distB="0" distL="114300" distR="114300" simplePos="0" relativeHeight="251659264" behindDoc="0" locked="0" layoutInCell="1" allowOverlap="1" wp14:anchorId="6B0262BB" wp14:editId="7CB20EB8">
+            <wp:simplePos x="0" y="0"/>
+            <wp:positionH relativeFrom="column">
+              <wp:posOffset>-1087755</wp:posOffset>
+            </wp:positionH>
+            <wp:positionV relativeFrom="paragraph">
+              <wp:posOffset>0</wp:posOffset>
+            </wp:positionV>
+            <wp:extent cx="6981825" cy="6485255"/>
+            <wp:effectExtent l="0" t="0" r="9525" b="0"/>
+            <wp:wrapSquare wrapText="bothSides"/>
+            <wp:docPr id="878124697" name="Picture 1"/>
+            <wp:cNvGraphicFramePr>
+              <a:graphicFrameLocks xmlns:a="http://schemas.openxmlformats.org/drawingml/2006/main" noChangeAspect="1"/>
+            </wp:cNvGraphicFramePr>
+            <a:graphic xmlns:a="http://schemas.openxmlformats.org/drawingml/2006/main">
+              <a:graphicData uri="http://schemas.openxmlformats.org/drawingml/2006/picture">
+                <pic:pic xmlns:pic="http://schemas.openxmlformats.org/drawingml/2006/picture">
+                  <pic:nvPicPr>
+                    <pic:cNvPr id="878124697" name=""/>
+                    <pic:cNvPicPr/>
+                  </pic:nvPicPr>
+                  <pic:blipFill>
+                    <a:blip r:embed="rId30">
+                      <a:extLst>
+                        <a:ext uri="{28A0092B-C50C-407E-A947-70E740481C1C}">
+                          <a14:useLocalDpi xmlns:a14="http://schemas.microsoft.com/office/drawing/2010/main" val="0"/>
+                        </a:ext>
+                      </a:extLst>
+                    </a:blip>
+                    <a:stretch>
+                      <a:fillRect/>
+                    </a:stretch>
+                  </pic:blipFill>
+                  <pic:spPr>
+                    <a:xfrm>
+                      <a:off x="0" y="0"/>
+                      <a:ext cx="6981825" cy="6485255"/>
+                    </a:xfrm>
+                    <a:prstGeom prst="rect">
+                      <a:avLst/>
+                    </a:prstGeom>
+                  </pic:spPr>
+                </pic:pic>
+              </a:graphicData>
+            </a:graphic>
+            <wp14:sizeRelH relativeFrom="page">
+              <wp14:pctWidth>0</wp14:pctWidth>
+            </wp14:sizeRelH>
+            <wp14:sizeRelV relativeFrom="page">
+              <wp14:pctHeight>0</wp14:pctHeight>
+            </wp14:sizeRelV>
+          </wp:anchor>
+        </w:drawing>
+      </w:r>
+    </w:p>
+    <w:p/>
+    <w:p/>
+    <w:p/>
     <w:p>
       <w:pPr>
         <w:pStyle w:val="Heading1"/>
         <w:jc w:val="center"/>
       </w:pPr>
-      <w:r>
-        <w:br w:type="page"/>
+      <w:bookmarkStart w:id="29" w:name="_Toc92987356"/>
+      <w:r>
+        <w:lastRenderedPageBreak/>
+        <w:drawing>
+          <wp:anchor distT="0" distB="0" distL="114300" distR="114300" simplePos="0" relativeHeight="251661312" behindDoc="0" locked="0" layoutInCell="1" allowOverlap="1" wp14:anchorId="4DE8B8A1" wp14:editId="7ADE048C">
+            <wp:simplePos x="0" y="0"/>
+            <wp:positionH relativeFrom="margin">
+              <wp:posOffset>-1198880</wp:posOffset>
+            </wp:positionH>
+            <wp:positionV relativeFrom="paragraph">
+              <wp:posOffset>4571365</wp:posOffset>
+            </wp:positionV>
+            <wp:extent cx="7082155" cy="4110990"/>
+            <wp:effectExtent l="0" t="0" r="4445" b="3810"/>
+            <wp:wrapSquare wrapText="bothSides"/>
+            <wp:docPr id="216449415" name="Picture 1"/>
+            <wp:cNvGraphicFramePr>
+              <a:graphicFrameLocks xmlns:a="http://schemas.openxmlformats.org/drawingml/2006/main" noChangeAspect="1"/>
+            </wp:cNvGraphicFramePr>
+            <a:graphic xmlns:a="http://schemas.openxmlformats.org/drawingml/2006/main">
+              <a:graphicData uri="http://schemas.openxmlformats.org/drawingml/2006/picture">
+                <pic:pic xmlns:pic="http://schemas.openxmlformats.org/drawingml/2006/picture">
+                  <pic:nvPicPr>
+                    <pic:cNvPr id="216449415" name=""/>
+                    <pic:cNvPicPr/>
+                  </pic:nvPicPr>
+                  <pic:blipFill>
+                    <a:blip r:embed="rId31">
+                      <a:extLst>
+                        <a:ext uri="{28A0092B-C50C-407E-A947-70E740481C1C}">
+                          <a14:useLocalDpi xmlns:a14="http://schemas.microsoft.com/office/drawing/2010/main" val="0"/>
+                        </a:ext>
+                      </a:extLst>
+                    </a:blip>
+                    <a:stretch>
+                      <a:fillRect/>
+                    </a:stretch>
+                  </pic:blipFill>
+                  <pic:spPr>
+                    <a:xfrm>
+                      <a:off x="0" y="0"/>
+                      <a:ext cx="7082155" cy="4110990"/>
+                    </a:xfrm>
+                    <a:prstGeom prst="rect">
+                      <a:avLst/>
+                    </a:prstGeom>
+                  </pic:spPr>
+                </pic:pic>
+              </a:graphicData>
+            </a:graphic>
+            <wp14:sizeRelH relativeFrom="page">
+              <wp14:pctWidth>0</wp14:pctWidth>
+            </wp14:sizeRelH>
+            <wp14:sizeRelV relativeFrom="page">
+              <wp14:pctHeight>0</wp14:pctHeight>
+            </wp14:sizeRelV>
+          </wp:anchor>
+        </w:drawing>
+      </w:r>
+      <w:r>
+        <w:drawing>
+          <wp:anchor distT="0" distB="0" distL="114300" distR="114300" simplePos="0" relativeHeight="251660288" behindDoc="0" locked="0" layoutInCell="1" allowOverlap="1" wp14:anchorId="67E1FDB5" wp14:editId="137F6E08">
+            <wp:simplePos x="0" y="0"/>
+            <wp:positionH relativeFrom="margin">
+              <wp:posOffset>-1421130</wp:posOffset>
+            </wp:positionH>
+            <wp:positionV relativeFrom="paragraph">
+              <wp:posOffset>0</wp:posOffset>
+            </wp:positionV>
+            <wp:extent cx="7437755" cy="4419600"/>
+            <wp:effectExtent l="0" t="0" r="0" b="0"/>
+            <wp:wrapSquare wrapText="bothSides"/>
+            <wp:docPr id="1651715452" name="Picture 1"/>
+            <wp:cNvGraphicFramePr>
+              <a:graphicFrameLocks xmlns:a="http://schemas.openxmlformats.org/drawingml/2006/main" noChangeAspect="1"/>
+            </wp:cNvGraphicFramePr>
+            <a:graphic xmlns:a="http://schemas.openxmlformats.org/drawingml/2006/main">
+              <a:graphicData uri="http://schemas.openxmlformats.org/drawingml/2006/picture">
+                <pic:pic xmlns:pic="http://schemas.openxmlformats.org/drawingml/2006/picture">
+                  <pic:nvPicPr>
+                    <pic:cNvPr id="1651715452" name=""/>
+                    <pic:cNvPicPr/>
+                  </pic:nvPicPr>
+                  <pic:blipFill>
+                    <a:blip r:embed="rId32">
+                      <a:extLst>
+                        <a:ext uri="{28A0092B-C50C-407E-A947-70E740481C1C}">
+                          <a14:useLocalDpi xmlns:a14="http://schemas.microsoft.com/office/drawing/2010/main" val="0"/>
+                        </a:ext>
+                      </a:extLst>
+                    </a:blip>
+                    <a:stretch>
+                      <a:fillRect/>
+                    </a:stretch>
+                  </pic:blipFill>
+                  <pic:spPr>
+                    <a:xfrm>
+                      <a:off x="0" y="0"/>
+                      <a:ext cx="7437755" cy="4419600"/>
+                    </a:xfrm>
+                    <a:prstGeom prst="rect">
+                      <a:avLst/>
+                    </a:prstGeom>
+                  </pic:spPr>
+                </pic:pic>
+              </a:graphicData>
+            </a:graphic>
+            <wp14:sizeRelH relativeFrom="page">
+              <wp14:pctWidth>0</wp14:pctWidth>
+            </wp14:sizeRelH>
+            <wp14:sizeRelV relativeFrom="page">
+              <wp14:pctHeight>0</wp14:pctHeight>
+            </wp14:sizeRelV>
+          </wp:anchor>
+        </w:drawing>
       </w:r>
     </w:p>
     <w:p>
@@ -3097,9 +3553,25 @@
         <w:pStyle w:val="Heading1"/>
         <w:jc w:val="center"/>
       </w:pPr>
-      <w:bookmarkStart w:id="29" w:name="_Toc92987356"/>
-      <w:r>
-        <w:lastRenderedPageBreak/>
+    </w:p>
+    <w:p>
+      <w:pPr>
+        <w:pStyle w:val="Heading1"/>
+        <w:jc w:val="center"/>
+      </w:pPr>
+    </w:p>
+    <w:p>
+      <w:pPr>
+        <w:pStyle w:val="Heading1"/>
+        <w:jc w:val="center"/>
+      </w:pPr>
+    </w:p>
+    <w:p>
+      <w:pPr>
+        <w:pStyle w:val="Heading1"/>
+        <w:jc w:val="center"/>
+      </w:pPr>
+      <w:r>
         <w:t>Chapter 5</w:t>
       </w:r>
       <w:r>
@@ -3322,7 +3794,7 @@
         </w:rPr>
         <w:t xml:space="preserve">, pp. 199–205. Available at: </w:t>
       </w:r>
-      <w:hyperlink r:id="rId28" w:history="1">
+      <w:hyperlink r:id="rId33" w:history="1">
         <w:r>
           <w:rPr>
             <w:rStyle w:val="Hyperlink"/>
@@ -3611,7 +4083,7 @@
         </w:rPr>
         <w:t xml:space="preserve">, 2(1), pp. 109-111. Available at: </w:t>
       </w:r>
-      <w:hyperlink r:id="rId29" w:history="1">
+      <w:hyperlink r:id="rId34" w:history="1">
         <w:r>
           <w:rPr>
             <w:rStyle w:val="Hyperlink"/>
@@ -4264,7 +4736,7 @@
         </w:rPr>
         <w:t xml:space="preserve">, pp. 1–8. Available at: </w:t>
       </w:r>
-      <w:hyperlink r:id="rId30" w:history="1">
+      <w:hyperlink r:id="rId35" w:history="1">
         <w:r>
           <w:rPr>
             <w:rStyle w:val="Hyperlink"/>
@@ -4374,7 +4846,7 @@
         </w:rPr>
         <w:t xml:space="preserve"> 13(11), article 304. Available at: </w:t>
       </w:r>
-      <w:hyperlink r:id="rId31" w:history="1">
+      <w:hyperlink r:id="rId36" w:history="1">
         <w:r>
           <w:rPr>
             <w:rStyle w:val="Hyperlink"/>
@@ -4618,7 +5090,7 @@
         </w:rPr>
         <w:t xml:space="preserve">, pp. 141–146. Available at: </w:t>
       </w:r>
-      <w:hyperlink r:id="rId32" w:history="1">
+      <w:hyperlink r:id="rId37" w:history="1">
         <w:r>
           <w:rPr>
             <w:rStyle w:val="Hyperlink"/>
@@ -4788,7 +5260,7 @@
         </w:rPr>
         <w:t xml:space="preserve">, pp. 75–80. Available at: </w:t>
       </w:r>
-      <w:hyperlink r:id="rId33" w:history="1">
+      <w:hyperlink r:id="rId38" w:history="1">
         <w:r>
           <w:rPr>
             <w:rStyle w:val="Hyperlink"/>
@@ -4892,7 +5364,7 @@
         </w:rPr>
         <w:t xml:space="preserve">, pp. 175–182. Available at: </w:t>
       </w:r>
-      <w:hyperlink r:id="rId34" w:history="1">
+      <w:hyperlink r:id="rId39" w:history="1">
         <w:r>
           <w:rPr>
             <w:rStyle w:val="Hyperlink"/>
@@ -4991,8 +5463,8 @@
     </w:p>
     <w:p/>
     <w:sectPr>
-      <w:headerReference w:type="default" r:id="rId35"/>
-      <w:footerReference w:type="default" r:id="rId36"/>
+      <w:headerReference w:type="default" r:id="rId40"/>
+      <w:footerReference w:type="default" r:id="rId41"/>
       <w:pgSz w:w="11906" w:h="16838"/>
       <w:pgMar w:top="1440" w:right="1797" w:bottom="1440" w:left="2268" w:header="720" w:footer="720" w:gutter="0"/>
       <w:pgNumType w:start="1"/>
@@ -6368,7 +6840,6 @@
   <w:style w:type="character" w:default="1" w:styleId="DefaultParagraphFont">
     <w:name w:val="Default Paragraph Font"/>
     <w:uiPriority w:val="1"/>
-    <w:semiHidden/>
     <w:unhideWhenUsed/>
   </w:style>
   <w:style w:type="table" w:default="1" w:styleId="TableNormal">
@@ -6902,6 +7373,10 @@
 </file>
 
 <file path=customXml/item1.xml><?xml version="1.0" encoding="utf-8"?>
+<b:Sources xmlns:b="http://schemas.openxmlformats.org/officeDocument/2006/bibliography" xmlns="http://schemas.openxmlformats.org/officeDocument/2006/bibliography" SelectedStyle="\APA.XSL" StyleName="APA"/>
+</file>
+
+<file path=customXml/item2.xml><?xml version="1.0" encoding="utf-8"?>
 <ct:contentTypeSchema xmlns:ct="http://schemas.microsoft.com/office/2006/metadata/contentType" xmlns:ma="http://schemas.microsoft.com/office/2006/metadata/properties/metaAttributes" ct:_="" ma:_="" ma:contentTypeName="Document" ma:contentTypeID="0x01010033553FA8616F3A45AD369E275EA42271" ma:contentTypeVersion="11" ma:contentTypeDescription="Create a new document." ma:contentTypeScope="" ma:versionID="8eb4e0804d077bcc139b361cda3a640c">
   <xsd:schema xmlns:xsd="http://www.w3.org/2001/XMLSchema" xmlns:xs="http://www.w3.org/2001/XMLSchema" xmlns:p="http://schemas.microsoft.com/office/2006/metadata/properties" xmlns:ns3="371a10d4-9e19-41a9-948b-d1cca29b4cb6" xmlns:ns4="18dffc30-a361-43f0-bb4a-1f62e819a6f2" targetNamespace="http://schemas.microsoft.com/office/2006/metadata/properties" ma:root="true" ma:fieldsID="ac8e08ff64368403dfb4d2274f8d7465" ns3:_="" ns4:_="">
     <xsd:import namespace="371a10d4-9e19-41a9-948b-d1cca29b4cb6"/>
@@ -7110,17 +7585,7 @@
 </ct:contentTypeSchema>
 </file>
 
-<file path=customXml/item2.xml><?xml version="1.0" encoding="utf-8"?>
-<b:Sources xmlns:b="http://schemas.openxmlformats.org/officeDocument/2006/bibliography" xmlns="http://schemas.openxmlformats.org/officeDocument/2006/bibliography" SelectedStyle="\APA.XSL" StyleName="APA"/>
-</file>
-
 <file path=customXml/item3.xml><?xml version="1.0" encoding="utf-8"?>
-<p:properties xmlns:p="http://schemas.microsoft.com/office/2006/metadata/properties" xmlns:xsi="http://www.w3.org/2001/XMLSchema-instance" xmlns:pc="http://schemas.microsoft.com/office/infopath/2007/PartnerControls">
-  <documentManagement/>
-</p:properties>
-</file>
-
-<file path=customXml/item4.xml><?xml version="1.0" encoding="utf-8"?>
 <?mso-contentType ?>
 <FormTemplates xmlns="http://schemas.microsoft.com/sharepoint/v3/contenttype/forms">
   <Display>DocumentLibraryForm</Display>
@@ -7129,7 +7594,21 @@
 </FormTemplates>
 </file>
 
+<file path=customXml/item4.xml><?xml version="1.0" encoding="utf-8"?>
+<p:properties xmlns:p="http://schemas.microsoft.com/office/2006/metadata/properties" xmlns:xsi="http://www.w3.org/2001/XMLSchema-instance" xmlns:pc="http://schemas.microsoft.com/office/infopath/2007/PartnerControls">
+  <documentManagement/>
+</p:properties>
+</file>
+
 <file path=customXml/itemProps1.xml><?xml version="1.0" encoding="utf-8"?>
+<ds:datastoreItem xmlns:ds="http://schemas.openxmlformats.org/officeDocument/2006/customXml" ds:itemID="{79CEDF70-F74C-4284-98FC-38644A27E791}">
+  <ds:schemaRefs>
+    <ds:schemaRef ds:uri="http://schemas.openxmlformats.org/officeDocument/2006/bibliography"/>
+  </ds:schemaRefs>
+</ds:datastoreItem>
+</file>
+
+<file path=customXml/itemProps2.xml><?xml version="1.0" encoding="utf-8"?>
 <ds:datastoreItem xmlns:ds="http://schemas.openxmlformats.org/officeDocument/2006/customXml" ds:itemID="{307A6BE8-0D48-4A7D-A535-369CCDFBF2CB}">
   <ds:schemaRefs>
     <ds:schemaRef ds:uri="http://schemas.microsoft.com/office/2006/metadata/contentType"/>
@@ -7148,27 +7627,19 @@
 </ds:datastoreItem>
 </file>
 
-<file path=customXml/itemProps2.xml><?xml version="1.0" encoding="utf-8"?>
-<ds:datastoreItem xmlns:ds="http://schemas.openxmlformats.org/officeDocument/2006/customXml" ds:itemID="{79CEDF70-F74C-4284-98FC-38644A27E791}">
+<file path=customXml/itemProps3.xml><?xml version="1.0" encoding="utf-8"?>
+<ds:datastoreItem xmlns:ds="http://schemas.openxmlformats.org/officeDocument/2006/customXml" ds:itemID="{05D9BF79-26A9-4E9A-9793-4E28B04A02DC}">
   <ds:schemaRefs>
-    <ds:schemaRef ds:uri="http://schemas.openxmlformats.org/officeDocument/2006/bibliography"/>
+    <ds:schemaRef ds:uri="http://schemas.microsoft.com/sharepoint/v3/contenttype/forms"/>
   </ds:schemaRefs>
 </ds:datastoreItem>
 </file>
 
-<file path=customXml/itemProps3.xml><?xml version="1.0" encoding="utf-8"?>
+<file path=customXml/itemProps4.xml><?xml version="1.0" encoding="utf-8"?>
 <ds:datastoreItem xmlns:ds="http://schemas.openxmlformats.org/officeDocument/2006/customXml" ds:itemID="{10A8F88B-6E38-47A8-8074-155E10D59BDF}">
   <ds:schemaRefs>
     <ds:schemaRef ds:uri="http://schemas.microsoft.com/office/2006/metadata/properties"/>
     <ds:schemaRef ds:uri="http://schemas.microsoft.com/office/infopath/2007/PartnerControls"/>
   </ds:schemaRefs>
 </ds:datastoreItem>
-</file>
-
-<file path=customXml/itemProps4.xml><?xml version="1.0" encoding="utf-8"?>
-<ds:datastoreItem xmlns:ds="http://schemas.openxmlformats.org/officeDocument/2006/customXml" ds:itemID="{05D9BF79-26A9-4E9A-9793-4E28B04A02DC}">
-  <ds:schemaRefs>
-    <ds:schemaRef ds:uri="http://schemas.microsoft.com/sharepoint/v3/contenttype/forms"/>
-  </ds:schemaRefs>
-</ds:datastoreItem>
 </file>
</xml_diff>